<commit_message>
Final brand red #990000, new hero photo, About text, no opening animation
</commit_message>
<xml_diff>
--- a/docs/Rakt-Response-Code-Guide.docx
+++ b/docs/Rakt-Response-Code-Guide.docx
@@ -68,7 +68,7 @@
           <w:sz w:val="22"/>
           <w:szCs w:val="22"/>
         </w:rPr>
-        <w:t xml:space="preserve"> 16 October 2026. Matches the code after the 2026 redesign and the donation-editing update (branch </w:t>
+        <w:t xml:space="preserve"> 17 October 2026. Matches the live site (</w:t>
       </w:r>
       <w:r>
         <w:rPr>
@@ -78,7 +78,7 @@
           <w:szCs w:val="20"/>
           <w:shd w:val="clear" w:color="auto" w:fill="F3EFEB"/>
         </w:rPr>
-        <w:t xml:space="preserve">donation-edits</w:t>
+        <w:t xml:space="preserve">main</w:t>
       </w:r>
       <w:r>
         <w:rPr>
@@ -86,7 +86,7 @@
           <w:sz w:val="22"/>
           <w:szCs w:val="22"/>
         </w:rPr>
-        <w:t xml:space="preserve">).</w:t>
+        <w:t xml:space="preserve">): the 2026 redesign, donation editing, the lighter homepage and the footer clean-up.</w:t>
       </w:r>
     </w:p>
     <w:p>
@@ -13537,7 +13537,7 @@
                 <w:sz w:val="19"/>
                 <w:szCs w:val="19"/>
               </w:rPr>
-              <w:t xml:space="preserve">Same on every public page.</w:t>
+              <w:t xml:space="preserve">Same on every public page. Light pills, so the red logo always shows.</w:t>
             </w:r>
           </w:p>
         </w:tc>
@@ -13559,7 +13559,7 @@
                 <w:sz w:val="19"/>
                 <w:szCs w:val="19"/>
               </w:rPr>
-              <w:t xml:space="preserve">Hero: full photo, “Every donor matters…”, two buttons, data cards, four steps</w:t>
+              <w:t xml:space="preserve">Hero: photo melting into the red, “Every donor matters…”, two buttons, four steps</w:t>
             </w:r>
           </w:p>
         </w:tc>
@@ -13586,7 +13586,7 @@
                 <w:sz w:val="19"/>
                 <w:szCs w:val="19"/>
               </w:rPr>
-              <w:t xml:space="preserve">; the shading over the photo is </w:t>
+              <w:t xml:space="preserve">; the fade over the photo is </w:t>
             </w:r>
             <w:r>
               <w:rPr>
@@ -13603,6 +13603,40 @@
                 <w:sz w:val="19"/>
                 <w:szCs w:val="19"/>
               </w:rPr>
+              <w:t xml:space="preserve"> and the laptop headline sizes are </w:t>
+            </w:r>
+            <w:r>
+              <w:rPr>
+                <w:rFonts w:ascii="Consolas" w:hAnsi="Consolas" w:cs="Consolas"/>
+                <w:color w:val="5A0909"/>
+                <w:sz w:val="17"/>
+                <w:szCs w:val="17"/>
+                <w:shd w:val="clear" w:color="auto" w:fill="F3EFEB"/>
+              </w:rPr>
+              <w:t xml:space="preserve">.hero-xl</w:t>
+            </w:r>
+            <w:r>
+              <w:rPr>
+                <w:sz w:val="19"/>
+                <w:szCs w:val="19"/>
+              </w:rPr>
+              <w:t xml:space="preserve"> / </w:t>
+            </w:r>
+            <w:r>
+              <w:rPr>
+                <w:rFonts w:ascii="Consolas" w:hAnsi="Consolas" w:cs="Consolas"/>
+                <w:color w:val="5A0909"/>
+                <w:sz w:val="17"/>
+                <w:szCs w:val="17"/>
+                <w:shd w:val="clear" w:color="auto" w:fill="F3EFEB"/>
+              </w:rPr>
+              <w:t xml:space="preserve">.hero-lg</w:t>
+            </w:r>
+            <w:r>
+              <w:rPr>
+                <w:sz w:val="19"/>
+                <w:szCs w:val="19"/>
+              </w:rPr>
               <w:t xml:space="preserve"> in </w:t>
             </w:r>
             <w:r>
@@ -13674,14 +13708,14 @@
                 <w:szCs w:val="17"/>
                 <w:shd w:val="clear" w:color="auto" w:fill="F3EFEB"/>
               </w:rPr>
-              <w:t xml:space="preserve">hero-donor-arm.jpg</w:t>
-            </w:r>
-            <w:r>
-              <w:rPr>
-                <w:sz w:val="19"/>
-                <w:szCs w:val="19"/>
-              </w:rPr>
-              <w:t xml:space="preserve">).</w:t>
+              <w:t xml:space="preserve">hero-donor-nurse.jpg</w:t>
+            </w:r>
+            <w:r>
+              <w:rPr>
+                <w:sz w:val="19"/>
+                <w:szCs w:val="19"/>
+              </w:rPr>
+              <w:t xml:space="preserve">). Laptops: photo on the right, words on the red at the left, all on one screen. Phones: photo on top, words below.</w:t>
             </w:r>
           </w:p>
         </w:tc>
@@ -15027,23 +15061,6 @@
                 <w:szCs w:val="17"/>
                 <w:shd w:val="clear" w:color="auto" w:fill="F3EFEB"/>
               </w:rPr>
-              <w:t xml:space="preserve">DataCard</w:t>
-            </w:r>
-            <w:r>
-              <w:rPr>
-                <w:sz w:val="19"/>
-                <w:szCs w:val="19"/>
-              </w:rPr>
-              <w:t xml:space="preserve">, </w:t>
-            </w:r>
-            <w:r>
-              <w:rPr>
-                <w:rFonts w:ascii="Consolas" w:hAnsi="Consolas" w:cs="Consolas"/>
-                <w:color w:val="5A0909"/>
-                <w:sz w:val="17"/>
-                <w:szCs w:val="17"/>
-                <w:shd w:val="clear" w:color="auto" w:fill="F3EFEB"/>
-              </w:rPr>
               <w:t xml:space="preserve">RangeBar</w:t>
             </w:r>
             <w:r>
@@ -15085,7 +15102,7 @@
                 <w:sz w:val="19"/>
                 <w:szCs w:val="19"/>
               </w:rPr>
-              <w:t xml:space="preserve">The “(01) LABEL” section numbers, two-tone headlines and data cards.</w:t>
+              <w:t xml:space="preserve">The “(01) LABEL” section numbers, two-tone headlines and range bars.</w:t>
             </w:r>
           </w:p>
         </w:tc>
@@ -23893,7 +23910,7 @@
         <w:t xml:space="preserve">border-border</w:t>
       </w:r>
       <w:r>
-        <w:t xml:space="preserve">. To make every dark area lighter or darker, change </w:t>
+        <w:t xml:space="preserve">. To change the colour of the red sections, change </w:t>
       </w:r>
       <w:r>
         <w:rPr>
@@ -23906,7 +23923,7 @@
         <w:t xml:space="preserve">--night</w:t>
       </w:r>
       <w:r>
-        <w:t xml:space="preserve">, </w:t>
+        <w:t xml:space="preserve"> and </w:t>
       </w:r>
       <w:r>
         <w:rPr>
@@ -23919,19 +23936,6 @@
         <w:t xml:space="preserve">--night-2</w:t>
       </w:r>
       <w:r>
-        <w:t xml:space="preserve"> and </w:t>
-      </w:r>
-      <w:r>
-        <w:rPr>
-          <w:rFonts w:ascii="Consolas" w:hAnsi="Consolas" w:cs="Consolas"/>
-          <w:color w:val="5A0909"/>
-          <w:sz w:val="19"/>
-          <w:szCs w:val="19"/>
-          <w:shd w:val="clear" w:color="auto" w:fill="F3EFEB"/>
-        </w:rPr>
-        <w:t xml:space="preserve">--navy</w:t>
-      </w:r>
-      <w:r>
         <w:t xml:space="preserve"> there, and the same colour in </w:t>
       </w:r>
       <w:r>
@@ -23945,7 +23949,7 @@
         <w:t xml:space="preserve">src/app/layout.tsx</w:t>
       </w:r>
       <w:r>
-        <w:t xml:space="preserve"> (themeColor), </w:t>
+        <w:t xml:space="preserve"> (themeColor) and </w:t>
       </w:r>
       <w:r>
         <w:rPr>
@@ -23958,7 +23962,7 @@
         <w:t xml:space="preserve">src/app/manifest.ts</w:t>
       </w:r>
       <w:r>
-        <w:t xml:space="preserve"> and </w:t>
+        <w:t xml:space="preserve"> (theme_color). The app icons sit on cream, so they stay as they are. A short block at the end of </w:t>
       </w:r>
       <w:r>
         <w:rPr>
@@ -23968,23 +23972,10 @@
           <w:szCs w:val="19"/>
           <w:shd w:val="clear" w:color="auto" w:fill="F3EFEB"/>
         </w:rPr>
-        <w:t xml:space="preserve">scripts/generate-icons.mjs</w:t>
-      </w:r>
-      <w:r>
-        <w:t xml:space="preserve"> (then run </w:t>
-      </w:r>
-      <w:r>
-        <w:rPr>
-          <w:rFonts w:ascii="Consolas" w:hAnsi="Consolas" w:cs="Consolas"/>
-          <w:color w:val="5A0909"/>
-          <w:sz w:val="19"/>
-          <w:szCs w:val="19"/>
-          <w:shd w:val="clear" w:color="auto" w:fill="F3EFEB"/>
-        </w:rPr>
-        <w:t xml:space="preserve">npm run icons</w:t>
-      </w:r>
-      <w:r>
-        <w:t xml:space="preserve">).</w:t>
+        <w:t xml:space="preserve">globals.css</w:t>
+      </w:r>
+      <w:r>
+        <w:t xml:space="preserve"> makes faint text lighter and turns red buttons cream on the red sections, so nothing melts into the red.</w:t>
       </w:r>
     </w:p>
     <w:tbl>
@@ -24112,7 +24103,7 @@
                 <w:sz w:val="19"/>
                 <w:szCs w:val="19"/>
               </w:rPr>
-              <w:t xml:space="preserve">#2B1217</w:t>
+              <w:t xml:space="preserve">#990000</w:t>
             </w:r>
           </w:p>
         </w:tc>
@@ -24129,7 +24120,7 @@
                 <w:sz w:val="19"/>
                 <w:szCs w:val="19"/>
               </w:rPr>
-              <w:t xml:space="preserve">Dark sections, footer, menus, header pills (a deep maroon)</w:t>
+              <w:t xml:space="preserve">The brand red: colour sections, footer, sign-in band, phone bottom bar</w:t>
             </w:r>
           </w:p>
         </w:tc>
@@ -24323,7 +24314,7 @@
                 <w:sz w:val="19"/>
                 <w:szCs w:val="19"/>
               </w:rPr>
-              <w:t xml:space="preserve">#2B1217</w:t>
+              <w:t xml:space="preserve">#1D0B0E</w:t>
             </w:r>
           </w:p>
         </w:tc>
@@ -24340,7 +24331,7 @@
                 <w:sz w:val="19"/>
                 <w:szCs w:val="19"/>
               </w:rPr>
-              <w:t xml:space="preserve">Headings and dark surfaces such as the phone bottom bar. The name stayed “navy” from the old design; it holds the same deep maroon.</w:t>
+              <w:t xml:space="preserve">Near-black ink: headings, text and small dark cards. The name stayed “navy” from the old design.</w:t>
             </w:r>
           </w:p>
         </w:tc>
@@ -25238,6 +25229,82 @@
                 <w:szCs w:val="17"/>
                 <w:shd w:val="clear" w:color="auto" w:fill="F3EFEB"/>
               </w:rPr>
+              <w:t xml:space="preserve">hero-shade</w:t>
+            </w:r>
+            <w:r>
+              <w:rPr>
+                <w:sz w:val="19"/>
+                <w:szCs w:val="19"/>
+              </w:rPr>
+              <w:t xml:space="preserve">, </w:t>
+            </w:r>
+            <w:r>
+              <w:rPr>
+                <w:rFonts w:ascii="Consolas" w:hAnsi="Consolas" w:cs="Consolas"/>
+                <w:color w:val="5A0909"/>
+                <w:sz w:val="17"/>
+                <w:szCs w:val="17"/>
+                <w:shd w:val="clear" w:color="auto" w:fill="F3EFEB"/>
+              </w:rPr>
+              <w:t xml:space="preserve">hero-xl</w:t>
+            </w:r>
+            <w:r>
+              <w:rPr>
+                <w:sz w:val="19"/>
+                <w:szCs w:val="19"/>
+              </w:rPr>
+              <w:t xml:space="preserve">, </w:t>
+            </w:r>
+            <w:r>
+              <w:rPr>
+                <w:rFonts w:ascii="Consolas" w:hAnsi="Consolas" w:cs="Consolas"/>
+                <w:color w:val="5A0909"/>
+                <w:sz w:val="17"/>
+                <w:szCs w:val="17"/>
+                <w:shd w:val="clear" w:color="auto" w:fill="F3EFEB"/>
+              </w:rPr>
+              <w:t xml:space="preserve">hero-lg</w:t>
+            </w:r>
+          </w:p>
+        </w:tc>
+        <w:tc>
+          <w:tcPr>
+            <w:tcW w:w="4626" w:type="dxa"/>
+          </w:tcPr>
+          <w:p>
+            <w:pPr>
+              <w:spacing w:before="0" w:after="40" w:line="252" w:lineRule="auto"/>
+            </w:pPr>
+            <w:r>
+              <w:rPr>
+                <w:sz w:val="19"/>
+                <w:szCs w:val="19"/>
+              </w:rPr>
+              <w:t xml:space="preserve">The homepage photo’s fade into the red, and headline sizes that also shrink on short laptop screens.</w:t>
+            </w:r>
+          </w:p>
+        </w:tc>
+      </w:tr>
+      <w:tr>
+        <w:trPr>
+          <w:cantSplit/>
+        </w:trPr>
+        <w:tc>
+          <w:tcPr>
+            <w:tcW w:w="5012" w:type="dxa"/>
+          </w:tcPr>
+          <w:p>
+            <w:pPr>
+              <w:spacing w:before="0" w:after="40" w:line="252" w:lineRule="auto"/>
+            </w:pPr>
+            <w:r>
+              <w:rPr>
+                <w:rFonts w:ascii="Consolas" w:hAnsi="Consolas" w:cs="Consolas"/>
+                <w:color w:val="5A0909"/>
+                <w:sz w:val="17"/>
+                <w:szCs w:val="17"/>
+                <w:shd w:val="clear" w:color="auto" w:fill="F3EFEB"/>
+              </w:rPr>
               <w:t xml:space="preserve">reveal</w:t>
             </w:r>
             <w:r>
@@ -25255,7 +25322,7 @@
                 <w:szCs w:val="17"/>
                 <w:shd w:val="clear" w:color="auto" w:fill="F3EFEB"/>
               </w:rPr>
-              <w:t xml:space="preserve">animate-settle</w:t>
+              <w:t xml:space="preserve">animate-orbit</w:t>
             </w:r>
             <w:r>
               <w:rPr>
@@ -25272,57 +25339,6 @@
                 <w:szCs w:val="17"/>
                 <w:shd w:val="clear" w:color="auto" w:fill="F3EFEB"/>
               </w:rPr>
-              <w:t xml:space="preserve">animate-lift</w:t>
-            </w:r>
-            <w:r>
-              <w:rPr>
-                <w:sz w:val="19"/>
-                <w:szCs w:val="19"/>
-              </w:rPr>
-              <w:t xml:space="preserve">, </w:t>
-            </w:r>
-            <w:r>
-              <w:rPr>
-                <w:rFonts w:ascii="Consolas" w:hAnsi="Consolas" w:cs="Consolas"/>
-                <w:color w:val="5A0909"/>
-                <w:sz w:val="17"/>
-                <w:szCs w:val="17"/>
-                <w:shd w:val="clear" w:color="auto" w:fill="F3EFEB"/>
-              </w:rPr>
-              <w:t xml:space="preserve">animate-float</w:t>
-            </w:r>
-            <w:r>
-              <w:rPr>
-                <w:sz w:val="19"/>
-                <w:szCs w:val="19"/>
-              </w:rPr>
-              <w:t xml:space="preserve">, </w:t>
-            </w:r>
-            <w:r>
-              <w:rPr>
-                <w:rFonts w:ascii="Consolas" w:hAnsi="Consolas" w:cs="Consolas"/>
-                <w:color w:val="5A0909"/>
-                <w:sz w:val="17"/>
-                <w:szCs w:val="17"/>
-                <w:shd w:val="clear" w:color="auto" w:fill="F3EFEB"/>
-              </w:rPr>
-              <w:t xml:space="preserve">animate-orbit</w:t>
-            </w:r>
-            <w:r>
-              <w:rPr>
-                <w:sz w:val="19"/>
-                <w:szCs w:val="19"/>
-              </w:rPr>
-              <w:t xml:space="preserve">, </w:t>
-            </w:r>
-            <w:r>
-              <w:rPr>
-                <w:rFonts w:ascii="Consolas" w:hAnsi="Consolas" w:cs="Consolas"/>
-                <w:color w:val="5A0909"/>
-                <w:sz w:val="17"/>
-                <w:szCs w:val="17"/>
-                <w:shd w:val="clear" w:color="auto" w:fill="F3EFEB"/>
-              </w:rPr>
               <w:t xml:space="preserve">ink-word</w:t>
             </w:r>
           </w:p>
@@ -25340,7 +25356,7 @@
                 <w:sz w:val="19"/>
                 <w:szCs w:val="19"/>
               </w:rPr>
-              <w:t xml:space="preserve">Gentle animations. All of them switch off for people whose phone asks for reduced motion.</w:t>
+              <w:t xml:space="preserve">Gentle animations while scrolling (nothing moves as a page opens). All of them switch off for people whose phone asks for reduced motion.</w:t>
             </w:r>
           </w:p>
         </w:tc>
@@ -25499,7 +25515,20 @@
         <w:t xml:space="preserve">src/lib/photos.ts</w:t>
       </w:r>
       <w:r>
-        <w:t xml:space="preserve"> (size, description for screen readers, credit). They come from Unsplash and Pexels, both free to use without credit, so the site doesn’t name the sources; each photo’s </w:t>
+        <w:t xml:space="preserve"> (size, description for screen readers, credit). The homepage photo, </w:t>
+      </w:r>
+      <w:r>
+        <w:rPr>
+          <w:rFonts w:ascii="Consolas" w:hAnsi="Consolas" w:cs="Consolas"/>
+          <w:color w:val="5A0909"/>
+          <w:sz w:val="19"/>
+          <w:szCs w:val="19"/>
+          <w:shd w:val="clear" w:color="auto" w:fill="F3EFEB"/>
+        </w:rPr>
+        <w:t xml:space="preserve">hero-donor-nurse.jpg</w:t>
+      </w:r>
+      <w:r>
+        <w:t xml:space="preserve"> (a smiling donor and a smiling nurse), is an original picture made for Rakt Response with Figma AI, in the Figma file “Rakt Response hero images”. The other six come from Unsplash and Pexels, both free to use without credit, so the site doesn’t name the sources; each photo’s </w:t>
       </w:r>
       <w:r>
         <w:rPr>
@@ -25525,20 +25554,7 @@
         <w:t xml:space="preserve">photos.ts</w:t>
       </w:r>
       <w:r>
-        <w:t xml:space="preserve"> is kept for our records. The homepage photo is </w:t>
-      </w:r>
-      <w:r>
-        <w:rPr>
-          <w:rFonts w:ascii="Consolas" w:hAnsi="Consolas" w:cs="Consolas"/>
-          <w:color w:val="5A0909"/>
-          <w:sz w:val="19"/>
-          <w:szCs w:val="19"/>
-          <w:shd w:val="clear" w:color="auto" w:fill="F3EFEB"/>
-        </w:rPr>
-        <w:t xml:space="preserve">hero-donor-arm.jpg</w:t>
-      </w:r>
-      <w:r>
-        <w:t xml:space="preserve"> (Rahul Sapra, Pexels). To replace one, save your photo under the same file name (recipe 12.3).</w:t>
+        <w:t xml:space="preserve"> is kept for our records. To replace one, save your photo under the same file name (recipe 12.3).</w:t>
       </w:r>
     </w:p>
     <w:p>
@@ -25823,7 +25839,7 @@
           <w:szCs w:val="19"/>
           <w:shd w:val="clear" w:color="auto" w:fill="F3EFEB"/>
         </w:rPr>
-        <w:t xml:space="preserve">hero-donor-arm.jpg</w:t>
+        <w:t xml:space="preserve">hero-donor-nurse.jpg</w:t>
       </w:r>
       <w:r>
         <w:t xml:space="preserve"> for the homepage.</w:t>
@@ -29617,6 +29633,75 @@
                 <w:szCs w:val="17"/>
                 <w:shd w:val="clear" w:color="auto" w:fill="F3EFEB"/>
               </w:rPr>
+              <w:t xml:space="preserve">live-2026-10-16</w:t>
+            </w:r>
+          </w:p>
+        </w:tc>
+        <w:tc>
+          <w:tcPr>
+            <w:tcW w:w="2506" w:type="dxa"/>
+          </w:tcPr>
+          <w:p>
+            <w:pPr>
+              <w:spacing w:before="0" w:after="40" w:line="252" w:lineRule="auto"/>
+            </w:pPr>
+            <w:r>
+              <w:rPr>
+                <w:sz w:val="19"/>
+                <w:szCs w:val="19"/>
+              </w:rPr>
+              <w:t xml:space="preserve">The version live before the 17 October 2026 update (donation editing, lighter homepage).</w:t>
+            </w:r>
+          </w:p>
+        </w:tc>
+        <w:tc>
+          <w:tcPr>
+            <w:tcW w:w="5012" w:type="dxa"/>
+          </w:tcPr>
+          <w:p>
+            <w:pPr>
+              <w:spacing w:before="0" w:after="40" w:line="252" w:lineRule="auto"/>
+            </w:pPr>
+            <w:r>
+              <w:rPr>
+                <w:rFonts w:ascii="Consolas" w:hAnsi="Consolas" w:cs="Consolas"/>
+                <w:color w:val="5A0909"/>
+                <w:sz w:val="17"/>
+                <w:szCs w:val="17"/>
+                <w:shd w:val="clear" w:color="auto" w:fill="F3EFEB"/>
+              </w:rPr>
+              <w:t xml:space="preserve">git switch -c look-back live-2026-10-16</w:t>
+            </w:r>
+          </w:p>
+        </w:tc>
+      </w:tr>
+      <w:tr>
+        <w:trPr>
+          <w:cantSplit/>
+        </w:trPr>
+        <w:tc>
+          <w:tcPr>
+            <w:tcW w:w="2120" w:type="dxa"/>
+          </w:tcPr>
+          <w:p>
+            <w:pPr>
+              <w:spacing w:before="0" w:after="40" w:line="252" w:lineRule="auto"/>
+            </w:pPr>
+            <w:r>
+              <w:rPr>
+                <w:sz w:val="19"/>
+                <w:szCs w:val="19"/>
+              </w:rPr>
+              <w:t xml:space="preserve">Tag </w:t>
+            </w:r>
+            <w:r>
+              <w:rPr>
+                <w:rFonts w:ascii="Consolas" w:hAnsi="Consolas" w:cs="Consolas"/>
+                <w:color w:val="5A0909"/>
+                <w:sz w:val="17"/>
+                <w:szCs w:val="17"/>
+                <w:shd w:val="clear" w:color="auto" w:fill="F3EFEB"/>
+              </w:rPr>
               <w:t xml:space="preserve">live-before-redesign</w:t>
             </w:r>
           </w:p>
@@ -29634,7 +29719,7 @@
                 <w:sz w:val="19"/>
                 <w:szCs w:val="19"/>
               </w:rPr>
-              <w:t xml:space="preserve">To look at the version that was live before the 2026 redesign.</w:t>
+              <w:t xml:space="preserve">The version live before the 2026 redesign.</w:t>
             </w:r>
           </w:p>
         </w:tc>
@@ -29655,6 +29740,75 @@
                 <w:shd w:val="clear" w:color="auto" w:fill="F3EFEB"/>
               </w:rPr>
               <w:t xml:space="preserve">git switch -c old-site live-before-redesign</w:t>
+            </w:r>
+          </w:p>
+        </w:tc>
+      </w:tr>
+      <w:tr>
+        <w:trPr>
+          <w:cantSplit/>
+        </w:trPr>
+        <w:tc>
+          <w:tcPr>
+            <w:tcW w:w="2120" w:type="dxa"/>
+          </w:tcPr>
+          <w:p>
+            <w:pPr>
+              <w:spacing w:before="0" w:after="40" w:line="252" w:lineRule="auto"/>
+            </w:pPr>
+            <w:r>
+              <w:rPr>
+                <w:sz w:val="19"/>
+                <w:szCs w:val="19"/>
+              </w:rPr>
+              <w:t xml:space="preserve">Tag </w:t>
+            </w:r>
+            <w:r>
+              <w:rPr>
+                <w:rFonts w:ascii="Consolas" w:hAnsi="Consolas" w:cs="Consolas"/>
+                <w:color w:val="5A0909"/>
+                <w:sz w:val="17"/>
+                <w:szCs w:val="17"/>
+                <w:shd w:val="clear" w:color="auto" w:fill="F3EFEB"/>
+              </w:rPr>
+              <w:t xml:space="preserve">first-version</w:t>
+            </w:r>
+          </w:p>
+        </w:tc>
+        <w:tc>
+          <w:tcPr>
+            <w:tcW w:w="2506" w:type="dxa"/>
+          </w:tcPr>
+          <w:p>
+            <w:pPr>
+              <w:spacing w:before="0" w:after="40" w:line="252" w:lineRule="auto"/>
+            </w:pPr>
+            <w:r>
+              <w:rPr>
+                <w:sz w:val="19"/>
+                <w:szCs w:val="19"/>
+              </w:rPr>
+              <w:t xml:space="preserve">The very first version of the site.</w:t>
+            </w:r>
+          </w:p>
+        </w:tc>
+        <w:tc>
+          <w:tcPr>
+            <w:tcW w:w="5012" w:type="dxa"/>
+          </w:tcPr>
+          <w:p>
+            <w:pPr>
+              <w:spacing w:before="0" w:after="40" w:line="252" w:lineRule="auto"/>
+            </w:pPr>
+            <w:r>
+              <w:rPr>
+                <w:rFonts w:ascii="Consolas" w:hAnsi="Consolas" w:cs="Consolas"/>
+                <w:color w:val="5A0909"/>
+                <w:sz w:val="17"/>
+                <w:szCs w:val="17"/>
+                <w:shd w:val="clear" w:color="auto" w:fill="F3EFEB"/>
+              </w:rPr>
+              <w:t xml:space="preserve">git switch -c first-look first-version</w:t>
             </w:r>
           </w:p>
         </w:tc>
@@ -32154,7 +32308,7 @@
         <w:rPr>
           <w:color w:val="6B5D5A"/>
         </w:rPr>
-        <w:t xml:space="preserve">Generated from the project’s file list on 16 October 2026. Paths are relative to the project folder.</w:t>
+        <w:t xml:space="preserve">Generated from the project’s file list on 17 October 2026. Paths are relative to the project folder.</w:t>
       </w:r>
     </w:p>
     <w:p>
@@ -33970,7 +34124,7 @@
                 <w:sz w:val="19"/>
                 <w:szCs w:val="19"/>
               </w:rPr>
-              <w:t xml:space="preserve">App icon, 192 px (generated by </w:t>
+              <w:t xml:space="preserve">App icon, 192 px: the mark on cream (generated by </w:t>
             </w:r>
             <w:r>
               <w:rPr>
@@ -34332,7 +34486,7 @@
                 <w:szCs w:val="17"/>
                 <w:shd w:val="clear" w:color="auto" w:fill="F3EFEB"/>
               </w:rPr>
-              <w:t xml:space="preserve">public/images/photos/hero-donor-arm.jpg</w:t>
+              <w:t xml:space="preserve">public/images/photos/hero-donor-nurse.jpg</w:t>
             </w:r>
           </w:p>
         </w:tc>
@@ -34349,7 +34503,7 @@
                 <w:sz w:val="19"/>
                 <w:szCs w:val="19"/>
               </w:rPr>
-              <w:t xml:space="preserve">Photo: a donor giving blood, red thread on the wrist (Rahul Sapra, Pexels). The homepage hero.</w:t>
+              <w:t xml:space="preserve">Photo: a smiling donor in the chair and a smiling nurse (original picture made with Figma AI). The homepage hero.</w:t>
             </w:r>
           </w:p>
         </w:tc>

</xml_diff>

<commit_message>
Rakt Mitra title, follow up after donation, homepage blood group line
</commit_message>
<xml_diff>
--- a/docs/Rakt-Response-Code-Guide.docx
+++ b/docs/Rakt-Response-Code-Guide.docx
@@ -2733,6 +2733,72 @@
                 <w:sz w:val="19"/>
                 <w:szCs w:val="19"/>
               </w:rPr>
+              <w:t xml:space="preserve">The name “Rakt Mitra” (the site’s word for volunteers)</w:t>
+            </w:r>
+          </w:p>
+        </w:tc>
+        <w:tc>
+          <w:tcPr>
+            <w:tcW w:w="4819" w:type="dxa"/>
+          </w:tcPr>
+          <w:p>
+            <w:pPr>
+              <w:spacing w:before="0" w:after="40" w:line="252" w:lineRule="auto"/>
+            </w:pPr>
+            <w:r>
+              <w:rPr>
+                <w:rFonts w:ascii="Consolas" w:hAnsi="Consolas" w:cs="Consolas"/>
+                <w:color w:val="5A0909"/>
+                <w:sz w:val="17"/>
+                <w:szCs w:val="17"/>
+                <w:shd w:val="clear" w:color="auto" w:fill="F3EFEB"/>
+              </w:rPr>
+              <w:t xml:space="preserve">src/i18n/terms.ts</w:t>
+            </w:r>
+            <w:r>
+              <w:rPr>
+                <w:sz w:val="19"/>
+                <w:szCs w:val="19"/>
+              </w:rPr>
+              <w:t xml:space="preserve"> + the catalogs</w:t>
+            </w:r>
+          </w:p>
+        </w:tc>
+        <w:tc>
+          <w:tcPr>
+            <w:tcW w:w="1048" w:type="dxa"/>
+          </w:tcPr>
+          <w:p>
+            <w:pPr>
+              <w:spacing w:before="0" w:after="40" w:line="252" w:lineRule="auto"/>
+            </w:pPr>
+            <w:r>
+              <w:rPr>
+                <w:sz w:val="19"/>
+                <w:szCs w:val="19"/>
+              </w:rPr>
+              <w:t xml:space="preserve">§10</w:t>
+            </w:r>
+          </w:p>
+        </w:tc>
+      </w:tr>
+      <w:tr>
+        <w:trPr>
+          <w:cantSplit/>
+        </w:trPr>
+        <w:tc>
+          <w:tcPr>
+            <w:tcW w:w="3771" w:type="dxa"/>
+          </w:tcPr>
+          <w:p>
+            <w:pPr>
+              <w:spacing w:before="0" w:after="40" w:line="252" w:lineRule="auto"/>
+            </w:pPr>
+            <w:r>
+              <w:rPr>
+                <w:sz w:val="19"/>
+                <w:szCs w:val="19"/>
+              </w:rPr>
               <w:t xml:space="preserve">Who families see, and the limits</w:t>
             </w:r>
           </w:p>
@@ -10458,7 +10524,7 @@
                 <w:sz w:val="19"/>
                 <w:szCs w:val="19"/>
               </w:rPr>
-              <w:t xml:space="preserve">Home after sign-in: open requests that match you, when you can give again, profile completeness, donation summary, quick links.</w:t>
+              <w:t xml:space="preserve">Home after sign-in: “Did you donate?” for joined requests whose time has passed, open requests that match you, when you can give again, profile completeness, donation summary, quick links.</w:t>
             </w:r>
           </w:p>
         </w:tc>
@@ -10520,7 +10586,7 @@
                 <w:sz w:val="19"/>
                 <w:szCs w:val="19"/>
               </w:rPr>
-              <w:t xml:space="preserve">Open requests a donor can join (My blood group / All), volunteers’ contact requests, and requests you submitted.</w:t>
+              <w:t xml:space="preserve">Open requests a donor can join (My blood group / All), Rakt Mitras’ contact requests, and requests you submitted.</w:t>
             </w:r>
           </w:p>
         </w:tc>
@@ -10599,7 +10665,24 @@
                 <w:sz w:val="19"/>
                 <w:szCs w:val="19"/>
               </w:rPr>
-              <w:t xml:space="preserve">). A donor who joined: the patient’s and hospital’s details and the family’s number. Other donors: “I can donate”, or why not yet.</w:t>
+              <w:t xml:space="preserve">). A donor who joined: the patient’s and hospital’s details and the family’s number. Other donors: “I can donate”, or why not yet. After the donation: “Did you donate?” and the thank-you with aftercare (</w:t>
+            </w:r>
+            <w:r>
+              <w:rPr>
+                <w:rFonts w:ascii="Consolas" w:hAnsi="Consolas" w:cs="Consolas"/>
+                <w:color w:val="5A0909"/>
+                <w:sz w:val="17"/>
+                <w:szCs w:val="17"/>
+                <w:shd w:val="clear" w:color="auto" w:fill="F3EFEB"/>
+              </w:rPr>
+              <w:t xml:space="preserve">donation-report.tsx</w:t>
+            </w:r>
+            <w:r>
+              <w:rPr>
+                <w:sz w:val="19"/>
+                <w:szCs w:val="19"/>
+              </w:rPr>
+              <w:t xml:space="preserve">), also for a while after the request closes.</w:t>
             </w:r>
           </w:p>
         </w:tc>
@@ -11319,7 +11402,7 @@
                 <w:sz w:val="19"/>
                 <w:szCs w:val="19"/>
               </w:rPr>
-              <w:t xml:space="preserve">Overview of what needs attention. Opening it also runs housekeeping (request expiry, follow-up reminders).</w:t>
+              <w:t xml:space="preserve">Overview of what needs attention, including donors to follow up. Opening it also runs housekeeping (request expiry, follow-up reminders).</w:t>
             </w:r>
           </w:p>
         </w:tc>
@@ -11584,7 +11667,7 @@
                 <w:sz w:val="19"/>
                 <w:szCs w:val="19"/>
               </w:rPr>
-              <w:t xml:space="preserve">Requests you are coordinating, with follow-ups.</w:t>
+              <w:t xml:space="preserve">Follow up after donation (donors who gave blood: open their contact, thank them, mark it done) and the requests you are coordinating, with follow-ups.</w:t>
             </w:r>
           </w:p>
         </w:tc>
@@ -18166,7 +18249,7 @@
                 <w:sz w:val="19"/>
                 <w:szCs w:val="19"/>
               </w:rPr>
-              <w:t xml:space="preserve">submitBloodRequest, cancelMyRequest, respondToRequest, respondToContactRequest, revealDonorToRequester</w:t>
+              <w:t xml:space="preserve">submitBloodRequest, cancelMyRequest, respondToRequest, reportMyDonation, respondToContactRequest, revealDonorToRequester</w:t>
             </w:r>
           </w:p>
         </w:tc>
@@ -18284,7 +18367,7 @@
                 <w:sz w:val="19"/>
                 <w:szCs w:val="19"/>
               </w:rPr>
-              <w:t xml:space="preserve">setRequestStatus, editRequestDetails, assignRequest, updateAssignment, recordCoordination, revealDonorContact, sendContactRequest, verifyDonationRecord, addInternalNote, runCoordinationHousekeeping</w:t>
+              <w:t xml:space="preserve">setRequestStatus, editRequestDetails, assignRequest, updateAssignment, recordCoordination, completeDonationFollowUp, revealDonorContact, sendContactRequest, verifyDonationRecord, addInternalNote, runCoordinationHousekeeping</w:t>
             </w:r>
           </w:p>
         </w:tc>
@@ -19994,7 +20077,7 @@
                 <w:sz w:val="19"/>
                 <w:szCs w:val="19"/>
               </w:rPr>
-              <w:t xml:space="preserve">Volunteer</w:t>
+              <w:t xml:space="preserve">Rakt Mitra (volunteer)</w:t>
             </w:r>
           </w:p>
         </w:tc>
@@ -20028,7 +20111,24 @@
                 <w:sz w:val="19"/>
                 <w:szCs w:val="19"/>
               </w:rPr>
-              <w:t xml:space="preserve">The volunteer area. Sees donors only through the directory (display name or “Donor #XXXX”). Opens a donor’s contact details for a verified request (or first asks donors who haven’t allowed direct contact); every view is logged. With “verify donations” can also correct donation records.</w:t>
+              <w:t xml:space="preserve">The Rakt Mitra area (</w:t>
+            </w:r>
+            <w:r>
+              <w:rPr>
+                <w:rFonts w:ascii="Consolas" w:hAnsi="Consolas" w:cs="Consolas"/>
+                <w:color w:val="5A0909"/>
+                <w:sz w:val="17"/>
+                <w:szCs w:val="17"/>
+                <w:shd w:val="clear" w:color="auto" w:fill="F3EFEB"/>
+              </w:rPr>
+              <w:t xml:space="preserve">/volunteer</w:t>
+            </w:r>
+            <w:r>
+              <w:rPr>
+                <w:sz w:val="19"/>
+                <w:szCs w:val="19"/>
+              </w:rPr>
+              <w:t xml:space="preserve">). Follows up with donors after they donate. Sees donors only through the directory (display name or “Donor #XXXX”). Opens a donor’s contact details for a verified request (or first asks donors who haven’t allowed direct contact); every view is logged. With “verify donations” can also correct donation records.</w:t>
             </w:r>
           </w:p>
         </w:tc>
@@ -20085,1976 +20185,6 @@
                 <w:szCs w:val="19"/>
               </w:rPr>
               <w:t xml:space="preserve">Everything: the admin area, roles, settings, and deleting records, requests and stories. Can’t change their own role.</w:t>
-            </w:r>
-          </w:p>
-        </w:tc>
-      </w:tr>
-    </w:tbl>
-    <w:p>
-      <w:pPr>
-        <w:spacing w:after="80"/>
-      </w:pPr>
-    </w:p>
-    <w:p>
-      <w:r>
-        <w:t xml:space="preserve">These rules live in the database itself, not just in the website:</w:t>
-      </w:r>
-    </w:p>
-    <w:p>
-      <w:pPr>
-        <w:pStyle w:val="ListParagraph"/>
-        <w:numPr>
-          <w:ilvl w:val="0"/>
-          <w:numId w:val="1"/>
-        </w:numPr>
-        <w:spacing w:after="60"/>
-      </w:pPr>
-      <w:r>
-        <w:rPr>
-          <w:b/>
-        </w:rPr>
-        <w:t xml:space="preserve">Row Level Security (RLS) policies:</w:t>
-      </w:r>
-      <w:r>
-        <w:t xml:space="preserve"> per-table rules, e.g. “a donor reads only their own records”.</w:t>
-      </w:r>
-    </w:p>
-    <w:p>
-      <w:pPr>
-        <w:pStyle w:val="ListParagraph"/>
-        <w:numPr>
-          <w:ilvl w:val="0"/>
-          <w:numId w:val="1"/>
-        </w:numPr>
-        <w:spacing w:after="60"/>
-      </w:pPr>
-      <w:r>
-        <w:rPr>
-          <w:b/>
-        </w:rPr>
-        <w:t xml:space="preserve">Guard triggers:</w:t>
-      </w:r>
-      <w:r>
-        <w:t xml:space="preserve"> checks on every change, e.g. donors can’t mark their own donation as verified.</w:t>
-      </w:r>
-    </w:p>
-    <w:p>
-      <w:pPr>
-        <w:pStyle w:val="ListParagraph"/>
-        <w:numPr>
-          <w:ilvl w:val="0"/>
-          <w:numId w:val="1"/>
-        </w:numPr>
-        <w:spacing w:after="60"/>
-      </w:pPr>
-      <w:r>
-        <w:rPr>
-          <w:b/>
-        </w:rPr>
-        <w:t xml:space="preserve">Database functions (RPCs):</w:t>
-      </w:r>
-      <w:r>
-        <w:t xml:space="preserve"> actions with their own checks, e.g. </w:t>
-      </w:r>
-      <w:r>
-        <w:rPr>
-          <w:rFonts w:ascii="Consolas" w:hAnsi="Consolas" w:cs="Consolas"/>
-          <w:color w:val="5A0909"/>
-          <w:sz w:val="19"/>
-          <w:szCs w:val="19"/>
-          <w:shd w:val="clear" w:color="auto" w:fill="F3EFEB"/>
-        </w:rPr>
-        <w:t xml:space="preserve">verify_donation_record</w:t>
-      </w:r>
-      <w:r>
-        <w:t xml:space="preserve">, </w:t>
-      </w:r>
-      <w:r>
-        <w:rPr>
-          <w:rFonts w:ascii="Consolas" w:hAnsi="Consolas" w:cs="Consolas"/>
-          <w:color w:val="5A0909"/>
-          <w:sz w:val="19"/>
-          <w:szCs w:val="19"/>
-          <w:shd w:val="clear" w:color="auto" w:fill="F3EFEB"/>
-        </w:rPr>
-        <w:t xml:space="preserve">reveal_donor_contact</w:t>
-      </w:r>
-      <w:r>
-        <w:t xml:space="preserve">, </w:t>
-      </w:r>
-      <w:r>
-        <w:rPr>
-          <w:rFonts w:ascii="Consolas" w:hAnsi="Consolas" w:cs="Consolas"/>
-          <w:color w:val="5A0909"/>
-          <w:sz w:val="19"/>
-          <w:szCs w:val="19"/>
-          <w:shd w:val="clear" w:color="auto" w:fill="F3EFEB"/>
-        </w:rPr>
-        <w:t xml:space="preserve">reveal_donor_contact_to_requester</w:t>
-      </w:r>
-      <w:r>
-        <w:t xml:space="preserve">, </w:t>
-      </w:r>
-      <w:r>
-        <w:rPr>
-          <w:rFonts w:ascii="Consolas" w:hAnsi="Consolas" w:cs="Consolas"/>
-          <w:color w:val="5A0909"/>
-          <w:sz w:val="19"/>
-          <w:szCs w:val="19"/>
-          <w:shd w:val="clear" w:color="auto" w:fill="F3EFEB"/>
-        </w:rPr>
-        <w:t xml:space="preserve">admin_delete_blood_request</w:t>
-      </w:r>
-      <w:r>
-        <w:t xml:space="preserve">.</w:t>
-      </w:r>
-    </w:p>
-    <w:p>
-      <w:pPr>
-        <w:pStyle w:val="ListParagraph"/>
-        <w:numPr>
-          <w:ilvl w:val="0"/>
-          <w:numId w:val="1"/>
-        </w:numPr>
-        <w:spacing w:after="60"/>
-      </w:pPr>
-      <w:r>
-        <w:t xml:space="preserve">The helpers </w:t>
-      </w:r>
-      <w:r>
-        <w:rPr>
-          <w:rFonts w:ascii="Consolas" w:hAnsi="Consolas" w:cs="Consolas"/>
-          <w:color w:val="5A0909"/>
-          <w:sz w:val="19"/>
-          <w:szCs w:val="19"/>
-          <w:shd w:val="clear" w:color="auto" w:fill="F3EFEB"/>
-        </w:rPr>
-        <w:t xml:space="preserve">is_admin()</w:t>
-      </w:r>
-      <w:r>
-        <w:t xml:space="preserve">, </w:t>
-      </w:r>
-      <w:r>
-        <w:rPr>
-          <w:rFonts w:ascii="Consolas" w:hAnsi="Consolas" w:cs="Consolas"/>
-          <w:color w:val="5A0909"/>
-          <w:sz w:val="19"/>
-          <w:szCs w:val="19"/>
-          <w:shd w:val="clear" w:color="auto" w:fill="F3EFEB"/>
-        </w:rPr>
-        <w:t xml:space="preserve">is_staff()</w:t>
-      </w:r>
-      <w:r>
-        <w:t xml:space="preserve"> and </w:t>
-      </w:r>
-      <w:r>
-        <w:rPr>
-          <w:rFonts w:ascii="Consolas" w:hAnsi="Consolas" w:cs="Consolas"/>
-          <w:color w:val="5A0909"/>
-          <w:sz w:val="19"/>
-          <w:szCs w:val="19"/>
-          <w:shd w:val="clear" w:color="auto" w:fill="F3EFEB"/>
-        </w:rPr>
-        <w:t xml:space="preserve">staff_can('verify_donations')</w:t>
-      </w:r>
-      <w:r>
-        <w:t xml:space="preserve"> are used inside all of these.</w:t>
-      </w:r>
-    </w:p>
-    <w:p>
-      <w:pPr>
-        <w:pStyle w:val="Heading2"/>
-      </w:pPr>
-      <w:bookmarkStart w:id="35" w:name="s9_2b"/>
-      <w:r>
-        <w:t xml:space="preserve">Blood requests: who sees what</w:t>
-      </w:r>
-      <w:bookmarkEnd w:id="35"/>
-    </w:p>
-    <w:tbl>
-      <w:tblPr>
-        <w:tblW w:w="9638" w:type="dxa"/>
-        <w:tblBorders>
-          <w:top w:val="single" w:sz="4" w:space="0" w:color="D9CFC8"/>
-          <w:left w:val="single" w:sz="4" w:space="0" w:color="D9CFC8"/>
-          <w:bottom w:val="single" w:sz="4" w:space="0" w:color="D9CFC8"/>
-          <w:right w:val="single" w:sz="4" w:space="0" w:color="D9CFC8"/>
-          <w:insideH w:val="single" w:sz="4" w:space="0" w:color="D9CFC8"/>
-          <w:insideV w:val="single" w:sz="4" w:space="0" w:color="D9CFC8"/>
-        </w:tblBorders>
-        <w:tblLayout w:type="fixed"/>
-        <w:tblCellMar>
-          <w:top w:w="70" w:type="dxa"/>
-          <w:left w:w="100" w:type="dxa"/>
-          <w:bottom w:w="40" w:type="dxa"/>
-          <w:right w:w="100" w:type="dxa"/>
-        </w:tblCellMar>
-        <w:tblLook w:val="04A0" w:firstRow="1" w:lastRow="0" w:firstColumn="0" w:lastColumn="0" w:noHBand="0" w:noVBand="1"/>
-      </w:tblPr>
-      <w:tblGrid>
-        <w:gridCol w:w="2699"/>
-        <w:gridCol w:w="6939"/>
-      </w:tblGrid>
-      <w:tr>
-        <w:trPr>
-          <w:cantSplit/>
-          <w:tblHeader/>
-        </w:trPr>
-        <w:tc>
-          <w:tcPr>
-            <w:tcW w:w="2699" w:type="dxa"/>
-            <w:shd w:val="clear" w:color="auto" w:fill="F2EAE5"/>
-          </w:tcPr>
-          <w:p>
-            <w:pPr>
-              <w:spacing w:before="0" w:after="40" w:line="252" w:lineRule="auto"/>
-            </w:pPr>
-            <w:r>
-              <w:rPr>
-                <w:b/>
-                <w:sz w:val="19"/>
-                <w:szCs w:val="19"/>
-              </w:rPr>
-              <w:t xml:space="preserve">Who</w:t>
-            </w:r>
-          </w:p>
-        </w:tc>
-        <w:tc>
-          <w:tcPr>
-            <w:tcW w:w="6939" w:type="dxa"/>
-            <w:shd w:val="clear" w:color="auto" w:fill="F2EAE5"/>
-          </w:tcPr>
-          <w:p>
-            <w:pPr>
-              <w:spacing w:before="0" w:after="40" w:line="252" w:lineRule="auto"/>
-            </w:pPr>
-            <w:r>
-              <w:rPr>
-                <w:b/>
-                <w:sz w:val="19"/>
-                <w:szCs w:val="19"/>
-              </w:rPr>
-              <w:t xml:space="preserve">Sees</w:t>
-            </w:r>
-          </w:p>
-        </w:tc>
-      </w:tr>
-      <w:tr>
-        <w:trPr>
-          <w:cantSplit/>
-        </w:trPr>
-        <w:tc>
-          <w:tcPr>
-            <w:tcW w:w="2699" w:type="dxa"/>
-          </w:tcPr>
-          <w:p>
-            <w:pPr>
-              <w:spacing w:before="0" w:after="40" w:line="252" w:lineRule="auto"/>
-            </w:pPr>
-            <w:r>
-              <w:rPr>
-                <w:sz w:val="19"/>
-                <w:szCs w:val="19"/>
-              </w:rPr>
-              <w:t xml:space="preserve">Anyone (Find blood)</w:t>
-            </w:r>
-          </w:p>
-        </w:tc>
-        <w:tc>
-          <w:tcPr>
-            <w:tcW w:w="6939" w:type="dxa"/>
-          </w:tcPr>
-          <w:p>
-            <w:pPr>
-              <w:spacing w:before="0" w:after="40" w:line="252" w:lineRule="auto"/>
-            </w:pPr>
-            <w:r>
-              <w:rPr>
-                <w:sz w:val="19"/>
-                <w:szCs w:val="19"/>
-              </w:rPr>
-              <w:t xml:space="preserve">Blood group, what is needed, units, hospital, city, needed by and urgency. Never the patient’s name or a phone number.</w:t>
-            </w:r>
-          </w:p>
-        </w:tc>
-      </w:tr>
-      <w:tr>
-        <w:trPr>
-          <w:cantSplit/>
-        </w:trPr>
-        <w:tc>
-          <w:tcPr>
-            <w:tcW w:w="2699" w:type="dxa"/>
-          </w:tcPr>
-          <w:p>
-            <w:pPr>
-              <w:spacing w:before="0" w:after="40" w:line="252" w:lineRule="auto"/>
-            </w:pPr>
-            <w:r>
-              <w:rPr>
-                <w:sz w:val="19"/>
-                <w:szCs w:val="19"/>
-              </w:rPr>
-              <w:t xml:space="preserve">The family that made the request</w:t>
-            </w:r>
-          </w:p>
-        </w:tc>
-        <w:tc>
-          <w:tcPr>
-            <w:tcW w:w="6939" w:type="dxa"/>
-          </w:tcPr>
-          <w:p>
-            <w:pPr>
-              <w:spacing w:before="0" w:after="40" w:line="252" w:lineRule="auto"/>
-            </w:pPr>
-            <w:r>
-              <w:rPr>
-                <w:sz w:val="19"/>
-                <w:szCs w:val="19"/>
-              </w:rPr>
-              <w:t xml:space="preserve">Everything they entered. Once a volunteer verifies it: donors who joined, then up to 30 donors who can give now. They open one donor’s contact at a time, on the channel that donor chose (logged; 15 an hour, 40 different donors in 30 days).</w:t>
-            </w:r>
-          </w:p>
-        </w:tc>
-      </w:tr>
-      <w:tr>
-        <w:trPr>
-          <w:cantSplit/>
-        </w:trPr>
-        <w:tc>
-          <w:tcPr>
-            <w:tcW w:w="2699" w:type="dxa"/>
-          </w:tcPr>
-          <w:p>
-            <w:pPr>
-              <w:spacing w:before="0" w:after="40" w:line="252" w:lineRule="auto"/>
-            </w:pPr>
-            <w:r>
-              <w:rPr>
-                <w:sz w:val="19"/>
-                <w:szCs w:val="19"/>
-              </w:rPr>
-              <w:t xml:space="preserve">Volunteers and admins</w:t>
-            </w:r>
-          </w:p>
-        </w:tc>
-        <w:tc>
-          <w:tcPr>
-            <w:tcW w:w="6939" w:type="dxa"/>
-          </w:tcPr>
-          <w:p>
-            <w:pPr>
-              <w:spacing w:before="0" w:after="40" w:line="252" w:lineRule="auto"/>
-            </w:pPr>
-            <w:r>
-              <w:rPr>
-                <w:sz w:val="19"/>
-                <w:szCs w:val="19"/>
-              </w:rPr>
-              <w:t xml:space="preserve">Everything, to check with the hospital, and donors’ contacts through the logged contact button.</w:t>
-            </w:r>
-          </w:p>
-        </w:tc>
-      </w:tr>
-      <w:tr>
-        <w:trPr>
-          <w:cantSplit/>
-        </w:trPr>
-        <w:tc>
-          <w:tcPr>
-            <w:tcW w:w="2699" w:type="dxa"/>
-          </w:tcPr>
-          <w:p>
-            <w:pPr>
-              <w:spacing w:before="0" w:after="40" w:line="252" w:lineRule="auto"/>
-            </w:pPr>
-            <w:r>
-              <w:rPr>
-                <w:sz w:val="19"/>
-                <w:szCs w:val="19"/>
-              </w:rPr>
-              <w:t xml:space="preserve">A donor who joined</w:t>
-            </w:r>
-          </w:p>
-        </w:tc>
-        <w:tc>
-          <w:tcPr>
-            <w:tcW w:w="6939" w:type="dxa"/>
-          </w:tcPr>
-          <w:p>
-            <w:pPr>
-              <w:spacing w:before="0" w:after="40" w:line="252" w:lineRule="auto"/>
-            </w:pPr>
-            <w:r>
-              <w:rPr>
-                <w:sz w:val="19"/>
-                <w:szCs w:val="19"/>
-              </w:rPr>
-              <w:t xml:space="preserve">The patient’s name and age, the hospital, its IP/UHID number and ward, and the family’s name and phone (requests made from 18 October 2026).</w:t>
-            </w:r>
-          </w:p>
-        </w:tc>
-      </w:tr>
-      <w:tr>
-        <w:trPr>
-          <w:cantSplit/>
-        </w:trPr>
-        <w:tc>
-          <w:tcPr>
-            <w:tcW w:w="2699" w:type="dxa"/>
-          </w:tcPr>
-          <w:p>
-            <w:pPr>
-              <w:spacing w:before="0" w:after="40" w:line="252" w:lineRule="auto"/>
-            </w:pPr>
-            <w:r>
-              <w:rPr>
-                <w:sz w:val="19"/>
-                <w:szCs w:val="19"/>
-              </w:rPr>
-              <w:t xml:space="preserve">Other donors</w:t>
-            </w:r>
-          </w:p>
-        </w:tc>
-        <w:tc>
-          <w:tcPr>
-            <w:tcW w:w="6939" w:type="dxa"/>
-          </w:tcPr>
-          <w:p>
-            <w:pPr>
-              <w:spacing w:before="0" w:after="40" w:line="252" w:lineRule="auto"/>
-            </w:pPr>
-            <w:r>
-              <w:rPr>
-                <w:sz w:val="19"/>
-                <w:szCs w:val="19"/>
-              </w:rPr>
-              <w:t xml:space="preserve">The request as on Find blood, with “I can donate” when they can give now, or the reason and the date they can.</w:t>
-            </w:r>
-          </w:p>
-        </w:tc>
-      </w:tr>
-    </w:tbl>
-    <w:p>
-      <w:pPr>
-        <w:spacing w:after="80"/>
-      </w:pPr>
-    </w:p>
-    <w:p>
-      <w:r>
-        <w:rPr>
-          <w:b/>
-        </w:rPr>
-        <w:t xml:space="preserve">“Can give now”</w:t>
-      </w:r>
-      <w:r>
-        <w:t xml:space="preserve"> means: the same blood group (Oh only with Oh), the same district, not paused, not hiding their number, a phone or email for their chosen channel, no whole blood in the last 90 days and no SDP or other apheresis in the last 14. Self-reported donations count. Both intervals and all the limits are settings (§9, Settings). The blood centre’s doctor still decides.</w:t>
-      </w:r>
-    </w:p>
-    <w:p>
-      <w:pPr>
-        <w:pStyle w:val="Heading2"/>
-      </w:pPr>
-      <w:bookmarkStart w:id="36" w:name="s9_3"/>
-      <w:r>
-        <w:t xml:space="preserve">Main tables</w:t>
-      </w:r>
-      <w:bookmarkEnd w:id="36"/>
-    </w:p>
-    <w:tbl>
-      <w:tblPr>
-        <w:tblW w:w="9638" w:type="dxa"/>
-        <w:tblBorders>
-          <w:top w:val="single" w:sz="4" w:space="0" w:color="D9CFC8"/>
-          <w:left w:val="single" w:sz="4" w:space="0" w:color="D9CFC8"/>
-          <w:bottom w:val="single" w:sz="4" w:space="0" w:color="D9CFC8"/>
-          <w:right w:val="single" w:sz="4" w:space="0" w:color="D9CFC8"/>
-          <w:insideH w:val="single" w:sz="4" w:space="0" w:color="D9CFC8"/>
-          <w:insideV w:val="single" w:sz="4" w:space="0" w:color="D9CFC8"/>
-        </w:tblBorders>
-        <w:tblLayout w:type="fixed"/>
-        <w:tblCellMar>
-          <w:top w:w="70" w:type="dxa"/>
-          <w:left w:w="100" w:type="dxa"/>
-          <w:bottom w:w="40" w:type="dxa"/>
-          <w:right w:w="100" w:type="dxa"/>
-        </w:tblCellMar>
-        <w:tblLook w:val="04A0" w:firstRow="1" w:lastRow="0" w:firstColumn="0" w:lastColumn="0" w:noHBand="0" w:noVBand="1"/>
-      </w:tblPr>
-      <w:tblGrid>
-        <w:gridCol w:w="3855"/>
-        <w:gridCol w:w="5783"/>
-      </w:tblGrid>
-      <w:tr>
-        <w:trPr>
-          <w:cantSplit/>
-          <w:tblHeader/>
-        </w:trPr>
-        <w:tc>
-          <w:tcPr>
-            <w:tcW w:w="3855" w:type="dxa"/>
-            <w:shd w:val="clear" w:color="auto" w:fill="F2EAE5"/>
-          </w:tcPr>
-          <w:p>
-            <w:pPr>
-              <w:spacing w:before="0" w:after="40" w:line="252" w:lineRule="auto"/>
-            </w:pPr>
-            <w:r>
-              <w:rPr>
-                <w:b/>
-                <w:sz w:val="19"/>
-                <w:szCs w:val="19"/>
-              </w:rPr>
-              <w:t xml:space="preserve">Table</w:t>
-            </w:r>
-          </w:p>
-        </w:tc>
-        <w:tc>
-          <w:tcPr>
-            <w:tcW w:w="5783" w:type="dxa"/>
-            <w:shd w:val="clear" w:color="auto" w:fill="F2EAE5"/>
-          </w:tcPr>
-          <w:p>
-            <w:pPr>
-              <w:spacing w:before="0" w:after="40" w:line="252" w:lineRule="auto"/>
-            </w:pPr>
-            <w:r>
-              <w:rPr>
-                <w:b/>
-                <w:sz w:val="19"/>
-                <w:szCs w:val="19"/>
-              </w:rPr>
-              <w:t xml:space="preserve">Holds</w:t>
-            </w:r>
-          </w:p>
-        </w:tc>
-      </w:tr>
-      <w:tr>
-        <w:trPr>
-          <w:cantSplit/>
-        </w:trPr>
-        <w:tc>
-          <w:tcPr>
-            <w:tcW w:w="3855" w:type="dxa"/>
-          </w:tcPr>
-          <w:p>
-            <w:pPr>
-              <w:spacing w:before="0" w:after="40" w:line="252" w:lineRule="auto"/>
-            </w:pPr>
-            <w:r>
-              <w:rPr>
-                <w:rFonts w:ascii="Consolas" w:hAnsi="Consolas" w:cs="Consolas"/>
-                <w:color w:val="5A0909"/>
-                <w:sz w:val="17"/>
-                <w:szCs w:val="17"/>
-                <w:shd w:val="clear" w:color="auto" w:fill="F3EFEB"/>
-              </w:rPr>
-              <w:t xml:space="preserve">profiles</w:t>
-            </w:r>
-          </w:p>
-        </w:tc>
-        <w:tc>
-          <w:tcPr>
-            <w:tcW w:w="5783" w:type="dxa"/>
-          </w:tcPr>
-          <w:p>
-            <w:pPr>
-              <w:spacing w:before="0" w:after="40" w:line="252" w:lineRule="auto"/>
-            </w:pPr>
-            <w:r>
-              <w:rPr>
-                <w:sz w:val="19"/>
-                <w:szCs w:val="19"/>
-              </w:rPr>
-              <w:t xml:space="preserve">Name, display name, blood group, verification, activity.</w:t>
-            </w:r>
-          </w:p>
-        </w:tc>
-      </w:tr>
-      <w:tr>
-        <w:trPr>
-          <w:cantSplit/>
-        </w:trPr>
-        <w:tc>
-          <w:tcPr>
-            <w:tcW w:w="3855" w:type="dxa"/>
-          </w:tcPr>
-          <w:p>
-            <w:pPr>
-              <w:spacing w:before="0" w:after="40" w:line="252" w:lineRule="auto"/>
-            </w:pPr>
-            <w:r>
-              <w:rPr>
-                <w:rFonts w:ascii="Consolas" w:hAnsi="Consolas" w:cs="Consolas"/>
-                <w:color w:val="5A0909"/>
-                <w:sz w:val="17"/>
-                <w:szCs w:val="17"/>
-                <w:shd w:val="clear" w:color="auto" w:fill="F3EFEB"/>
-              </w:rPr>
-              <w:t xml:space="preserve">profile_contacts</w:t>
-            </w:r>
-          </w:p>
-        </w:tc>
-        <w:tc>
-          <w:tcPr>
-            <w:tcW w:w="5783" w:type="dxa"/>
-          </w:tcPr>
-          <w:p>
-            <w:pPr>
-              <w:spacing w:before="0" w:after="40" w:line="252" w:lineRule="auto"/>
-            </w:pPr>
-            <w:r>
-              <w:rPr>
-                <w:sz w:val="19"/>
-                <w:szCs w:val="19"/>
-              </w:rPr>
-              <w:t xml:space="preserve">Phone, WhatsApp and email, kept apart from the profile.</w:t>
-            </w:r>
-          </w:p>
-        </w:tc>
-      </w:tr>
-      <w:tr>
-        <w:trPr>
-          <w:cantSplit/>
-        </w:trPr>
-        <w:tc>
-          <w:tcPr>
-            <w:tcW w:w="3855" w:type="dxa"/>
-          </w:tcPr>
-          <w:p>
-            <w:pPr>
-              <w:spacing w:before="0" w:after="40" w:line="252" w:lineRule="auto"/>
-            </w:pPr>
-            <w:r>
-              <w:rPr>
-                <w:rFonts w:ascii="Consolas" w:hAnsi="Consolas" w:cs="Consolas"/>
-                <w:color w:val="5A0909"/>
-                <w:sz w:val="17"/>
-                <w:szCs w:val="17"/>
-                <w:shd w:val="clear" w:color="auto" w:fill="F3EFEB"/>
-              </w:rPr>
-              <w:t xml:space="preserve">donor_preferences</w:t>
-            </w:r>
-          </w:p>
-        </w:tc>
-        <w:tc>
-          <w:tcPr>
-            <w:tcW w:w="5783" w:type="dxa"/>
-          </w:tcPr>
-          <w:p>
-            <w:pPr>
-              <w:spacing w:before="0" w:after="40" w:line="252" w:lineRule="auto"/>
-            </w:pPr>
-            <w:r>
-              <w:rPr>
-                <w:sz w:val="19"/>
-                <w:szCs w:val="19"/>
-              </w:rPr>
-              <w:t xml:space="preserve">Hide my number, availability, how patients reach the donor, alerts.</w:t>
-            </w:r>
-          </w:p>
-        </w:tc>
-      </w:tr>
-      <w:tr>
-        <w:trPr>
-          <w:cantSplit/>
-        </w:trPr>
-        <w:tc>
-          <w:tcPr>
-            <w:tcW w:w="3855" w:type="dxa"/>
-          </w:tcPr>
-          <w:p>
-            <w:pPr>
-              <w:spacing w:before="0" w:after="40" w:line="252" w:lineRule="auto"/>
-            </w:pPr>
-            <w:r>
-              <w:rPr>
-                <w:rFonts w:ascii="Consolas" w:hAnsi="Consolas" w:cs="Consolas"/>
-                <w:color w:val="5A0909"/>
-                <w:sz w:val="17"/>
-                <w:szCs w:val="17"/>
-                <w:shd w:val="clear" w:color="auto" w:fill="F3EFEB"/>
-              </w:rPr>
-              <w:t xml:space="preserve">donor_locations</w:t>
-            </w:r>
-          </w:p>
-        </w:tc>
-        <w:tc>
-          <w:tcPr>
-            <w:tcW w:w="5783" w:type="dxa"/>
-          </w:tcPr>
-          <w:p>
-            <w:pPr>
-              <w:spacing w:before="0" w:after="40" w:line="252" w:lineRule="auto"/>
-            </w:pPr>
-            <w:r>
-              <w:rPr>
-                <w:sz w:val="19"/>
-                <w:szCs w:val="19"/>
-              </w:rPr>
-              <w:t xml:space="preserve">State, district, city, PIN, optional coordinates rounded to ~1 km.</w:t>
-            </w:r>
-          </w:p>
-        </w:tc>
-      </w:tr>
-      <w:tr>
-        <w:trPr>
-          <w:cantSplit/>
-        </w:trPr>
-        <w:tc>
-          <w:tcPr>
-            <w:tcW w:w="3855" w:type="dxa"/>
-          </w:tcPr>
-          <w:p>
-            <w:pPr>
-              <w:spacing w:before="0" w:after="40" w:line="252" w:lineRule="auto"/>
-            </w:pPr>
-            <w:r>
-              <w:rPr>
-                <w:rFonts w:ascii="Consolas" w:hAnsi="Consolas" w:cs="Consolas"/>
-                <w:color w:val="5A0909"/>
-                <w:sz w:val="17"/>
-                <w:szCs w:val="17"/>
-                <w:shd w:val="clear" w:color="auto" w:fill="F3EFEB"/>
-              </w:rPr>
-              <w:t xml:space="preserve">consent_events</w:t>
-            </w:r>
-          </w:p>
-        </w:tc>
-        <w:tc>
-          <w:tcPr>
-            <w:tcW w:w="5783" w:type="dxa"/>
-          </w:tcPr>
-          <w:p>
-            <w:pPr>
-              <w:spacing w:before="0" w:after="40" w:line="252" w:lineRule="auto"/>
-            </w:pPr>
-            <w:r>
-              <w:rPr>
-                <w:sz w:val="19"/>
-                <w:szCs w:val="19"/>
-              </w:rPr>
-              <w:t xml:space="preserve">History of each member’s choices (alerts, Hide my number, terms).</w:t>
-            </w:r>
-          </w:p>
-        </w:tc>
-      </w:tr>
-      <w:tr>
-        <w:trPr>
-          <w:cantSplit/>
-        </w:trPr>
-        <w:tc>
-          <w:tcPr>
-            <w:tcW w:w="3855" w:type="dxa"/>
-          </w:tcPr>
-          <w:p>
-            <w:pPr>
-              <w:spacing w:before="0" w:after="40" w:line="252" w:lineRule="auto"/>
-            </w:pPr>
-            <w:r>
-              <w:rPr>
-                <w:rFonts w:ascii="Consolas" w:hAnsi="Consolas" w:cs="Consolas"/>
-                <w:color w:val="5A0909"/>
-                <w:sz w:val="17"/>
-                <w:szCs w:val="17"/>
-                <w:shd w:val="clear" w:color="auto" w:fill="F3EFEB"/>
-              </w:rPr>
-              <w:t xml:space="preserve">donation_records</w:t>
-            </w:r>
-          </w:p>
-        </w:tc>
-        <w:tc>
-          <w:tcPr>
-            <w:tcW w:w="5783" w:type="dxa"/>
-          </w:tcPr>
-          <w:p>
-            <w:pPr>
-              <w:spacing w:before="0" w:after="40" w:line="252" w:lineRule="auto"/>
-            </w:pPr>
-            <w:r>
-              <w:rPr>
-                <w:sz w:val="19"/>
-                <w:szCs w:val="19"/>
-              </w:rPr>
-              <w:t xml:space="preserve">Each donation: type, date, centre, verification status.</w:t>
-            </w:r>
-          </w:p>
-        </w:tc>
-      </w:tr>
-      <w:tr>
-        <w:trPr>
-          <w:cantSplit/>
-        </w:trPr>
-        <w:tc>
-          <w:tcPr>
-            <w:tcW w:w="3855" w:type="dxa"/>
-          </w:tcPr>
-          <w:p>
-            <w:pPr>
-              <w:spacing w:before="0" w:after="40" w:line="252" w:lineRule="auto"/>
-            </w:pPr>
-            <w:r>
-              <w:rPr>
-                <w:rFonts w:ascii="Consolas" w:hAnsi="Consolas" w:cs="Consolas"/>
-                <w:color w:val="5A0909"/>
-                <w:sz w:val="17"/>
-                <w:szCs w:val="17"/>
-                <w:shd w:val="clear" w:color="auto" w:fill="F3EFEB"/>
-              </w:rPr>
-              <w:t xml:space="preserve">blood_requests</w:t>
-            </w:r>
-          </w:p>
-        </w:tc>
-        <w:tc>
-          <w:tcPr>
-            <w:tcW w:w="5783" w:type="dxa"/>
-          </w:tcPr>
-          <w:p>
-            <w:pPr>
-              <w:spacing w:before="0" w:after="40" w:line="252" w:lineRule="auto"/>
-            </w:pPr>
-            <w:r>
-              <w:rPr>
-                <w:sz w:val="19"/>
-                <w:szCs w:val="19"/>
-              </w:rPr>
-              <w:t xml:space="preserve">Requests: the patient’s details, the family’s private contact, status.</w:t>
-            </w:r>
-          </w:p>
-        </w:tc>
-      </w:tr>
-      <w:tr>
-        <w:trPr>
-          <w:cantSplit/>
-        </w:trPr>
-        <w:tc>
-          <w:tcPr>
-            <w:tcW w:w="3855" w:type="dxa"/>
-          </w:tcPr>
-          <w:p>
-            <w:pPr>
-              <w:spacing w:before="0" w:after="40" w:line="252" w:lineRule="auto"/>
-            </w:pPr>
-            <w:r>
-              <w:rPr>
-                <w:rFonts w:ascii="Consolas" w:hAnsi="Consolas" w:cs="Consolas"/>
-                <w:color w:val="5A0909"/>
-                <w:sz w:val="17"/>
-                <w:szCs w:val="17"/>
-                <w:shd w:val="clear" w:color="auto" w:fill="F3EFEB"/>
-              </w:rPr>
-              <w:t xml:space="preserve">donor_disclosures</w:t>
-            </w:r>
-          </w:p>
-        </w:tc>
-        <w:tc>
-          <w:tcPr>
-            <w:tcW w:w="5783" w:type="dxa"/>
-          </w:tcPr>
-          <w:p>
-            <w:pPr>
-              <w:spacing w:before="0" w:after="40" w:line="252" w:lineRule="auto"/>
-            </w:pPr>
-            <w:r>
-              <w:rPr>
-                <w:sz w:val="19"/>
-                <w:szCs w:val="19"/>
-              </w:rPr>
-              <w:t xml:space="preserve">Which donor contacts each family has opened.</w:t>
-            </w:r>
-          </w:p>
-        </w:tc>
-      </w:tr>
-      <w:tr>
-        <w:trPr>
-          <w:cantSplit/>
-        </w:trPr>
-        <w:tc>
-          <w:tcPr>
-            <w:tcW w:w="3855" w:type="dxa"/>
-          </w:tcPr>
-          <w:p>
-            <w:pPr>
-              <w:spacing w:before="0" w:after="40" w:line="252" w:lineRule="auto"/>
-            </w:pPr>
-            <w:r>
-              <w:rPr>
-                <w:rFonts w:ascii="Consolas" w:hAnsi="Consolas" w:cs="Consolas"/>
-                <w:color w:val="5A0909"/>
-                <w:sz w:val="17"/>
-                <w:szCs w:val="17"/>
-                <w:shd w:val="clear" w:color="auto" w:fill="F3EFEB"/>
-              </w:rPr>
-              <w:t xml:space="preserve">request_events</w:t>
-            </w:r>
-            <w:r>
-              <w:rPr>
-                <w:sz w:val="19"/>
-                <w:szCs w:val="19"/>
-              </w:rPr>
-              <w:t xml:space="preserve">, </w:t>
-            </w:r>
-            <w:r>
-              <w:rPr>
-                <w:rFonts w:ascii="Consolas" w:hAnsi="Consolas" w:cs="Consolas"/>
-                <w:color w:val="5A0909"/>
-                <w:sz w:val="17"/>
-                <w:szCs w:val="17"/>
-                <w:shd w:val="clear" w:color="auto" w:fill="F3EFEB"/>
-              </w:rPr>
-              <w:t xml:space="preserve">request_responses</w:t>
-            </w:r>
-            <w:r>
-              <w:rPr>
-                <w:sz w:val="19"/>
-                <w:szCs w:val="19"/>
-              </w:rPr>
-              <w:t xml:space="preserve">, </w:t>
-            </w:r>
-            <w:r>
-              <w:rPr>
-                <w:rFonts w:ascii="Consolas" w:hAnsi="Consolas" w:cs="Consolas"/>
-                <w:color w:val="5A0909"/>
-                <w:sz w:val="17"/>
-                <w:szCs w:val="17"/>
-                <w:shd w:val="clear" w:color="auto" w:fill="F3EFEB"/>
-              </w:rPr>
-              <w:t xml:space="preserve">contact_requests</w:t>
-            </w:r>
-            <w:r>
-              <w:rPr>
-                <w:sz w:val="19"/>
-                <w:szCs w:val="19"/>
-              </w:rPr>
-              <w:t xml:space="preserve">, </w:t>
-            </w:r>
-            <w:r>
-              <w:rPr>
-                <w:rFonts w:ascii="Consolas" w:hAnsi="Consolas" w:cs="Consolas"/>
-                <w:color w:val="5A0909"/>
-                <w:sz w:val="17"/>
-                <w:szCs w:val="17"/>
-                <w:shd w:val="clear" w:color="auto" w:fill="F3EFEB"/>
-              </w:rPr>
-              <w:t xml:space="preserve">volunteer_assignments</w:t>
-            </w:r>
-          </w:p>
-        </w:tc>
-        <w:tc>
-          <w:tcPr>
-            <w:tcW w:w="5783" w:type="dxa"/>
-          </w:tcPr>
-          <w:p>
-            <w:pPr>
-              <w:spacing w:before="0" w:after="40" w:line="252" w:lineRule="auto"/>
-            </w:pPr>
-            <w:r>
-              <w:rPr>
-                <w:sz w:val="19"/>
-                <w:szCs w:val="19"/>
-              </w:rPr>
-              <w:t xml:space="preserve">Request history, donors who joined or answered, volunteers’ contact requests, who coordinates what.</w:t>
-            </w:r>
-          </w:p>
-        </w:tc>
-      </w:tr>
-      <w:tr>
-        <w:trPr>
-          <w:cantSplit/>
-        </w:trPr>
-        <w:tc>
-          <w:tcPr>
-            <w:tcW w:w="3855" w:type="dxa"/>
-          </w:tcPr>
-          <w:p>
-            <w:pPr>
-              <w:spacing w:before="0" w:after="40" w:line="252" w:lineRule="auto"/>
-            </w:pPr>
-            <w:r>
-              <w:rPr>
-                <w:rFonts w:ascii="Consolas" w:hAnsi="Consolas" w:cs="Consolas"/>
-                <w:color w:val="5A0909"/>
-                <w:sz w:val="17"/>
-                <w:szCs w:val="17"/>
-                <w:shd w:val="clear" w:color="auto" w:fill="F3EFEB"/>
-              </w:rPr>
-              <w:t xml:space="preserve">notifications</w:t>
-            </w:r>
-            <w:r>
-              <w:rPr>
-                <w:sz w:val="19"/>
-                <w:szCs w:val="19"/>
-              </w:rPr>
-              <w:t xml:space="preserve">, </w:t>
-            </w:r>
-            <w:r>
-              <w:rPr>
-                <w:rFonts w:ascii="Consolas" w:hAnsi="Consolas" w:cs="Consolas"/>
-                <w:color w:val="5A0909"/>
-                <w:sz w:val="17"/>
-                <w:szCs w:val="17"/>
-                <w:shd w:val="clear" w:color="auto" w:fill="F3EFEB"/>
-              </w:rPr>
-              <w:t xml:space="preserve">internal_notes</w:t>
-            </w:r>
-          </w:p>
-        </w:tc>
-        <w:tc>
-          <w:tcPr>
-            <w:tcW w:w="5783" w:type="dxa"/>
-          </w:tcPr>
-          <w:p>
-            <w:pPr>
-              <w:spacing w:before="0" w:after="40" w:line="252" w:lineRule="auto"/>
-            </w:pPr>
-            <w:r>
-              <w:rPr>
-                <w:sz w:val="19"/>
-                <w:szCs w:val="19"/>
-              </w:rPr>
-              <w:t xml:space="preserve">In-app notifications; staff-only notes.</w:t>
-            </w:r>
-          </w:p>
-        </w:tc>
-      </w:tr>
-      <w:tr>
-        <w:trPr>
-          <w:cantSplit/>
-        </w:trPr>
-        <w:tc>
-          <w:tcPr>
-            <w:tcW w:w="3855" w:type="dxa"/>
-          </w:tcPr>
-          <w:p>
-            <w:pPr>
-              <w:spacing w:before="0" w:after="40" w:line="252" w:lineRule="auto"/>
-            </w:pPr>
-            <w:r>
-              <w:rPr>
-                <w:rFonts w:ascii="Consolas" w:hAnsi="Consolas" w:cs="Consolas"/>
-                <w:color w:val="5A0909"/>
-                <w:sz w:val="17"/>
-                <w:szCs w:val="17"/>
-                <w:shd w:val="clear" w:color="auto" w:fill="F3EFEB"/>
-              </w:rPr>
-              <w:t xml:space="preserve">staff_roles</w:t>
-            </w:r>
-          </w:p>
-        </w:tc>
-        <w:tc>
-          <w:tcPr>
-            <w:tcW w:w="5783" w:type="dxa"/>
-          </w:tcPr>
-          <w:p>
-            <w:pPr>
-              <w:spacing w:before="0" w:after="40" w:line="252" w:lineRule="auto"/>
-            </w:pPr>
-            <w:r>
-              <w:rPr>
-                <w:sz w:val="19"/>
-                <w:szCs w:val="19"/>
-              </w:rPr>
-              <w:t xml:space="preserve">Volunteers and admins, with their permission switches.</w:t>
-            </w:r>
-          </w:p>
-        </w:tc>
-      </w:tr>
-      <w:tr>
-        <w:trPr>
-          <w:cantSplit/>
-        </w:trPr>
-        <w:tc>
-          <w:tcPr>
-            <w:tcW w:w="3855" w:type="dxa"/>
-          </w:tcPr>
-          <w:p>
-            <w:pPr>
-              <w:spacing w:before="0" w:after="40" w:line="252" w:lineRule="auto"/>
-            </w:pPr>
-            <w:r>
-              <w:rPr>
-                <w:rFonts w:ascii="Consolas" w:hAnsi="Consolas" w:cs="Consolas"/>
-                <w:color w:val="5A0909"/>
-                <w:sz w:val="17"/>
-                <w:szCs w:val="17"/>
-                <w:shd w:val="clear" w:color="auto" w:fill="F3EFEB"/>
-              </w:rPr>
-              <w:t xml:space="preserve">impact_stories</w:t>
-            </w:r>
-            <w:r>
-              <w:rPr>
-                <w:sz w:val="19"/>
-                <w:szCs w:val="19"/>
-              </w:rPr>
-              <w:t xml:space="preserve">, </w:t>
-            </w:r>
-            <w:r>
-              <w:rPr>
-                <w:rFonts w:ascii="Consolas" w:hAnsi="Consolas" w:cs="Consolas"/>
-                <w:color w:val="5A0909"/>
-                <w:sz w:val="17"/>
-                <w:szCs w:val="17"/>
-                <w:shd w:val="clear" w:color="auto" w:fill="F3EFEB"/>
-              </w:rPr>
-              <w:t xml:space="preserve">story_consents</w:t>
-            </w:r>
-            <w:r>
-              <w:rPr>
-                <w:sz w:val="19"/>
-                <w:szCs w:val="19"/>
-              </w:rPr>
-              <w:t xml:space="preserve">, </w:t>
-            </w:r>
-            <w:r>
-              <w:rPr>
-                <w:rFonts w:ascii="Consolas" w:hAnsi="Consolas" w:cs="Consolas"/>
-                <w:color w:val="5A0909"/>
-                <w:sz w:val="17"/>
-                <w:szCs w:val="17"/>
-                <w:shd w:val="clear" w:color="auto" w:fill="F3EFEB"/>
-              </w:rPr>
-              <w:t xml:space="preserve">story_verification_events</w:t>
-            </w:r>
-          </w:p>
-        </w:tc>
-        <w:tc>
-          <w:tcPr>
-            <w:tcW w:w="5783" w:type="dxa"/>
-          </w:tcPr>
-          <w:p>
-            <w:pPr>
-              <w:spacing w:before="0" w:after="40" w:line="252" w:lineRule="auto"/>
-            </w:pPr>
-            <w:r>
-              <w:rPr>
-                <w:sz w:val="19"/>
-                <w:szCs w:val="19"/>
-              </w:rPr>
-              <w:t xml:space="preserve">Stories, consent snapshots, moderation trail.</w:t>
-            </w:r>
-          </w:p>
-        </w:tc>
-      </w:tr>
-      <w:tr>
-        <w:trPr>
-          <w:cantSplit/>
-        </w:trPr>
-        <w:tc>
-          <w:tcPr>
-            <w:tcW w:w="3855" w:type="dxa"/>
-          </w:tcPr>
-          <w:p>
-            <w:pPr>
-              <w:spacing w:before="0" w:after="40" w:line="252" w:lineRule="auto"/>
-            </w:pPr>
-            <w:r>
-              <w:rPr>
-                <w:rFonts w:ascii="Consolas" w:hAnsi="Consolas" w:cs="Consolas"/>
-                <w:color w:val="5A0909"/>
-                <w:sz w:val="17"/>
-                <w:szCs w:val="17"/>
-                <w:shd w:val="clear" w:color="auto" w:fill="F3EFEB"/>
-              </w:rPr>
-              <w:t xml:space="preserve">camp_records</w:t>
-            </w:r>
-            <w:r>
-              <w:rPr>
-                <w:sz w:val="19"/>
-                <w:szCs w:val="19"/>
-              </w:rPr>
-              <w:t xml:space="preserve">, </w:t>
-            </w:r>
-            <w:r>
-              <w:rPr>
-                <w:rFonts w:ascii="Consolas" w:hAnsi="Consolas" w:cs="Consolas"/>
-                <w:color w:val="5A0909"/>
-                <w:sz w:val="17"/>
-                <w:szCs w:val="17"/>
-                <w:shd w:val="clear" w:color="auto" w:fill="F3EFEB"/>
-              </w:rPr>
-              <w:t xml:space="preserve">impact_metrics_sources</w:t>
-            </w:r>
-          </w:p>
-        </w:tc>
-        <w:tc>
-          <w:tcPr>
-            <w:tcW w:w="5783" w:type="dxa"/>
-          </w:tcPr>
-          <w:p>
-            <w:pPr>
-              <w:spacing w:before="0" w:after="40" w:line="252" w:lineRule="auto"/>
-            </w:pPr>
-            <w:r>
-              <w:rPr>
-                <w:sz w:val="19"/>
-                <w:szCs w:val="19"/>
-              </w:rPr>
-              <w:t xml:space="preserve">Camps and documented figures (each with a source and a date).</w:t>
-            </w:r>
-          </w:p>
-        </w:tc>
-      </w:tr>
-      <w:tr>
-        <w:trPr>
-          <w:cantSplit/>
-        </w:trPr>
-        <w:tc>
-          <w:tcPr>
-            <w:tcW w:w="3855" w:type="dxa"/>
-          </w:tcPr>
-          <w:p>
-            <w:pPr>
-              <w:spacing w:before="0" w:after="40" w:line="252" w:lineRule="auto"/>
-            </w:pPr>
-            <w:r>
-              <w:rPr>
-                <w:rFonts w:ascii="Consolas" w:hAnsi="Consolas" w:cs="Consolas"/>
-                <w:color w:val="5A0909"/>
-                <w:sz w:val="17"/>
-                <w:szCs w:val="17"/>
-                <w:shd w:val="clear" w:color="auto" w:fill="F3EFEB"/>
-              </w:rPr>
-              <w:t xml:space="preserve">platform_settings</w:t>
-            </w:r>
-          </w:p>
-        </w:tc>
-        <w:tc>
-          <w:tcPr>
-            <w:tcW w:w="5783" w:type="dxa"/>
-          </w:tcPr>
-          <w:p>
-            <w:pPr>
-              <w:spacing w:before="0" w:after="40" w:line="252" w:lineRule="auto"/>
-            </w:pPr>
-            <w:r>
-              <w:rPr>
-                <w:sz w:val="19"/>
-                <w:szCs w:val="19"/>
-              </w:rPr>
-              <w:t xml:space="preserve">The settings edited at Admin → Settings.</w:t>
-            </w:r>
-          </w:p>
-        </w:tc>
-      </w:tr>
-      <w:tr>
-        <w:trPr>
-          <w:cantSplit/>
-        </w:trPr>
-        <w:tc>
-          <w:tcPr>
-            <w:tcW w:w="3855" w:type="dxa"/>
-          </w:tcPr>
-          <w:p>
-            <w:pPr>
-              <w:spacing w:before="0" w:after="40" w:line="252" w:lineRule="auto"/>
-            </w:pPr>
-            <w:r>
-              <w:rPr>
-                <w:rFonts w:ascii="Consolas" w:hAnsi="Consolas" w:cs="Consolas"/>
-                <w:color w:val="5A0909"/>
-                <w:sz w:val="17"/>
-                <w:szCs w:val="17"/>
-                <w:shd w:val="clear" w:color="auto" w:fill="F3EFEB"/>
-              </w:rPr>
-              <w:t xml:space="preserve">audit_logs</w:t>
-            </w:r>
-          </w:p>
-        </w:tc>
-        <w:tc>
-          <w:tcPr>
-            <w:tcW w:w="5783" w:type="dxa"/>
-          </w:tcPr>
-          <w:p>
-            <w:pPr>
-              <w:spacing w:before="0" w:after="40" w:line="252" w:lineRule="auto"/>
-            </w:pPr>
-            <w:r>
-              <w:rPr>
-                <w:sz w:val="19"/>
-                <w:szCs w:val="19"/>
-              </w:rPr>
-              <w:t xml:space="preserve">Append-only log of privileged actions: which fields changed, never the values.</w:t>
-            </w:r>
-          </w:p>
-        </w:tc>
-      </w:tr>
-      <w:tr>
-        <w:trPr>
-          <w:cantSplit/>
-        </w:trPr>
-        <w:tc>
-          <w:tcPr>
-            <w:tcW w:w="3855" w:type="dxa"/>
-          </w:tcPr>
-          <w:p>
-            <w:pPr>
-              <w:spacing w:before="0" w:after="40" w:line="252" w:lineRule="auto"/>
-            </w:pPr>
-            <w:r>
-              <w:rPr>
-                <w:rFonts w:ascii="Consolas" w:hAnsi="Consolas" w:cs="Consolas"/>
-                <w:color w:val="5A0909"/>
-                <w:sz w:val="17"/>
-                <w:szCs w:val="17"/>
-                <w:shd w:val="clear" w:color="auto" w:fill="F3EFEB"/>
-              </w:rPr>
-              <w:t xml:space="preserve">rate_limits</w:t>
-            </w:r>
-          </w:p>
-        </w:tc>
-        <w:tc>
-          <w:tcPr>
-            <w:tcW w:w="5783" w:type="dxa"/>
-          </w:tcPr>
-          <w:p>
-            <w:pPr>
-              <w:spacing w:before="0" w:after="40" w:line="252" w:lineRule="auto"/>
-            </w:pPr>
-            <w:r>
-              <w:rPr>
-                <w:sz w:val="19"/>
-                <w:szCs w:val="19"/>
-              </w:rPr>
-              <w:t xml:space="preserve">Counters that stop abuse.</w:t>
-            </w:r>
-          </w:p>
-        </w:tc>
-      </w:tr>
-    </w:tbl>
-    <w:p>
-      <w:pPr>
-        <w:spacing w:after="80"/>
-      </w:pPr>
-    </w:p>
-    <w:p>
-      <w:r>
-        <w:rPr>
-          <w:rFonts w:ascii="Consolas" w:hAnsi="Consolas" w:cs="Consolas"/>
-          <w:color w:val="5A0909"/>
-          <w:sz w:val="19"/>
-          <w:szCs w:val="19"/>
-          <w:shd w:val="clear" w:color="auto" w:fill="F3EFEB"/>
-        </w:rPr>
-        <w:t xml:space="preserve">docs/DATABASE.md</w:t>
-      </w:r>
-      <w:r>
-        <w:rPr>
-          <w:color w:val="6B5D5A"/>
-        </w:rPr>
-        <w:t xml:space="preserve"> has the full list with each table’s protections.</w:t>
-      </w:r>
-    </w:p>
-    <w:p>
-      <w:pPr>
-        <w:pStyle w:val="Heading2"/>
-      </w:pPr>
-      <w:bookmarkStart w:id="37" w:name="s9_4"/>
-      <w:r>
-        <w:t xml:space="preserve">Migrations: the database’s history</w:t>
-      </w:r>
-      <w:bookmarkEnd w:id="37"/>
-    </w:p>
-    <w:p>
-      <w:r>
-        <w:t xml:space="preserve">A migration is a SQL file that changes the database. They run once, in the order of their names (the date at the start). Production has run all of them, which is why an applied migration must </w:t>
-      </w:r>
-      <w:r>
-        <w:rPr>
-          <w:b/>
-        </w:rPr>
-        <w:t xml:space="preserve">never be edited</w:t>
-      </w:r>
-      <w:r>
-        <w:t xml:space="preserve">: to change something, add a new migration.</w:t>
-      </w:r>
-    </w:p>
-    <w:tbl>
-      <w:tblPr>
-        <w:tblW w:w="9638" w:type="dxa"/>
-        <w:tblBorders>
-          <w:top w:val="single" w:sz="4" w:space="0" w:color="D9CFC8"/>
-          <w:left w:val="single" w:sz="4" w:space="0" w:color="D9CFC8"/>
-          <w:bottom w:val="single" w:sz="4" w:space="0" w:color="D9CFC8"/>
-          <w:right w:val="single" w:sz="4" w:space="0" w:color="D9CFC8"/>
-          <w:insideH w:val="single" w:sz="4" w:space="0" w:color="D9CFC8"/>
-          <w:insideV w:val="single" w:sz="4" w:space="0" w:color="D9CFC8"/>
-        </w:tblBorders>
-        <w:tblLayout w:type="fixed"/>
-        <w:tblCellMar>
-          <w:top w:w="70" w:type="dxa"/>
-          <w:left w:w="100" w:type="dxa"/>
-          <w:bottom w:w="40" w:type="dxa"/>
-          <w:right w:w="100" w:type="dxa"/>
-        </w:tblCellMar>
-        <w:tblLook w:val="04A0" w:firstRow="1" w:lastRow="0" w:firstColumn="0" w:lastColumn="0" w:noHBand="0" w:noVBand="1"/>
-      </w:tblPr>
-      <w:tblGrid>
-        <w:gridCol w:w="4626"/>
-        <w:gridCol w:w="5012"/>
-      </w:tblGrid>
-      <w:tr>
-        <w:trPr>
-          <w:cantSplit/>
-          <w:tblHeader/>
-        </w:trPr>
-        <w:tc>
-          <w:tcPr>
-            <w:tcW w:w="4626" w:type="dxa"/>
-            <w:shd w:val="clear" w:color="auto" w:fill="F2EAE5"/>
-          </w:tcPr>
-          <w:p>
-            <w:pPr>
-              <w:spacing w:before="0" w:after="40" w:line="252" w:lineRule="auto"/>
-            </w:pPr>
-            <w:r>
-              <w:rPr>
-                <w:b/>
-                <w:sz w:val="19"/>
-                <w:szCs w:val="19"/>
-              </w:rPr>
-              <w:t xml:space="preserve">File (</w:t>
-            </w:r>
-            <w:r>
-              <w:rPr>
-                <w:rFonts w:ascii="Consolas" w:hAnsi="Consolas" w:cs="Consolas"/>
-                <w:b/>
-                <w:color w:val="5A0909"/>
-                <w:sz w:val="17"/>
-                <w:szCs w:val="17"/>
-                <w:shd w:val="clear" w:color="auto" w:fill="F3EFEB"/>
-              </w:rPr>
-              <w:t xml:space="preserve">supabase/migrations/</w:t>
-            </w:r>
-            <w:r>
-              <w:rPr>
-                <w:b/>
-                <w:sz w:val="19"/>
-                <w:szCs w:val="19"/>
-              </w:rPr>
-              <w:t xml:space="preserve">)</w:t>
-            </w:r>
-          </w:p>
-        </w:tc>
-        <w:tc>
-          <w:tcPr>
-            <w:tcW w:w="5012" w:type="dxa"/>
-            <w:shd w:val="clear" w:color="auto" w:fill="F2EAE5"/>
-          </w:tcPr>
-          <w:p>
-            <w:pPr>
-              <w:spacing w:before="0" w:after="40" w:line="252" w:lineRule="auto"/>
-            </w:pPr>
-            <w:r>
-              <w:rPr>
-                <w:b/>
-                <w:sz w:val="19"/>
-                <w:szCs w:val="19"/>
-              </w:rPr>
-              <w:t xml:space="preserve">What it does</w:t>
-            </w:r>
-          </w:p>
-        </w:tc>
-      </w:tr>
-      <w:tr>
-        <w:trPr>
-          <w:cantSplit/>
-        </w:trPr>
-        <w:tc>
-          <w:tcPr>
-            <w:tcW w:w="4626" w:type="dxa"/>
-          </w:tcPr>
-          <w:p>
-            <w:pPr>
-              <w:spacing w:before="0" w:after="40" w:line="252" w:lineRule="auto"/>
-            </w:pPr>
-            <w:r>
-              <w:rPr>
-                <w:rFonts w:ascii="Consolas" w:hAnsi="Consolas" w:cs="Consolas"/>
-                <w:color w:val="5A0909"/>
-                <w:sz w:val="17"/>
-                <w:szCs w:val="17"/>
-                <w:shd w:val="clear" w:color="auto" w:fill="F3EFEB"/>
-              </w:rPr>
-              <w:t xml:space="preserve">20261011000100_foundation.sql</w:t>
-            </w:r>
-          </w:p>
-        </w:tc>
-        <w:tc>
-          <w:tcPr>
-            <w:tcW w:w="5012" w:type="dxa"/>
-          </w:tcPr>
-          <w:p>
-            <w:pPr>
-              <w:spacing w:before="0" w:after="40" w:line="252" w:lineRule="auto"/>
-            </w:pPr>
-            <w:r>
-              <w:rPr>
-                <w:sz w:val="19"/>
-                <w:szCs w:val="19"/>
-              </w:rPr>
-              <w:t xml:space="preserve">Core tables, role helpers, guard triggers, audit log, rate limits, sign-up trigger, RLS policies.</w:t>
-            </w:r>
-          </w:p>
-        </w:tc>
-      </w:tr>
-      <w:tr>
-        <w:trPr>
-          <w:cantSplit/>
-        </w:trPr>
-        <w:tc>
-          <w:tcPr>
-            <w:tcW w:w="4626" w:type="dxa"/>
-          </w:tcPr>
-          <w:p>
-            <w:pPr>
-              <w:spacing w:before="0" w:after="40" w:line="252" w:lineRule="auto"/>
-            </w:pPr>
-            <w:r>
-              <w:rPr>
-                <w:rFonts w:ascii="Consolas" w:hAnsi="Consolas" w:cs="Consolas"/>
-                <w:color w:val="5A0909"/>
-                <w:sz w:val="17"/>
-                <w:szCs w:val="17"/>
-                <w:shd w:val="clear" w:color="auto" w:fill="F3EFEB"/>
-              </w:rPr>
-              <w:t xml:space="preserve">20261011000200_coordination.sql</w:t>
-            </w:r>
-          </w:p>
-        </w:tc>
-        <w:tc>
-          <w:tcPr>
-            <w:tcW w:w="5012" w:type="dxa"/>
-          </w:tcPr>
-          <w:p>
-            <w:pPr>
-              <w:spacing w:before="0" w:after="40" w:line="252" w:lineRule="auto"/>
-            </w:pPr>
-            <w:r>
-              <w:rPr>
-                <w:sz w:val="19"/>
-                <w:szCs w:val="19"/>
-              </w:rPr>
-              <w:t xml:space="preserve">Donation summary and verification, profile verification, request lifecycle, matching, directory search, consent-checked contact, analytics, retention.</w:t>
-            </w:r>
-          </w:p>
-        </w:tc>
-      </w:tr>
-      <w:tr>
-        <w:trPr>
-          <w:cantSplit/>
-        </w:trPr>
-        <w:tc>
-          <w:tcPr>
-            <w:tcW w:w="4626" w:type="dxa"/>
-          </w:tcPr>
-          <w:p>
-            <w:pPr>
-              <w:spacing w:before="0" w:after="40" w:line="252" w:lineRule="auto"/>
-            </w:pPr>
-            <w:r>
-              <w:rPr>
-                <w:rFonts w:ascii="Consolas" w:hAnsi="Consolas" w:cs="Consolas"/>
-                <w:color w:val="5A0909"/>
-                <w:sz w:val="17"/>
-                <w:szCs w:val="17"/>
-                <w:shd w:val="clear" w:color="auto" w:fill="F3EFEB"/>
-              </w:rPr>
-              <w:t xml:space="preserve">20261011000300_impact_stories.sql</w:t>
-            </w:r>
-          </w:p>
-        </w:tc>
-        <w:tc>
-          <w:tcPr>
-            <w:tcW w:w="5012" w:type="dxa"/>
-          </w:tcPr>
-          <w:p>
-            <w:pPr>
-              <w:spacing w:before="0" w:after="40" w:line="252" w:lineRule="auto"/>
-            </w:pPr>
-            <w:r>
-              <w:rPr>
-                <w:sz w:val="19"/>
-                <w:szCs w:val="19"/>
-              </w:rPr>
-              <w:t xml:space="preserve">Stories, consents, moderation, camps, documented figures, public impact figures, account anonymisation.</w:t>
-            </w:r>
-          </w:p>
-        </w:tc>
-      </w:tr>
-      <w:tr>
-        <w:trPr>
-          <w:cantSplit/>
-        </w:trPr>
-        <w:tc>
-          <w:tcPr>
-            <w:tcW w:w="4626" w:type="dxa"/>
-          </w:tcPr>
-          <w:p>
-            <w:pPr>
-              <w:spacing w:before="0" w:after="40" w:line="252" w:lineRule="auto"/>
-            </w:pPr>
-            <w:r>
-              <w:rPr>
-                <w:rFonts w:ascii="Consolas" w:hAnsi="Consolas" w:cs="Consolas"/>
-                <w:color w:val="5A0909"/>
-                <w:sz w:val="17"/>
-                <w:szCs w:val="17"/>
-                <w:shd w:val="clear" w:color="auto" w:fill="F3EFEB"/>
-              </w:rPr>
-              <w:t xml:space="preserve">20261011000400_storage.sql</w:t>
-            </w:r>
-          </w:p>
-        </w:tc>
-        <w:tc>
-          <w:tcPr>
-            <w:tcW w:w="5012" w:type="dxa"/>
-          </w:tcPr>
-          <w:p>
-            <w:pPr>
-              <w:spacing w:before="0" w:after="40" w:line="252" w:lineRule="auto"/>
-            </w:pPr>
-            <w:r>
-              <w:rPr>
-                <w:sz w:val="19"/>
-                <w:szCs w:val="19"/>
-              </w:rPr>
-              <w:t xml:space="preserve">Photo buckets and their rules.</w:t>
-            </w:r>
-          </w:p>
-        </w:tc>
-      </w:tr>
-      <w:tr>
-        <w:trPr>
-          <w:cantSplit/>
-        </w:trPr>
-        <w:tc>
-          <w:tcPr>
-            <w:tcW w:w="4626" w:type="dxa"/>
-          </w:tcPr>
-          <w:p>
-            <w:pPr>
-              <w:spacing w:before="0" w:after="40" w:line="252" w:lineRule="auto"/>
-            </w:pPr>
-            <w:r>
-              <w:rPr>
-                <w:rFonts w:ascii="Consolas" w:hAnsi="Consolas" w:cs="Consolas"/>
-                <w:color w:val="5A0909"/>
-                <w:sz w:val="17"/>
-                <w:szCs w:val="17"/>
-                <w:shd w:val="clear" w:color="auto" w:fill="F3EFEB"/>
-              </w:rPr>
-              <w:t xml:space="preserve">20261011000500_default_settings.sql</w:t>
-            </w:r>
-          </w:p>
-        </w:tc>
-        <w:tc>
-          <w:tcPr>
-            <w:tcW w:w="5012" w:type="dxa"/>
-          </w:tcPr>
-          <w:p>
-            <w:pPr>
-              <w:spacing w:before="0" w:after="40" w:line="252" w:lineRule="auto"/>
-            </w:pPr>
-            <w:r>
-              <w:rPr>
-                <w:sz w:val="19"/>
-                <w:szCs w:val="19"/>
-              </w:rPr>
-              <w:t xml:space="preserve">Default settings (contacts stay empty until set in Admin).</w:t>
-            </w:r>
-          </w:p>
-        </w:tc>
-      </w:tr>
-      <w:tr>
-        <w:trPr>
-          <w:cantSplit/>
-        </w:trPr>
-        <w:tc>
-          <w:tcPr>
-            <w:tcW w:w="4626" w:type="dxa"/>
-          </w:tcPr>
-          <w:p>
-            <w:pPr>
-              <w:spacing w:before="0" w:after="40" w:line="252" w:lineRule="auto"/>
-            </w:pPr>
-            <w:r>
-              <w:rPr>
-                <w:rFonts w:ascii="Consolas" w:hAnsi="Consolas" w:cs="Consolas"/>
-                <w:color w:val="5A0909"/>
-                <w:sz w:val="17"/>
-                <w:szCs w:val="17"/>
-                <w:shd w:val="clear" w:color="auto" w:fill="F3EFEB"/>
-              </w:rPr>
-              <w:t xml:space="preserve">20261011000600_audit_actor_deletion.sql</w:t>
-            </w:r>
-          </w:p>
-        </w:tc>
-        <w:tc>
-          <w:tcPr>
-            <w:tcW w:w="5012" w:type="dxa"/>
-          </w:tcPr>
-          <w:p>
-            <w:pPr>
-              <w:spacing w:before="0" w:after="40" w:line="252" w:lineRule="auto"/>
-            </w:pPr>
-            <w:r>
-              <w:rPr>
-                <w:sz w:val="19"/>
-                <w:szCs w:val="19"/>
-              </w:rPr>
-              <w:t xml:space="preserve">Lets account deletion keep the audit history.</w:t>
-            </w:r>
-          </w:p>
-        </w:tc>
-      </w:tr>
-      <w:tr>
-        <w:trPr>
-          <w:cantSplit/>
-        </w:trPr>
-        <w:tc>
-          <w:tcPr>
-            <w:tcW w:w="4626" w:type="dxa"/>
-          </w:tcPr>
-          <w:p>
-            <w:pPr>
-              <w:spacing w:before="0" w:after="40" w:line="252" w:lineRule="auto"/>
-            </w:pPr>
-            <w:r>
-              <w:rPr>
-                <w:rFonts w:ascii="Consolas" w:hAnsi="Consolas" w:cs="Consolas"/>
-                <w:color w:val="5A0909"/>
-                <w:sz w:val="17"/>
-                <w:szCs w:val="17"/>
-                <w:shd w:val="clear" w:color="auto" w:fill="F3EFEB"/>
-              </w:rPr>
-              <w:t xml:space="preserve">20261011000700_member_bootstrap_backfill.sql</w:t>
-            </w:r>
-          </w:p>
-        </w:tc>
-        <w:tc>
-          <w:tcPr>
-            <w:tcW w:w="5012" w:type="dxa"/>
-          </w:tcPr>
-          <w:p>
-            <w:pPr>
-              <w:spacing w:before="0" w:after="40" w:line="252" w:lineRule="auto"/>
-            </w:pPr>
-            <w:r>
-              <w:rPr>
-                <w:sz w:val="19"/>
-                <w:szCs w:val="19"/>
-              </w:rPr>
-              <w:t xml:space="preserve">Creates the member profile from the sign-up details.</w:t>
-            </w:r>
-          </w:p>
-        </w:tc>
-      </w:tr>
-      <w:tr>
-        <w:trPr>
-          <w:cantSplit/>
-        </w:trPr>
-        <w:tc>
-          <w:tcPr>
-            <w:tcW w:w="4626" w:type="dxa"/>
-          </w:tcPr>
-          <w:p>
-            <w:pPr>
-              <w:spacing w:before="0" w:after="40" w:line="252" w:lineRule="auto"/>
-            </w:pPr>
-            <w:r>
-              <w:rPr>
-                <w:rFonts w:ascii="Consolas" w:hAnsi="Consolas" w:cs="Consolas"/>
-                <w:color w:val="5A0909"/>
-                <w:sz w:val="17"/>
-                <w:szCs w:val="17"/>
-                <w:shd w:val="clear" w:color="auto" w:fill="F3EFEB"/>
-              </w:rPr>
-              <w:t xml:space="preserve">20261011000800_email_verification_and_admin_edits.sql</w:t>
-            </w:r>
-          </w:p>
-        </w:tc>
-        <w:tc>
-          <w:tcPr>
-            <w:tcW w:w="5012" w:type="dxa"/>
-          </w:tcPr>
-          <w:p>
-            <w:pPr>
-              <w:spacing w:before="0" w:after="40" w:line="252" w:lineRule="auto"/>
-            </w:pPr>
-            <w:r>
-              <w:rPr>
-                <w:sz w:val="19"/>
-                <w:szCs w:val="19"/>
-              </w:rPr>
-              <w:t xml:space="preserve">Donors verified on email confirmation; donor bio; admins can correct a donor’s area.</w:t>
-            </w:r>
-          </w:p>
-        </w:tc>
-      </w:tr>
-      <w:tr>
-        <w:trPr>
-          <w:cantSplit/>
-        </w:trPr>
-        <w:tc>
-          <w:tcPr>
-            <w:tcW w:w="4626" w:type="dxa"/>
-          </w:tcPr>
-          <w:p>
-            <w:pPr>
-              <w:spacing w:before="0" w:after="40" w:line="252" w:lineRule="auto"/>
-            </w:pPr>
-            <w:r>
-              <w:rPr>
-                <w:rFonts w:ascii="Consolas" w:hAnsi="Consolas" w:cs="Consolas"/>
-                <w:color w:val="5A0909"/>
-                <w:sz w:val="17"/>
-                <w:szCs w:val="17"/>
-                <w:shd w:val="clear" w:color="auto" w:fill="F3EFEB"/>
-              </w:rPr>
-              <w:t xml:space="preserve">20261011000900_name_privacy_photos_data_checks.sql</w:t>
-            </w:r>
-          </w:p>
-        </w:tc>
-        <w:tc>
-          <w:tcPr>
-            <w:tcW w:w="5012" w:type="dxa"/>
-          </w:tcPr>
-          <w:p>
-            <w:pPr>
-              <w:spacing w:before="0" w:after="40" w:line="252" w:lineRule="auto"/>
-            </w:pPr>
-            <w:r>
-              <w:rPr>
-                <w:sz w:val="19"/>
-                <w:szCs w:val="19"/>
-              </w:rPr>
-              <w:t xml:space="preserve">Display names or “Donor #XXXX” for volunteers, admin-only photos, data checks.</w:t>
-            </w:r>
-          </w:p>
-        </w:tc>
-      </w:tr>
-      <w:tr>
-        <w:trPr>
-          <w:cantSplit/>
-        </w:trPr>
-        <w:tc>
-          <w:tcPr>
-            <w:tcW w:w="4626" w:type="dxa"/>
-          </w:tcPr>
-          <w:p>
-            <w:pPr>
-              <w:spacing w:before="0" w:after="40" w:line="252" w:lineRule="auto"/>
-            </w:pPr>
-            <w:r>
-              <w:rPr>
-                <w:rFonts w:ascii="Consolas" w:hAnsi="Consolas" w:cs="Consolas"/>
-                <w:color w:val="5A0909"/>
-                <w:sz w:val="17"/>
-                <w:szCs w:val="17"/>
-                <w:shd w:val="clear" w:color="auto" w:fill="F3EFEB"/>
-              </w:rPr>
-              <w:t xml:space="preserve">20261015000100_bombay_blood_group.sql</w:t>
-            </w:r>
-          </w:p>
-        </w:tc>
-        <w:tc>
-          <w:tcPr>
-            <w:tcW w:w="5012" w:type="dxa"/>
-          </w:tcPr>
-          <w:p>
-            <w:pPr>
-              <w:spacing w:before="0" w:after="40" w:line="252" w:lineRule="auto"/>
-            </w:pPr>
-            <w:r>
-              <w:rPr>
-                <w:sz w:val="19"/>
-                <w:szCs w:val="19"/>
-              </w:rPr>
-              <w:t xml:space="preserve">Adds the Bombay blood group “Oh” (exact match only).</w:t>
-            </w:r>
-          </w:p>
-        </w:tc>
-      </w:tr>
-      <w:tr>
-        <w:trPr>
-          <w:cantSplit/>
-        </w:trPr>
-        <w:tc>
-          <w:tcPr>
-            <w:tcW w:w="4626" w:type="dxa"/>
-          </w:tcPr>
-          <w:p>
-            <w:pPr>
-              <w:spacing w:before="0" w:after="40" w:line="252" w:lineRule="auto"/>
-            </w:pPr>
-            <w:r>
-              <w:rPr>
-                <w:rFonts w:ascii="Consolas" w:hAnsi="Consolas" w:cs="Consolas"/>
-                <w:color w:val="5A0909"/>
-                <w:sz w:val="17"/>
-                <w:szCs w:val="17"/>
-                <w:shd w:val="clear" w:color="auto" w:fill="F3EFEB"/>
-              </w:rPr>
-              <w:t xml:space="preserve">20261016000100_record_editing.sql</w:t>
-            </w:r>
-          </w:p>
-        </w:tc>
-        <w:tc>
-          <w:tcPr>
-            <w:tcW w:w="5012" w:type="dxa"/>
-          </w:tcPr>
-          <w:p>
-            <w:pPr>
-              <w:spacing w:before="0" w:after="40" w:line="252" w:lineRule="auto"/>
-            </w:pPr>
-            <w:r>
-              <w:rPr>
-                <w:sz w:val="19"/>
-                <w:szCs w:val="19"/>
-              </w:rPr>
-              <w:t xml:space="preserve">Editing and removing donation records (donor, volunteer and admin rules), admin deletion of requests and stories, auditing of edits.</w:t>
-            </w:r>
-          </w:p>
-        </w:tc>
-      </w:tr>
-      <w:tr>
-        <w:trPr>
-          <w:cantSplit/>
-        </w:trPr>
-        <w:tc>
-          <w:tcPr>
-            <w:tcW w:w="4626" w:type="dxa"/>
-          </w:tcPr>
-          <w:p>
-            <w:pPr>
-              <w:spacing w:before="0" w:after="40" w:line="252" w:lineRule="auto"/>
-            </w:pPr>
-            <w:r>
-              <w:rPr>
-                <w:rFonts w:ascii="Consolas" w:hAnsi="Consolas" w:cs="Consolas"/>
-                <w:color w:val="5A0909"/>
-                <w:sz w:val="17"/>
-                <w:szCs w:val="17"/>
-                <w:shd w:val="clear" w:color="auto" w:fill="F3EFEB"/>
-              </w:rPr>
-              <w:t xml:space="preserve">20261018000100_patient_donor_contact.sql</w:t>
-            </w:r>
-          </w:p>
-        </w:tc>
-        <w:tc>
-          <w:tcPr>
-            <w:tcW w:w="5012" w:type="dxa"/>
-          </w:tcPr>
-          <w:p>
-            <w:pPr>
-              <w:spacing w:before="0" w:after="40" w:line="252" w:lineRule="auto"/>
-            </w:pPr>
-            <w:r>
-              <w:rPr>
-                <w:sz w:val="19"/>
-                <w:szCs w:val="19"/>
-              </w:rPr>
-              <w:t xml:space="preserve">Requests need an account and the patient’s details; Hide my number; who can give now (from donation dates); the family’s donor list and opening one contact at a time; donors joining requests; the new limits.</w:t>
             </w:r>
           </w:p>
         </w:tc>
@@ -22105,6 +20235,2162 @@
                 <w:b/>
                 <w:color w:val="1D7442"/>
               </w:rPr>
+              <w:t xml:space="preserve">Rakt Mitra</w:t>
+            </w:r>
+          </w:p>
+          <w:p>
+            <w:pPr>
+              <w:spacing w:before="0" w:after="60"/>
+            </w:pPr>
+            <w:r>
+              <w:t xml:space="preserve">On the site, volunteers are called </w:t>
+            </w:r>
+            <w:r>
+              <w:rPr>
+                <w:b/>
+              </w:rPr>
+              <w:t xml:space="preserve">Rakt Mitras</w:t>
+            </w:r>
+            <w:r>
+              <w:t xml:space="preserve"> (“blood friends”; plural Rakt Mitras, Hindi रक्त मित्र). The code and the database keep the word “volunteer”: the address </w:t>
+            </w:r>
+            <w:r>
+              <w:rPr>
+                <w:rFonts w:ascii="Consolas" w:hAnsi="Consolas" w:cs="Consolas"/>
+                <w:color w:val="5A0909"/>
+                <w:sz w:val="19"/>
+                <w:szCs w:val="19"/>
+                <w:shd w:val="clear" w:color="auto" w:fill="F3EFEB"/>
+              </w:rPr>
+              <w:t xml:space="preserve">/volunteer</w:t>
+            </w:r>
+            <w:r>
+              <w:t xml:space="preserve">, the role value </w:t>
+            </w:r>
+            <w:r>
+              <w:rPr>
+                <w:rFonts w:ascii="Consolas" w:hAnsi="Consolas" w:cs="Consolas"/>
+                <w:color w:val="5A0909"/>
+                <w:sz w:val="19"/>
+                <w:szCs w:val="19"/>
+                <w:shd w:val="clear" w:color="auto" w:fill="F3EFEB"/>
+              </w:rPr>
+              <w:t xml:space="preserve">volunteer</w:t>
+            </w:r>
+            <w:r>
+              <w:t xml:space="preserve">, </w:t>
+            </w:r>
+            <w:r>
+              <w:rPr>
+                <w:rFonts w:ascii="Consolas" w:hAnsi="Consolas" w:cs="Consolas"/>
+                <w:color w:val="5A0909"/>
+                <w:sz w:val="19"/>
+                <w:szCs w:val="19"/>
+                <w:shd w:val="clear" w:color="auto" w:fill="F3EFEB"/>
+              </w:rPr>
+              <w:t xml:space="preserve">volunteer_assignments</w:t>
+            </w:r>
+            <w:r>
+              <w:t xml:space="preserve">, and messages written by database functions. </w:t>
+            </w:r>
+            <w:r>
+              <w:rPr>
+                <w:rFonts w:ascii="Consolas" w:hAnsi="Consolas" w:cs="Consolas"/>
+                <w:color w:val="5A0909"/>
+                <w:sz w:val="19"/>
+                <w:szCs w:val="19"/>
+                <w:shd w:val="clear" w:color="auto" w:fill="F3EFEB"/>
+              </w:rPr>
+              <w:t xml:space="preserve">translate()</w:t>
+            </w:r>
+            <w:r>
+              <w:t xml:space="preserve"> shows those messages with “Rakt Mitra” (</w:t>
+            </w:r>
+            <w:r>
+              <w:rPr>
+                <w:rFonts w:ascii="Consolas" w:hAnsi="Consolas" w:cs="Consolas"/>
+                <w:color w:val="5A0909"/>
+                <w:sz w:val="19"/>
+                <w:szCs w:val="19"/>
+                <w:shd w:val="clear" w:color="auto" w:fill="F3EFEB"/>
+              </w:rPr>
+              <w:t xml:space="preserve">src/i18n/terms.ts</w:t>
+            </w:r>
+            <w:r>
+              <w:t xml:space="preserve">), so new text can simply say Rakt Mitra.</w:t>
+            </w:r>
+          </w:p>
+        </w:tc>
+      </w:tr>
+    </w:tbl>
+    <w:p>
+      <w:pPr>
+        <w:spacing w:after="80"/>
+      </w:pPr>
+    </w:p>
+    <w:p>
+      <w:r>
+        <w:t xml:space="preserve">These rules live in the database itself, not just in the website:</w:t>
+      </w:r>
+    </w:p>
+    <w:p>
+      <w:pPr>
+        <w:pStyle w:val="ListParagraph"/>
+        <w:numPr>
+          <w:ilvl w:val="0"/>
+          <w:numId w:val="1"/>
+        </w:numPr>
+        <w:spacing w:after="60"/>
+      </w:pPr>
+      <w:r>
+        <w:rPr>
+          <w:b/>
+        </w:rPr>
+        <w:t xml:space="preserve">Row Level Security (RLS) policies:</w:t>
+      </w:r>
+      <w:r>
+        <w:t xml:space="preserve"> per-table rules, e.g. “a donor reads only their own records”.</w:t>
+      </w:r>
+    </w:p>
+    <w:p>
+      <w:pPr>
+        <w:pStyle w:val="ListParagraph"/>
+        <w:numPr>
+          <w:ilvl w:val="0"/>
+          <w:numId w:val="1"/>
+        </w:numPr>
+        <w:spacing w:after="60"/>
+      </w:pPr>
+      <w:r>
+        <w:rPr>
+          <w:b/>
+        </w:rPr>
+        <w:t xml:space="preserve">Guard triggers:</w:t>
+      </w:r>
+      <w:r>
+        <w:t xml:space="preserve"> checks on every change, e.g. donors can’t mark their own donation as verified.</w:t>
+      </w:r>
+    </w:p>
+    <w:p>
+      <w:pPr>
+        <w:pStyle w:val="ListParagraph"/>
+        <w:numPr>
+          <w:ilvl w:val="0"/>
+          <w:numId w:val="1"/>
+        </w:numPr>
+        <w:spacing w:after="60"/>
+      </w:pPr>
+      <w:r>
+        <w:rPr>
+          <w:b/>
+        </w:rPr>
+        <w:t xml:space="preserve">Database functions (RPCs):</w:t>
+      </w:r>
+      <w:r>
+        <w:t xml:space="preserve"> actions with their own checks, e.g. </w:t>
+      </w:r>
+      <w:r>
+        <w:rPr>
+          <w:rFonts w:ascii="Consolas" w:hAnsi="Consolas" w:cs="Consolas"/>
+          <w:color w:val="5A0909"/>
+          <w:sz w:val="19"/>
+          <w:szCs w:val="19"/>
+          <w:shd w:val="clear" w:color="auto" w:fill="F3EFEB"/>
+        </w:rPr>
+        <w:t xml:space="preserve">verify_donation_record</w:t>
+      </w:r>
+      <w:r>
+        <w:t xml:space="preserve">, </w:t>
+      </w:r>
+      <w:r>
+        <w:rPr>
+          <w:rFonts w:ascii="Consolas" w:hAnsi="Consolas" w:cs="Consolas"/>
+          <w:color w:val="5A0909"/>
+          <w:sz w:val="19"/>
+          <w:szCs w:val="19"/>
+          <w:shd w:val="clear" w:color="auto" w:fill="F3EFEB"/>
+        </w:rPr>
+        <w:t xml:space="preserve">reveal_donor_contact</w:t>
+      </w:r>
+      <w:r>
+        <w:t xml:space="preserve">, </w:t>
+      </w:r>
+      <w:r>
+        <w:rPr>
+          <w:rFonts w:ascii="Consolas" w:hAnsi="Consolas" w:cs="Consolas"/>
+          <w:color w:val="5A0909"/>
+          <w:sz w:val="19"/>
+          <w:szCs w:val="19"/>
+          <w:shd w:val="clear" w:color="auto" w:fill="F3EFEB"/>
+        </w:rPr>
+        <w:t xml:space="preserve">reveal_donor_contact_to_requester</w:t>
+      </w:r>
+      <w:r>
+        <w:t xml:space="preserve">, </w:t>
+      </w:r>
+      <w:r>
+        <w:rPr>
+          <w:rFonts w:ascii="Consolas" w:hAnsi="Consolas" w:cs="Consolas"/>
+          <w:color w:val="5A0909"/>
+          <w:sz w:val="19"/>
+          <w:szCs w:val="19"/>
+          <w:shd w:val="clear" w:color="auto" w:fill="F3EFEB"/>
+        </w:rPr>
+        <w:t xml:space="preserve">admin_delete_blood_request</w:t>
+      </w:r>
+      <w:r>
+        <w:t xml:space="preserve">.</w:t>
+      </w:r>
+    </w:p>
+    <w:p>
+      <w:pPr>
+        <w:pStyle w:val="ListParagraph"/>
+        <w:numPr>
+          <w:ilvl w:val="0"/>
+          <w:numId w:val="1"/>
+        </w:numPr>
+        <w:spacing w:after="60"/>
+      </w:pPr>
+      <w:r>
+        <w:t xml:space="preserve">The helpers </w:t>
+      </w:r>
+      <w:r>
+        <w:rPr>
+          <w:rFonts w:ascii="Consolas" w:hAnsi="Consolas" w:cs="Consolas"/>
+          <w:color w:val="5A0909"/>
+          <w:sz w:val="19"/>
+          <w:szCs w:val="19"/>
+          <w:shd w:val="clear" w:color="auto" w:fill="F3EFEB"/>
+        </w:rPr>
+        <w:t xml:space="preserve">is_admin()</w:t>
+      </w:r>
+      <w:r>
+        <w:t xml:space="preserve">, </w:t>
+      </w:r>
+      <w:r>
+        <w:rPr>
+          <w:rFonts w:ascii="Consolas" w:hAnsi="Consolas" w:cs="Consolas"/>
+          <w:color w:val="5A0909"/>
+          <w:sz w:val="19"/>
+          <w:szCs w:val="19"/>
+          <w:shd w:val="clear" w:color="auto" w:fill="F3EFEB"/>
+        </w:rPr>
+        <w:t xml:space="preserve">is_staff()</w:t>
+      </w:r>
+      <w:r>
+        <w:t xml:space="preserve"> and </w:t>
+      </w:r>
+      <w:r>
+        <w:rPr>
+          <w:rFonts w:ascii="Consolas" w:hAnsi="Consolas" w:cs="Consolas"/>
+          <w:color w:val="5A0909"/>
+          <w:sz w:val="19"/>
+          <w:szCs w:val="19"/>
+          <w:shd w:val="clear" w:color="auto" w:fill="F3EFEB"/>
+        </w:rPr>
+        <w:t xml:space="preserve">staff_can('verify_donations')</w:t>
+      </w:r>
+      <w:r>
+        <w:t xml:space="preserve"> are used inside all of these.</w:t>
+      </w:r>
+    </w:p>
+    <w:p>
+      <w:pPr>
+        <w:pStyle w:val="Heading2"/>
+      </w:pPr>
+      <w:bookmarkStart w:id="35" w:name="s9_2b"/>
+      <w:r>
+        <w:t xml:space="preserve">Blood requests: who sees what</w:t>
+      </w:r>
+      <w:bookmarkEnd w:id="35"/>
+    </w:p>
+    <w:tbl>
+      <w:tblPr>
+        <w:tblW w:w="9638" w:type="dxa"/>
+        <w:tblBorders>
+          <w:top w:val="single" w:sz="4" w:space="0" w:color="D9CFC8"/>
+          <w:left w:val="single" w:sz="4" w:space="0" w:color="D9CFC8"/>
+          <w:bottom w:val="single" w:sz="4" w:space="0" w:color="D9CFC8"/>
+          <w:right w:val="single" w:sz="4" w:space="0" w:color="D9CFC8"/>
+          <w:insideH w:val="single" w:sz="4" w:space="0" w:color="D9CFC8"/>
+          <w:insideV w:val="single" w:sz="4" w:space="0" w:color="D9CFC8"/>
+        </w:tblBorders>
+        <w:tblLayout w:type="fixed"/>
+        <w:tblCellMar>
+          <w:top w:w="70" w:type="dxa"/>
+          <w:left w:w="100" w:type="dxa"/>
+          <w:bottom w:w="40" w:type="dxa"/>
+          <w:right w:w="100" w:type="dxa"/>
+        </w:tblCellMar>
+        <w:tblLook w:val="04A0" w:firstRow="1" w:lastRow="0" w:firstColumn="0" w:lastColumn="0" w:noHBand="0" w:noVBand="1"/>
+      </w:tblPr>
+      <w:tblGrid>
+        <w:gridCol w:w="2699"/>
+        <w:gridCol w:w="6939"/>
+      </w:tblGrid>
+      <w:tr>
+        <w:trPr>
+          <w:cantSplit/>
+          <w:tblHeader/>
+        </w:trPr>
+        <w:tc>
+          <w:tcPr>
+            <w:tcW w:w="2699" w:type="dxa"/>
+            <w:shd w:val="clear" w:color="auto" w:fill="F2EAE5"/>
+          </w:tcPr>
+          <w:p>
+            <w:pPr>
+              <w:spacing w:before="0" w:after="40" w:line="252" w:lineRule="auto"/>
+            </w:pPr>
+            <w:r>
+              <w:rPr>
+                <w:b/>
+                <w:sz w:val="19"/>
+                <w:szCs w:val="19"/>
+              </w:rPr>
+              <w:t xml:space="preserve">Who</w:t>
+            </w:r>
+          </w:p>
+        </w:tc>
+        <w:tc>
+          <w:tcPr>
+            <w:tcW w:w="6939" w:type="dxa"/>
+            <w:shd w:val="clear" w:color="auto" w:fill="F2EAE5"/>
+          </w:tcPr>
+          <w:p>
+            <w:pPr>
+              <w:spacing w:before="0" w:after="40" w:line="252" w:lineRule="auto"/>
+            </w:pPr>
+            <w:r>
+              <w:rPr>
+                <w:b/>
+                <w:sz w:val="19"/>
+                <w:szCs w:val="19"/>
+              </w:rPr>
+              <w:t xml:space="preserve">Sees</w:t>
+            </w:r>
+          </w:p>
+        </w:tc>
+      </w:tr>
+      <w:tr>
+        <w:trPr>
+          <w:cantSplit/>
+        </w:trPr>
+        <w:tc>
+          <w:tcPr>
+            <w:tcW w:w="2699" w:type="dxa"/>
+          </w:tcPr>
+          <w:p>
+            <w:pPr>
+              <w:spacing w:before="0" w:after="40" w:line="252" w:lineRule="auto"/>
+            </w:pPr>
+            <w:r>
+              <w:rPr>
+                <w:sz w:val="19"/>
+                <w:szCs w:val="19"/>
+              </w:rPr>
+              <w:t xml:space="preserve">Anyone (Find blood)</w:t>
+            </w:r>
+          </w:p>
+        </w:tc>
+        <w:tc>
+          <w:tcPr>
+            <w:tcW w:w="6939" w:type="dxa"/>
+          </w:tcPr>
+          <w:p>
+            <w:pPr>
+              <w:spacing w:before="0" w:after="40" w:line="252" w:lineRule="auto"/>
+            </w:pPr>
+            <w:r>
+              <w:rPr>
+                <w:sz w:val="19"/>
+                <w:szCs w:val="19"/>
+              </w:rPr>
+              <w:t xml:space="preserve">Blood group, what is needed, units, hospital, city, needed by and urgency. Never the patient’s name or a phone number.</w:t>
+            </w:r>
+          </w:p>
+        </w:tc>
+      </w:tr>
+      <w:tr>
+        <w:trPr>
+          <w:cantSplit/>
+        </w:trPr>
+        <w:tc>
+          <w:tcPr>
+            <w:tcW w:w="2699" w:type="dxa"/>
+          </w:tcPr>
+          <w:p>
+            <w:pPr>
+              <w:spacing w:before="0" w:after="40" w:line="252" w:lineRule="auto"/>
+            </w:pPr>
+            <w:r>
+              <w:rPr>
+                <w:sz w:val="19"/>
+                <w:szCs w:val="19"/>
+              </w:rPr>
+              <w:t xml:space="preserve">The family that made the request</w:t>
+            </w:r>
+          </w:p>
+        </w:tc>
+        <w:tc>
+          <w:tcPr>
+            <w:tcW w:w="6939" w:type="dxa"/>
+          </w:tcPr>
+          <w:p>
+            <w:pPr>
+              <w:spacing w:before="0" w:after="40" w:line="252" w:lineRule="auto"/>
+            </w:pPr>
+            <w:r>
+              <w:rPr>
+                <w:sz w:val="19"/>
+                <w:szCs w:val="19"/>
+              </w:rPr>
+              <w:t xml:space="preserve">Everything they entered. Once a volunteer verifies it: donors who joined, then up to 30 donors who can give now. They open one donor’s contact at a time, on the channel that donor chose (logged; 15 an hour, 40 different donors in 30 days).</w:t>
+            </w:r>
+          </w:p>
+        </w:tc>
+      </w:tr>
+      <w:tr>
+        <w:trPr>
+          <w:cantSplit/>
+        </w:trPr>
+        <w:tc>
+          <w:tcPr>
+            <w:tcW w:w="2699" w:type="dxa"/>
+          </w:tcPr>
+          <w:p>
+            <w:pPr>
+              <w:spacing w:before="0" w:after="40" w:line="252" w:lineRule="auto"/>
+            </w:pPr>
+            <w:r>
+              <w:rPr>
+                <w:sz w:val="19"/>
+                <w:szCs w:val="19"/>
+              </w:rPr>
+              <w:t xml:space="preserve">Volunteers and admins</w:t>
+            </w:r>
+          </w:p>
+        </w:tc>
+        <w:tc>
+          <w:tcPr>
+            <w:tcW w:w="6939" w:type="dxa"/>
+          </w:tcPr>
+          <w:p>
+            <w:pPr>
+              <w:spacing w:before="0" w:after="40" w:line="252" w:lineRule="auto"/>
+            </w:pPr>
+            <w:r>
+              <w:rPr>
+                <w:sz w:val="19"/>
+                <w:szCs w:val="19"/>
+              </w:rPr>
+              <w:t xml:space="preserve">Everything, to check with the hospital, and donors’ contacts through the logged contact button.</w:t>
+            </w:r>
+          </w:p>
+        </w:tc>
+      </w:tr>
+      <w:tr>
+        <w:trPr>
+          <w:cantSplit/>
+        </w:trPr>
+        <w:tc>
+          <w:tcPr>
+            <w:tcW w:w="2699" w:type="dxa"/>
+          </w:tcPr>
+          <w:p>
+            <w:pPr>
+              <w:spacing w:before="0" w:after="40" w:line="252" w:lineRule="auto"/>
+            </w:pPr>
+            <w:r>
+              <w:rPr>
+                <w:sz w:val="19"/>
+                <w:szCs w:val="19"/>
+              </w:rPr>
+              <w:t xml:space="preserve">A donor who joined</w:t>
+            </w:r>
+          </w:p>
+        </w:tc>
+        <w:tc>
+          <w:tcPr>
+            <w:tcW w:w="6939" w:type="dxa"/>
+          </w:tcPr>
+          <w:p>
+            <w:pPr>
+              <w:spacing w:before="0" w:after="40" w:line="252" w:lineRule="auto"/>
+            </w:pPr>
+            <w:r>
+              <w:rPr>
+                <w:sz w:val="19"/>
+                <w:szCs w:val="19"/>
+              </w:rPr>
+              <w:t xml:space="preserve">The patient’s name and age, the hospital, its IP/UHID number and ward, and the family’s name and phone (requests made from 18 October 2026).</w:t>
+            </w:r>
+          </w:p>
+        </w:tc>
+      </w:tr>
+      <w:tr>
+        <w:trPr>
+          <w:cantSplit/>
+        </w:trPr>
+        <w:tc>
+          <w:tcPr>
+            <w:tcW w:w="2699" w:type="dxa"/>
+          </w:tcPr>
+          <w:p>
+            <w:pPr>
+              <w:spacing w:before="0" w:after="40" w:line="252" w:lineRule="auto"/>
+            </w:pPr>
+            <w:r>
+              <w:rPr>
+                <w:sz w:val="19"/>
+                <w:szCs w:val="19"/>
+              </w:rPr>
+              <w:t xml:space="preserve">Other donors</w:t>
+            </w:r>
+          </w:p>
+        </w:tc>
+        <w:tc>
+          <w:tcPr>
+            <w:tcW w:w="6939" w:type="dxa"/>
+          </w:tcPr>
+          <w:p>
+            <w:pPr>
+              <w:spacing w:before="0" w:after="40" w:line="252" w:lineRule="auto"/>
+            </w:pPr>
+            <w:r>
+              <w:rPr>
+                <w:sz w:val="19"/>
+                <w:szCs w:val="19"/>
+              </w:rPr>
+              <w:t xml:space="preserve">The request as on Find blood, with “I can donate” when they can give now, or the reason and the date they can.</w:t>
+            </w:r>
+          </w:p>
+        </w:tc>
+      </w:tr>
+    </w:tbl>
+    <w:p>
+      <w:pPr>
+        <w:spacing w:after="80"/>
+      </w:pPr>
+    </w:p>
+    <w:p>
+      <w:r>
+        <w:rPr>
+          <w:b/>
+        </w:rPr>
+        <w:t xml:space="preserve">After the donation.</w:t>
+      </w:r>
+      <w:r>
+        <w:t xml:space="preserve"> The donor taps “Yes, I donated” on the request (the dashboard asks once its time has passed). That adds a self-reported record from the request’s hospital and type, which also moves the date they can give again. Whenever a donor’s outcome becomes “donated” (their report, or a Rakt Mitra recording it), the Rakt Mitras coordinating the request, or else those who verify requests, get a follow-up on My coordination: they open the donor’s contact (logged, for 14 days, even after the request closes), thank them and ask how they feel, then mark it done with a note for the team.</w:t>
+      </w:r>
+    </w:p>
+    <w:p>
+      <w:r>
+        <w:rPr>
+          <w:b/>
+        </w:rPr>
+        <w:t xml:space="preserve">“Can give now”</w:t>
+      </w:r>
+      <w:r>
+        <w:t xml:space="preserve"> means: the same blood group (Oh only with Oh), the same district, not paused, not hiding their number, a phone or email for their chosen channel, no whole blood in the last 90 days and no SDP or other apheresis in the last 14. Self-reported donations count. Both intervals and all the limits are settings (§9, Settings). The blood centre’s doctor still decides.</w:t>
+      </w:r>
+    </w:p>
+    <w:p>
+      <w:pPr>
+        <w:pStyle w:val="Heading2"/>
+      </w:pPr>
+      <w:bookmarkStart w:id="36" w:name="s9_3"/>
+      <w:r>
+        <w:t xml:space="preserve">Main tables</w:t>
+      </w:r>
+      <w:bookmarkEnd w:id="36"/>
+    </w:p>
+    <w:tbl>
+      <w:tblPr>
+        <w:tblW w:w="9638" w:type="dxa"/>
+        <w:tblBorders>
+          <w:top w:val="single" w:sz="4" w:space="0" w:color="D9CFC8"/>
+          <w:left w:val="single" w:sz="4" w:space="0" w:color="D9CFC8"/>
+          <w:bottom w:val="single" w:sz="4" w:space="0" w:color="D9CFC8"/>
+          <w:right w:val="single" w:sz="4" w:space="0" w:color="D9CFC8"/>
+          <w:insideH w:val="single" w:sz="4" w:space="0" w:color="D9CFC8"/>
+          <w:insideV w:val="single" w:sz="4" w:space="0" w:color="D9CFC8"/>
+        </w:tblBorders>
+        <w:tblLayout w:type="fixed"/>
+        <w:tblCellMar>
+          <w:top w:w="70" w:type="dxa"/>
+          <w:left w:w="100" w:type="dxa"/>
+          <w:bottom w:w="40" w:type="dxa"/>
+          <w:right w:w="100" w:type="dxa"/>
+        </w:tblCellMar>
+        <w:tblLook w:val="04A0" w:firstRow="1" w:lastRow="0" w:firstColumn="0" w:lastColumn="0" w:noHBand="0" w:noVBand="1"/>
+      </w:tblPr>
+      <w:tblGrid>
+        <w:gridCol w:w="3855"/>
+        <w:gridCol w:w="5783"/>
+      </w:tblGrid>
+      <w:tr>
+        <w:trPr>
+          <w:cantSplit/>
+          <w:tblHeader/>
+        </w:trPr>
+        <w:tc>
+          <w:tcPr>
+            <w:tcW w:w="3855" w:type="dxa"/>
+            <w:shd w:val="clear" w:color="auto" w:fill="F2EAE5"/>
+          </w:tcPr>
+          <w:p>
+            <w:pPr>
+              <w:spacing w:before="0" w:after="40" w:line="252" w:lineRule="auto"/>
+            </w:pPr>
+            <w:r>
+              <w:rPr>
+                <w:b/>
+                <w:sz w:val="19"/>
+                <w:szCs w:val="19"/>
+              </w:rPr>
+              <w:t xml:space="preserve">Table</w:t>
+            </w:r>
+          </w:p>
+        </w:tc>
+        <w:tc>
+          <w:tcPr>
+            <w:tcW w:w="5783" w:type="dxa"/>
+            <w:shd w:val="clear" w:color="auto" w:fill="F2EAE5"/>
+          </w:tcPr>
+          <w:p>
+            <w:pPr>
+              <w:spacing w:before="0" w:after="40" w:line="252" w:lineRule="auto"/>
+            </w:pPr>
+            <w:r>
+              <w:rPr>
+                <w:b/>
+                <w:sz w:val="19"/>
+                <w:szCs w:val="19"/>
+              </w:rPr>
+              <w:t xml:space="preserve">Holds</w:t>
+            </w:r>
+          </w:p>
+        </w:tc>
+      </w:tr>
+      <w:tr>
+        <w:trPr>
+          <w:cantSplit/>
+        </w:trPr>
+        <w:tc>
+          <w:tcPr>
+            <w:tcW w:w="3855" w:type="dxa"/>
+          </w:tcPr>
+          <w:p>
+            <w:pPr>
+              <w:spacing w:before="0" w:after="40" w:line="252" w:lineRule="auto"/>
+            </w:pPr>
+            <w:r>
+              <w:rPr>
+                <w:rFonts w:ascii="Consolas" w:hAnsi="Consolas" w:cs="Consolas"/>
+                <w:color w:val="5A0909"/>
+                <w:sz w:val="17"/>
+                <w:szCs w:val="17"/>
+                <w:shd w:val="clear" w:color="auto" w:fill="F3EFEB"/>
+              </w:rPr>
+              <w:t xml:space="preserve">profiles</w:t>
+            </w:r>
+          </w:p>
+        </w:tc>
+        <w:tc>
+          <w:tcPr>
+            <w:tcW w:w="5783" w:type="dxa"/>
+          </w:tcPr>
+          <w:p>
+            <w:pPr>
+              <w:spacing w:before="0" w:after="40" w:line="252" w:lineRule="auto"/>
+            </w:pPr>
+            <w:r>
+              <w:rPr>
+                <w:sz w:val="19"/>
+                <w:szCs w:val="19"/>
+              </w:rPr>
+              <w:t xml:space="preserve">Name, display name, blood group, verification, activity.</w:t>
+            </w:r>
+          </w:p>
+        </w:tc>
+      </w:tr>
+      <w:tr>
+        <w:trPr>
+          <w:cantSplit/>
+        </w:trPr>
+        <w:tc>
+          <w:tcPr>
+            <w:tcW w:w="3855" w:type="dxa"/>
+          </w:tcPr>
+          <w:p>
+            <w:pPr>
+              <w:spacing w:before="0" w:after="40" w:line="252" w:lineRule="auto"/>
+            </w:pPr>
+            <w:r>
+              <w:rPr>
+                <w:rFonts w:ascii="Consolas" w:hAnsi="Consolas" w:cs="Consolas"/>
+                <w:color w:val="5A0909"/>
+                <w:sz w:val="17"/>
+                <w:szCs w:val="17"/>
+                <w:shd w:val="clear" w:color="auto" w:fill="F3EFEB"/>
+              </w:rPr>
+              <w:t xml:space="preserve">profile_contacts</w:t>
+            </w:r>
+          </w:p>
+        </w:tc>
+        <w:tc>
+          <w:tcPr>
+            <w:tcW w:w="5783" w:type="dxa"/>
+          </w:tcPr>
+          <w:p>
+            <w:pPr>
+              <w:spacing w:before="0" w:after="40" w:line="252" w:lineRule="auto"/>
+            </w:pPr>
+            <w:r>
+              <w:rPr>
+                <w:sz w:val="19"/>
+                <w:szCs w:val="19"/>
+              </w:rPr>
+              <w:t xml:space="preserve">Phone, WhatsApp and email, kept apart from the profile.</w:t>
+            </w:r>
+          </w:p>
+        </w:tc>
+      </w:tr>
+      <w:tr>
+        <w:trPr>
+          <w:cantSplit/>
+        </w:trPr>
+        <w:tc>
+          <w:tcPr>
+            <w:tcW w:w="3855" w:type="dxa"/>
+          </w:tcPr>
+          <w:p>
+            <w:pPr>
+              <w:spacing w:before="0" w:after="40" w:line="252" w:lineRule="auto"/>
+            </w:pPr>
+            <w:r>
+              <w:rPr>
+                <w:rFonts w:ascii="Consolas" w:hAnsi="Consolas" w:cs="Consolas"/>
+                <w:color w:val="5A0909"/>
+                <w:sz w:val="17"/>
+                <w:szCs w:val="17"/>
+                <w:shd w:val="clear" w:color="auto" w:fill="F3EFEB"/>
+              </w:rPr>
+              <w:t xml:space="preserve">donor_preferences</w:t>
+            </w:r>
+          </w:p>
+        </w:tc>
+        <w:tc>
+          <w:tcPr>
+            <w:tcW w:w="5783" w:type="dxa"/>
+          </w:tcPr>
+          <w:p>
+            <w:pPr>
+              <w:spacing w:before="0" w:after="40" w:line="252" w:lineRule="auto"/>
+            </w:pPr>
+            <w:r>
+              <w:rPr>
+                <w:sz w:val="19"/>
+                <w:szCs w:val="19"/>
+              </w:rPr>
+              <w:t xml:space="preserve">Hide my number, availability, how patients reach the donor, alerts.</w:t>
+            </w:r>
+          </w:p>
+        </w:tc>
+      </w:tr>
+      <w:tr>
+        <w:trPr>
+          <w:cantSplit/>
+        </w:trPr>
+        <w:tc>
+          <w:tcPr>
+            <w:tcW w:w="3855" w:type="dxa"/>
+          </w:tcPr>
+          <w:p>
+            <w:pPr>
+              <w:spacing w:before="0" w:after="40" w:line="252" w:lineRule="auto"/>
+            </w:pPr>
+            <w:r>
+              <w:rPr>
+                <w:rFonts w:ascii="Consolas" w:hAnsi="Consolas" w:cs="Consolas"/>
+                <w:color w:val="5A0909"/>
+                <w:sz w:val="17"/>
+                <w:szCs w:val="17"/>
+                <w:shd w:val="clear" w:color="auto" w:fill="F3EFEB"/>
+              </w:rPr>
+              <w:t xml:space="preserve">donor_locations</w:t>
+            </w:r>
+          </w:p>
+        </w:tc>
+        <w:tc>
+          <w:tcPr>
+            <w:tcW w:w="5783" w:type="dxa"/>
+          </w:tcPr>
+          <w:p>
+            <w:pPr>
+              <w:spacing w:before="0" w:after="40" w:line="252" w:lineRule="auto"/>
+            </w:pPr>
+            <w:r>
+              <w:rPr>
+                <w:sz w:val="19"/>
+                <w:szCs w:val="19"/>
+              </w:rPr>
+              <w:t xml:space="preserve">State, district, city, PIN, optional coordinates rounded to ~1 km.</w:t>
+            </w:r>
+          </w:p>
+        </w:tc>
+      </w:tr>
+      <w:tr>
+        <w:trPr>
+          <w:cantSplit/>
+        </w:trPr>
+        <w:tc>
+          <w:tcPr>
+            <w:tcW w:w="3855" w:type="dxa"/>
+          </w:tcPr>
+          <w:p>
+            <w:pPr>
+              <w:spacing w:before="0" w:after="40" w:line="252" w:lineRule="auto"/>
+            </w:pPr>
+            <w:r>
+              <w:rPr>
+                <w:rFonts w:ascii="Consolas" w:hAnsi="Consolas" w:cs="Consolas"/>
+                <w:color w:val="5A0909"/>
+                <w:sz w:val="17"/>
+                <w:szCs w:val="17"/>
+                <w:shd w:val="clear" w:color="auto" w:fill="F3EFEB"/>
+              </w:rPr>
+              <w:t xml:space="preserve">consent_events</w:t>
+            </w:r>
+          </w:p>
+        </w:tc>
+        <w:tc>
+          <w:tcPr>
+            <w:tcW w:w="5783" w:type="dxa"/>
+          </w:tcPr>
+          <w:p>
+            <w:pPr>
+              <w:spacing w:before="0" w:after="40" w:line="252" w:lineRule="auto"/>
+            </w:pPr>
+            <w:r>
+              <w:rPr>
+                <w:sz w:val="19"/>
+                <w:szCs w:val="19"/>
+              </w:rPr>
+              <w:t xml:space="preserve">History of each member’s choices (alerts, Hide my number, terms).</w:t>
+            </w:r>
+          </w:p>
+        </w:tc>
+      </w:tr>
+      <w:tr>
+        <w:trPr>
+          <w:cantSplit/>
+        </w:trPr>
+        <w:tc>
+          <w:tcPr>
+            <w:tcW w:w="3855" w:type="dxa"/>
+          </w:tcPr>
+          <w:p>
+            <w:pPr>
+              <w:spacing w:before="0" w:after="40" w:line="252" w:lineRule="auto"/>
+            </w:pPr>
+            <w:r>
+              <w:rPr>
+                <w:rFonts w:ascii="Consolas" w:hAnsi="Consolas" w:cs="Consolas"/>
+                <w:color w:val="5A0909"/>
+                <w:sz w:val="17"/>
+                <w:szCs w:val="17"/>
+                <w:shd w:val="clear" w:color="auto" w:fill="F3EFEB"/>
+              </w:rPr>
+              <w:t xml:space="preserve">donation_records</w:t>
+            </w:r>
+          </w:p>
+        </w:tc>
+        <w:tc>
+          <w:tcPr>
+            <w:tcW w:w="5783" w:type="dxa"/>
+          </w:tcPr>
+          <w:p>
+            <w:pPr>
+              <w:spacing w:before="0" w:after="40" w:line="252" w:lineRule="auto"/>
+            </w:pPr>
+            <w:r>
+              <w:rPr>
+                <w:sz w:val="19"/>
+                <w:szCs w:val="19"/>
+              </w:rPr>
+              <w:t xml:space="preserve">Each donation: type, date, centre, verification status.</w:t>
+            </w:r>
+          </w:p>
+        </w:tc>
+      </w:tr>
+      <w:tr>
+        <w:trPr>
+          <w:cantSplit/>
+        </w:trPr>
+        <w:tc>
+          <w:tcPr>
+            <w:tcW w:w="3855" w:type="dxa"/>
+          </w:tcPr>
+          <w:p>
+            <w:pPr>
+              <w:spacing w:before="0" w:after="40" w:line="252" w:lineRule="auto"/>
+            </w:pPr>
+            <w:r>
+              <w:rPr>
+                <w:rFonts w:ascii="Consolas" w:hAnsi="Consolas" w:cs="Consolas"/>
+                <w:color w:val="5A0909"/>
+                <w:sz w:val="17"/>
+                <w:szCs w:val="17"/>
+                <w:shd w:val="clear" w:color="auto" w:fill="F3EFEB"/>
+              </w:rPr>
+              <w:t xml:space="preserve">blood_requests</w:t>
+            </w:r>
+          </w:p>
+        </w:tc>
+        <w:tc>
+          <w:tcPr>
+            <w:tcW w:w="5783" w:type="dxa"/>
+          </w:tcPr>
+          <w:p>
+            <w:pPr>
+              <w:spacing w:before="0" w:after="40" w:line="252" w:lineRule="auto"/>
+            </w:pPr>
+            <w:r>
+              <w:rPr>
+                <w:sz w:val="19"/>
+                <w:szCs w:val="19"/>
+              </w:rPr>
+              <w:t xml:space="preserve">Requests: the patient’s details, the family’s private contact, status.</w:t>
+            </w:r>
+          </w:p>
+        </w:tc>
+      </w:tr>
+      <w:tr>
+        <w:trPr>
+          <w:cantSplit/>
+        </w:trPr>
+        <w:tc>
+          <w:tcPr>
+            <w:tcW w:w="3855" w:type="dxa"/>
+          </w:tcPr>
+          <w:p>
+            <w:pPr>
+              <w:spacing w:before="0" w:after="40" w:line="252" w:lineRule="auto"/>
+            </w:pPr>
+            <w:r>
+              <w:rPr>
+                <w:rFonts w:ascii="Consolas" w:hAnsi="Consolas" w:cs="Consolas"/>
+                <w:color w:val="5A0909"/>
+                <w:sz w:val="17"/>
+                <w:szCs w:val="17"/>
+                <w:shd w:val="clear" w:color="auto" w:fill="F3EFEB"/>
+              </w:rPr>
+              <w:t xml:space="preserve">donor_disclosures</w:t>
+            </w:r>
+          </w:p>
+        </w:tc>
+        <w:tc>
+          <w:tcPr>
+            <w:tcW w:w="5783" w:type="dxa"/>
+          </w:tcPr>
+          <w:p>
+            <w:pPr>
+              <w:spacing w:before="0" w:after="40" w:line="252" w:lineRule="auto"/>
+            </w:pPr>
+            <w:r>
+              <w:rPr>
+                <w:sz w:val="19"/>
+                <w:szCs w:val="19"/>
+              </w:rPr>
+              <w:t xml:space="preserve">Which donor contacts each family has opened.</w:t>
+            </w:r>
+          </w:p>
+        </w:tc>
+      </w:tr>
+      <w:tr>
+        <w:trPr>
+          <w:cantSplit/>
+        </w:trPr>
+        <w:tc>
+          <w:tcPr>
+            <w:tcW w:w="3855" w:type="dxa"/>
+          </w:tcPr>
+          <w:p>
+            <w:pPr>
+              <w:spacing w:before="0" w:after="40" w:line="252" w:lineRule="auto"/>
+            </w:pPr>
+            <w:r>
+              <w:rPr>
+                <w:rFonts w:ascii="Consolas" w:hAnsi="Consolas" w:cs="Consolas"/>
+                <w:color w:val="5A0909"/>
+                <w:sz w:val="17"/>
+                <w:szCs w:val="17"/>
+                <w:shd w:val="clear" w:color="auto" w:fill="F3EFEB"/>
+              </w:rPr>
+              <w:t xml:space="preserve">request_events</w:t>
+            </w:r>
+            <w:r>
+              <w:rPr>
+                <w:sz w:val="19"/>
+                <w:szCs w:val="19"/>
+              </w:rPr>
+              <w:t xml:space="preserve">, </w:t>
+            </w:r>
+            <w:r>
+              <w:rPr>
+                <w:rFonts w:ascii="Consolas" w:hAnsi="Consolas" w:cs="Consolas"/>
+                <w:color w:val="5A0909"/>
+                <w:sz w:val="17"/>
+                <w:szCs w:val="17"/>
+                <w:shd w:val="clear" w:color="auto" w:fill="F3EFEB"/>
+              </w:rPr>
+              <w:t xml:space="preserve">request_responses</w:t>
+            </w:r>
+            <w:r>
+              <w:rPr>
+                <w:sz w:val="19"/>
+                <w:szCs w:val="19"/>
+              </w:rPr>
+              <w:t xml:space="preserve">, </w:t>
+            </w:r>
+            <w:r>
+              <w:rPr>
+                <w:rFonts w:ascii="Consolas" w:hAnsi="Consolas" w:cs="Consolas"/>
+                <w:color w:val="5A0909"/>
+                <w:sz w:val="17"/>
+                <w:szCs w:val="17"/>
+                <w:shd w:val="clear" w:color="auto" w:fill="F3EFEB"/>
+              </w:rPr>
+              <w:t xml:space="preserve">contact_requests</w:t>
+            </w:r>
+            <w:r>
+              <w:rPr>
+                <w:sz w:val="19"/>
+                <w:szCs w:val="19"/>
+              </w:rPr>
+              <w:t xml:space="preserve">, </w:t>
+            </w:r>
+            <w:r>
+              <w:rPr>
+                <w:rFonts w:ascii="Consolas" w:hAnsi="Consolas" w:cs="Consolas"/>
+                <w:color w:val="5A0909"/>
+                <w:sz w:val="17"/>
+                <w:szCs w:val="17"/>
+                <w:shd w:val="clear" w:color="auto" w:fill="F3EFEB"/>
+              </w:rPr>
+              <w:t xml:space="preserve">volunteer_assignments</w:t>
+            </w:r>
+          </w:p>
+        </w:tc>
+        <w:tc>
+          <w:tcPr>
+            <w:tcW w:w="5783" w:type="dxa"/>
+          </w:tcPr>
+          <w:p>
+            <w:pPr>
+              <w:spacing w:before="0" w:after="40" w:line="252" w:lineRule="auto"/>
+            </w:pPr>
+            <w:r>
+              <w:rPr>
+                <w:sz w:val="19"/>
+                <w:szCs w:val="19"/>
+              </w:rPr>
+              <w:t xml:space="preserve">Request history; donors who joined or answered, and after a donation its date, record and follow-up; Rakt Mitras’ contact requests; who coordinates what.</w:t>
+            </w:r>
+          </w:p>
+        </w:tc>
+      </w:tr>
+      <w:tr>
+        <w:trPr>
+          <w:cantSplit/>
+        </w:trPr>
+        <w:tc>
+          <w:tcPr>
+            <w:tcW w:w="3855" w:type="dxa"/>
+          </w:tcPr>
+          <w:p>
+            <w:pPr>
+              <w:spacing w:before="0" w:after="40" w:line="252" w:lineRule="auto"/>
+            </w:pPr>
+            <w:r>
+              <w:rPr>
+                <w:rFonts w:ascii="Consolas" w:hAnsi="Consolas" w:cs="Consolas"/>
+                <w:color w:val="5A0909"/>
+                <w:sz w:val="17"/>
+                <w:szCs w:val="17"/>
+                <w:shd w:val="clear" w:color="auto" w:fill="F3EFEB"/>
+              </w:rPr>
+              <w:t xml:space="preserve">notifications</w:t>
+            </w:r>
+            <w:r>
+              <w:rPr>
+                <w:sz w:val="19"/>
+                <w:szCs w:val="19"/>
+              </w:rPr>
+              <w:t xml:space="preserve">, </w:t>
+            </w:r>
+            <w:r>
+              <w:rPr>
+                <w:rFonts w:ascii="Consolas" w:hAnsi="Consolas" w:cs="Consolas"/>
+                <w:color w:val="5A0909"/>
+                <w:sz w:val="17"/>
+                <w:szCs w:val="17"/>
+                <w:shd w:val="clear" w:color="auto" w:fill="F3EFEB"/>
+              </w:rPr>
+              <w:t xml:space="preserve">internal_notes</w:t>
+            </w:r>
+          </w:p>
+        </w:tc>
+        <w:tc>
+          <w:tcPr>
+            <w:tcW w:w="5783" w:type="dxa"/>
+          </w:tcPr>
+          <w:p>
+            <w:pPr>
+              <w:spacing w:before="0" w:after="40" w:line="252" w:lineRule="auto"/>
+            </w:pPr>
+            <w:r>
+              <w:rPr>
+                <w:sz w:val="19"/>
+                <w:szCs w:val="19"/>
+              </w:rPr>
+              <w:t xml:space="preserve">In-app notifications; staff-only notes.</w:t>
+            </w:r>
+          </w:p>
+        </w:tc>
+      </w:tr>
+      <w:tr>
+        <w:trPr>
+          <w:cantSplit/>
+        </w:trPr>
+        <w:tc>
+          <w:tcPr>
+            <w:tcW w:w="3855" w:type="dxa"/>
+          </w:tcPr>
+          <w:p>
+            <w:pPr>
+              <w:spacing w:before="0" w:after="40" w:line="252" w:lineRule="auto"/>
+            </w:pPr>
+            <w:r>
+              <w:rPr>
+                <w:rFonts w:ascii="Consolas" w:hAnsi="Consolas" w:cs="Consolas"/>
+                <w:color w:val="5A0909"/>
+                <w:sz w:val="17"/>
+                <w:szCs w:val="17"/>
+                <w:shd w:val="clear" w:color="auto" w:fill="F3EFEB"/>
+              </w:rPr>
+              <w:t xml:space="preserve">staff_roles</w:t>
+            </w:r>
+          </w:p>
+        </w:tc>
+        <w:tc>
+          <w:tcPr>
+            <w:tcW w:w="5783" w:type="dxa"/>
+          </w:tcPr>
+          <w:p>
+            <w:pPr>
+              <w:spacing w:before="0" w:after="40" w:line="252" w:lineRule="auto"/>
+            </w:pPr>
+            <w:r>
+              <w:rPr>
+                <w:sz w:val="19"/>
+                <w:szCs w:val="19"/>
+              </w:rPr>
+              <w:t xml:space="preserve">Volunteers and admins, with their permission switches.</w:t>
+            </w:r>
+          </w:p>
+        </w:tc>
+      </w:tr>
+      <w:tr>
+        <w:trPr>
+          <w:cantSplit/>
+        </w:trPr>
+        <w:tc>
+          <w:tcPr>
+            <w:tcW w:w="3855" w:type="dxa"/>
+          </w:tcPr>
+          <w:p>
+            <w:pPr>
+              <w:spacing w:before="0" w:after="40" w:line="252" w:lineRule="auto"/>
+            </w:pPr>
+            <w:r>
+              <w:rPr>
+                <w:rFonts w:ascii="Consolas" w:hAnsi="Consolas" w:cs="Consolas"/>
+                <w:color w:val="5A0909"/>
+                <w:sz w:val="17"/>
+                <w:szCs w:val="17"/>
+                <w:shd w:val="clear" w:color="auto" w:fill="F3EFEB"/>
+              </w:rPr>
+              <w:t xml:space="preserve">impact_stories</w:t>
+            </w:r>
+            <w:r>
+              <w:rPr>
+                <w:sz w:val="19"/>
+                <w:szCs w:val="19"/>
+              </w:rPr>
+              <w:t xml:space="preserve">, </w:t>
+            </w:r>
+            <w:r>
+              <w:rPr>
+                <w:rFonts w:ascii="Consolas" w:hAnsi="Consolas" w:cs="Consolas"/>
+                <w:color w:val="5A0909"/>
+                <w:sz w:val="17"/>
+                <w:szCs w:val="17"/>
+                <w:shd w:val="clear" w:color="auto" w:fill="F3EFEB"/>
+              </w:rPr>
+              <w:t xml:space="preserve">story_consents</w:t>
+            </w:r>
+            <w:r>
+              <w:rPr>
+                <w:sz w:val="19"/>
+                <w:szCs w:val="19"/>
+              </w:rPr>
+              <w:t xml:space="preserve">, </w:t>
+            </w:r>
+            <w:r>
+              <w:rPr>
+                <w:rFonts w:ascii="Consolas" w:hAnsi="Consolas" w:cs="Consolas"/>
+                <w:color w:val="5A0909"/>
+                <w:sz w:val="17"/>
+                <w:szCs w:val="17"/>
+                <w:shd w:val="clear" w:color="auto" w:fill="F3EFEB"/>
+              </w:rPr>
+              <w:t xml:space="preserve">story_verification_events</w:t>
+            </w:r>
+          </w:p>
+        </w:tc>
+        <w:tc>
+          <w:tcPr>
+            <w:tcW w:w="5783" w:type="dxa"/>
+          </w:tcPr>
+          <w:p>
+            <w:pPr>
+              <w:spacing w:before="0" w:after="40" w:line="252" w:lineRule="auto"/>
+            </w:pPr>
+            <w:r>
+              <w:rPr>
+                <w:sz w:val="19"/>
+                <w:szCs w:val="19"/>
+              </w:rPr>
+              <w:t xml:space="preserve">Stories, consent snapshots, moderation trail.</w:t>
+            </w:r>
+          </w:p>
+        </w:tc>
+      </w:tr>
+      <w:tr>
+        <w:trPr>
+          <w:cantSplit/>
+        </w:trPr>
+        <w:tc>
+          <w:tcPr>
+            <w:tcW w:w="3855" w:type="dxa"/>
+          </w:tcPr>
+          <w:p>
+            <w:pPr>
+              <w:spacing w:before="0" w:after="40" w:line="252" w:lineRule="auto"/>
+            </w:pPr>
+            <w:r>
+              <w:rPr>
+                <w:rFonts w:ascii="Consolas" w:hAnsi="Consolas" w:cs="Consolas"/>
+                <w:color w:val="5A0909"/>
+                <w:sz w:val="17"/>
+                <w:szCs w:val="17"/>
+                <w:shd w:val="clear" w:color="auto" w:fill="F3EFEB"/>
+              </w:rPr>
+              <w:t xml:space="preserve">camp_records</w:t>
+            </w:r>
+            <w:r>
+              <w:rPr>
+                <w:sz w:val="19"/>
+                <w:szCs w:val="19"/>
+              </w:rPr>
+              <w:t xml:space="preserve">, </w:t>
+            </w:r>
+            <w:r>
+              <w:rPr>
+                <w:rFonts w:ascii="Consolas" w:hAnsi="Consolas" w:cs="Consolas"/>
+                <w:color w:val="5A0909"/>
+                <w:sz w:val="17"/>
+                <w:szCs w:val="17"/>
+                <w:shd w:val="clear" w:color="auto" w:fill="F3EFEB"/>
+              </w:rPr>
+              <w:t xml:space="preserve">impact_metrics_sources</w:t>
+            </w:r>
+          </w:p>
+        </w:tc>
+        <w:tc>
+          <w:tcPr>
+            <w:tcW w:w="5783" w:type="dxa"/>
+          </w:tcPr>
+          <w:p>
+            <w:pPr>
+              <w:spacing w:before="0" w:after="40" w:line="252" w:lineRule="auto"/>
+            </w:pPr>
+            <w:r>
+              <w:rPr>
+                <w:sz w:val="19"/>
+                <w:szCs w:val="19"/>
+              </w:rPr>
+              <w:t xml:space="preserve">Camps and documented figures (each with a source and a date).</w:t>
+            </w:r>
+          </w:p>
+        </w:tc>
+      </w:tr>
+      <w:tr>
+        <w:trPr>
+          <w:cantSplit/>
+        </w:trPr>
+        <w:tc>
+          <w:tcPr>
+            <w:tcW w:w="3855" w:type="dxa"/>
+          </w:tcPr>
+          <w:p>
+            <w:pPr>
+              <w:spacing w:before="0" w:after="40" w:line="252" w:lineRule="auto"/>
+            </w:pPr>
+            <w:r>
+              <w:rPr>
+                <w:rFonts w:ascii="Consolas" w:hAnsi="Consolas" w:cs="Consolas"/>
+                <w:color w:val="5A0909"/>
+                <w:sz w:val="17"/>
+                <w:szCs w:val="17"/>
+                <w:shd w:val="clear" w:color="auto" w:fill="F3EFEB"/>
+              </w:rPr>
+              <w:t xml:space="preserve">platform_settings</w:t>
+            </w:r>
+          </w:p>
+        </w:tc>
+        <w:tc>
+          <w:tcPr>
+            <w:tcW w:w="5783" w:type="dxa"/>
+          </w:tcPr>
+          <w:p>
+            <w:pPr>
+              <w:spacing w:before="0" w:after="40" w:line="252" w:lineRule="auto"/>
+            </w:pPr>
+            <w:r>
+              <w:rPr>
+                <w:sz w:val="19"/>
+                <w:szCs w:val="19"/>
+              </w:rPr>
+              <w:t xml:space="preserve">The settings edited at Admin → Settings.</w:t>
+            </w:r>
+          </w:p>
+        </w:tc>
+      </w:tr>
+      <w:tr>
+        <w:trPr>
+          <w:cantSplit/>
+        </w:trPr>
+        <w:tc>
+          <w:tcPr>
+            <w:tcW w:w="3855" w:type="dxa"/>
+          </w:tcPr>
+          <w:p>
+            <w:pPr>
+              <w:spacing w:before="0" w:after="40" w:line="252" w:lineRule="auto"/>
+            </w:pPr>
+            <w:r>
+              <w:rPr>
+                <w:rFonts w:ascii="Consolas" w:hAnsi="Consolas" w:cs="Consolas"/>
+                <w:color w:val="5A0909"/>
+                <w:sz w:val="17"/>
+                <w:szCs w:val="17"/>
+                <w:shd w:val="clear" w:color="auto" w:fill="F3EFEB"/>
+              </w:rPr>
+              <w:t xml:space="preserve">audit_logs</w:t>
+            </w:r>
+          </w:p>
+        </w:tc>
+        <w:tc>
+          <w:tcPr>
+            <w:tcW w:w="5783" w:type="dxa"/>
+          </w:tcPr>
+          <w:p>
+            <w:pPr>
+              <w:spacing w:before="0" w:after="40" w:line="252" w:lineRule="auto"/>
+            </w:pPr>
+            <w:r>
+              <w:rPr>
+                <w:sz w:val="19"/>
+                <w:szCs w:val="19"/>
+              </w:rPr>
+              <w:t xml:space="preserve">Append-only log of privileged actions: which fields changed, never the values.</w:t>
+            </w:r>
+          </w:p>
+        </w:tc>
+      </w:tr>
+      <w:tr>
+        <w:trPr>
+          <w:cantSplit/>
+        </w:trPr>
+        <w:tc>
+          <w:tcPr>
+            <w:tcW w:w="3855" w:type="dxa"/>
+          </w:tcPr>
+          <w:p>
+            <w:pPr>
+              <w:spacing w:before="0" w:after="40" w:line="252" w:lineRule="auto"/>
+            </w:pPr>
+            <w:r>
+              <w:rPr>
+                <w:rFonts w:ascii="Consolas" w:hAnsi="Consolas" w:cs="Consolas"/>
+                <w:color w:val="5A0909"/>
+                <w:sz w:val="17"/>
+                <w:szCs w:val="17"/>
+                <w:shd w:val="clear" w:color="auto" w:fill="F3EFEB"/>
+              </w:rPr>
+              <w:t xml:space="preserve">rate_limits</w:t>
+            </w:r>
+          </w:p>
+        </w:tc>
+        <w:tc>
+          <w:tcPr>
+            <w:tcW w:w="5783" w:type="dxa"/>
+          </w:tcPr>
+          <w:p>
+            <w:pPr>
+              <w:spacing w:before="0" w:after="40" w:line="252" w:lineRule="auto"/>
+            </w:pPr>
+            <w:r>
+              <w:rPr>
+                <w:sz w:val="19"/>
+                <w:szCs w:val="19"/>
+              </w:rPr>
+              <w:t xml:space="preserve">Counters that stop abuse.</w:t>
+            </w:r>
+          </w:p>
+        </w:tc>
+      </w:tr>
+    </w:tbl>
+    <w:p>
+      <w:pPr>
+        <w:spacing w:after="80"/>
+      </w:pPr>
+    </w:p>
+    <w:p>
+      <w:r>
+        <w:rPr>
+          <w:rFonts w:ascii="Consolas" w:hAnsi="Consolas" w:cs="Consolas"/>
+          <w:color w:val="5A0909"/>
+          <w:sz w:val="19"/>
+          <w:szCs w:val="19"/>
+          <w:shd w:val="clear" w:color="auto" w:fill="F3EFEB"/>
+        </w:rPr>
+        <w:t xml:space="preserve">docs/DATABASE.md</w:t>
+      </w:r>
+      <w:r>
+        <w:rPr>
+          <w:color w:val="6B5D5A"/>
+        </w:rPr>
+        <w:t xml:space="preserve"> has the full list with each table’s protections.</w:t>
+      </w:r>
+    </w:p>
+    <w:p>
+      <w:pPr>
+        <w:pStyle w:val="Heading2"/>
+      </w:pPr>
+      <w:bookmarkStart w:id="37" w:name="s9_4"/>
+      <w:r>
+        <w:t xml:space="preserve">Migrations: the database’s history</w:t>
+      </w:r>
+      <w:bookmarkEnd w:id="37"/>
+    </w:p>
+    <w:p>
+      <w:r>
+        <w:t xml:space="preserve">A migration is a SQL file that changes the database. They run once, in the order of their names (the date at the start). Production has run all of them, which is why an applied migration must </w:t>
+      </w:r>
+      <w:r>
+        <w:rPr>
+          <w:b/>
+        </w:rPr>
+        <w:t xml:space="preserve">never be edited</w:t>
+      </w:r>
+      <w:r>
+        <w:t xml:space="preserve">: to change something, add a new migration.</w:t>
+      </w:r>
+    </w:p>
+    <w:tbl>
+      <w:tblPr>
+        <w:tblW w:w="9638" w:type="dxa"/>
+        <w:tblBorders>
+          <w:top w:val="single" w:sz="4" w:space="0" w:color="D9CFC8"/>
+          <w:left w:val="single" w:sz="4" w:space="0" w:color="D9CFC8"/>
+          <w:bottom w:val="single" w:sz="4" w:space="0" w:color="D9CFC8"/>
+          <w:right w:val="single" w:sz="4" w:space="0" w:color="D9CFC8"/>
+          <w:insideH w:val="single" w:sz="4" w:space="0" w:color="D9CFC8"/>
+          <w:insideV w:val="single" w:sz="4" w:space="0" w:color="D9CFC8"/>
+        </w:tblBorders>
+        <w:tblLayout w:type="fixed"/>
+        <w:tblCellMar>
+          <w:top w:w="70" w:type="dxa"/>
+          <w:left w:w="100" w:type="dxa"/>
+          <w:bottom w:w="40" w:type="dxa"/>
+          <w:right w:w="100" w:type="dxa"/>
+        </w:tblCellMar>
+        <w:tblLook w:val="04A0" w:firstRow="1" w:lastRow="0" w:firstColumn="0" w:lastColumn="0" w:noHBand="0" w:noVBand="1"/>
+      </w:tblPr>
+      <w:tblGrid>
+        <w:gridCol w:w="4626"/>
+        <w:gridCol w:w="5012"/>
+      </w:tblGrid>
+      <w:tr>
+        <w:trPr>
+          <w:cantSplit/>
+          <w:tblHeader/>
+        </w:trPr>
+        <w:tc>
+          <w:tcPr>
+            <w:tcW w:w="4626" w:type="dxa"/>
+            <w:shd w:val="clear" w:color="auto" w:fill="F2EAE5"/>
+          </w:tcPr>
+          <w:p>
+            <w:pPr>
+              <w:spacing w:before="0" w:after="40" w:line="252" w:lineRule="auto"/>
+            </w:pPr>
+            <w:r>
+              <w:rPr>
+                <w:b/>
+                <w:sz w:val="19"/>
+                <w:szCs w:val="19"/>
+              </w:rPr>
+              <w:t xml:space="preserve">File (</w:t>
+            </w:r>
+            <w:r>
+              <w:rPr>
+                <w:rFonts w:ascii="Consolas" w:hAnsi="Consolas" w:cs="Consolas"/>
+                <w:b/>
+                <w:color w:val="5A0909"/>
+                <w:sz w:val="17"/>
+                <w:szCs w:val="17"/>
+                <w:shd w:val="clear" w:color="auto" w:fill="F3EFEB"/>
+              </w:rPr>
+              <w:t xml:space="preserve">supabase/migrations/</w:t>
+            </w:r>
+            <w:r>
+              <w:rPr>
+                <w:b/>
+                <w:sz w:val="19"/>
+                <w:szCs w:val="19"/>
+              </w:rPr>
+              <w:t xml:space="preserve">)</w:t>
+            </w:r>
+          </w:p>
+        </w:tc>
+        <w:tc>
+          <w:tcPr>
+            <w:tcW w:w="5012" w:type="dxa"/>
+            <w:shd w:val="clear" w:color="auto" w:fill="F2EAE5"/>
+          </w:tcPr>
+          <w:p>
+            <w:pPr>
+              <w:spacing w:before="0" w:after="40" w:line="252" w:lineRule="auto"/>
+            </w:pPr>
+            <w:r>
+              <w:rPr>
+                <w:b/>
+                <w:sz w:val="19"/>
+                <w:szCs w:val="19"/>
+              </w:rPr>
+              <w:t xml:space="preserve">What it does</w:t>
+            </w:r>
+          </w:p>
+        </w:tc>
+      </w:tr>
+      <w:tr>
+        <w:trPr>
+          <w:cantSplit/>
+        </w:trPr>
+        <w:tc>
+          <w:tcPr>
+            <w:tcW w:w="4626" w:type="dxa"/>
+          </w:tcPr>
+          <w:p>
+            <w:pPr>
+              <w:spacing w:before="0" w:after="40" w:line="252" w:lineRule="auto"/>
+            </w:pPr>
+            <w:r>
+              <w:rPr>
+                <w:rFonts w:ascii="Consolas" w:hAnsi="Consolas" w:cs="Consolas"/>
+                <w:color w:val="5A0909"/>
+                <w:sz w:val="17"/>
+                <w:szCs w:val="17"/>
+                <w:shd w:val="clear" w:color="auto" w:fill="F3EFEB"/>
+              </w:rPr>
+              <w:t xml:space="preserve">20261011000100_foundation.sql</w:t>
+            </w:r>
+          </w:p>
+        </w:tc>
+        <w:tc>
+          <w:tcPr>
+            <w:tcW w:w="5012" w:type="dxa"/>
+          </w:tcPr>
+          <w:p>
+            <w:pPr>
+              <w:spacing w:before="0" w:after="40" w:line="252" w:lineRule="auto"/>
+            </w:pPr>
+            <w:r>
+              <w:rPr>
+                <w:sz w:val="19"/>
+                <w:szCs w:val="19"/>
+              </w:rPr>
+              <w:t xml:space="preserve">Core tables, role helpers, guard triggers, audit log, rate limits, sign-up trigger, RLS policies.</w:t>
+            </w:r>
+          </w:p>
+        </w:tc>
+      </w:tr>
+      <w:tr>
+        <w:trPr>
+          <w:cantSplit/>
+        </w:trPr>
+        <w:tc>
+          <w:tcPr>
+            <w:tcW w:w="4626" w:type="dxa"/>
+          </w:tcPr>
+          <w:p>
+            <w:pPr>
+              <w:spacing w:before="0" w:after="40" w:line="252" w:lineRule="auto"/>
+            </w:pPr>
+            <w:r>
+              <w:rPr>
+                <w:rFonts w:ascii="Consolas" w:hAnsi="Consolas" w:cs="Consolas"/>
+                <w:color w:val="5A0909"/>
+                <w:sz w:val="17"/>
+                <w:szCs w:val="17"/>
+                <w:shd w:val="clear" w:color="auto" w:fill="F3EFEB"/>
+              </w:rPr>
+              <w:t xml:space="preserve">20261011000200_coordination.sql</w:t>
+            </w:r>
+          </w:p>
+        </w:tc>
+        <w:tc>
+          <w:tcPr>
+            <w:tcW w:w="5012" w:type="dxa"/>
+          </w:tcPr>
+          <w:p>
+            <w:pPr>
+              <w:spacing w:before="0" w:after="40" w:line="252" w:lineRule="auto"/>
+            </w:pPr>
+            <w:r>
+              <w:rPr>
+                <w:sz w:val="19"/>
+                <w:szCs w:val="19"/>
+              </w:rPr>
+              <w:t xml:space="preserve">Donation summary and verification, profile verification, request lifecycle, matching, directory search, consent-checked contact, analytics, retention.</w:t>
+            </w:r>
+          </w:p>
+        </w:tc>
+      </w:tr>
+      <w:tr>
+        <w:trPr>
+          <w:cantSplit/>
+        </w:trPr>
+        <w:tc>
+          <w:tcPr>
+            <w:tcW w:w="4626" w:type="dxa"/>
+          </w:tcPr>
+          <w:p>
+            <w:pPr>
+              <w:spacing w:before="0" w:after="40" w:line="252" w:lineRule="auto"/>
+            </w:pPr>
+            <w:r>
+              <w:rPr>
+                <w:rFonts w:ascii="Consolas" w:hAnsi="Consolas" w:cs="Consolas"/>
+                <w:color w:val="5A0909"/>
+                <w:sz w:val="17"/>
+                <w:szCs w:val="17"/>
+                <w:shd w:val="clear" w:color="auto" w:fill="F3EFEB"/>
+              </w:rPr>
+              <w:t xml:space="preserve">20261011000300_impact_stories.sql</w:t>
+            </w:r>
+          </w:p>
+        </w:tc>
+        <w:tc>
+          <w:tcPr>
+            <w:tcW w:w="5012" w:type="dxa"/>
+          </w:tcPr>
+          <w:p>
+            <w:pPr>
+              <w:spacing w:before="0" w:after="40" w:line="252" w:lineRule="auto"/>
+            </w:pPr>
+            <w:r>
+              <w:rPr>
+                <w:sz w:val="19"/>
+                <w:szCs w:val="19"/>
+              </w:rPr>
+              <w:t xml:space="preserve">Stories, consents, moderation, camps, documented figures, public impact figures, account anonymisation.</w:t>
+            </w:r>
+          </w:p>
+        </w:tc>
+      </w:tr>
+      <w:tr>
+        <w:trPr>
+          <w:cantSplit/>
+        </w:trPr>
+        <w:tc>
+          <w:tcPr>
+            <w:tcW w:w="4626" w:type="dxa"/>
+          </w:tcPr>
+          <w:p>
+            <w:pPr>
+              <w:spacing w:before="0" w:after="40" w:line="252" w:lineRule="auto"/>
+            </w:pPr>
+            <w:r>
+              <w:rPr>
+                <w:rFonts w:ascii="Consolas" w:hAnsi="Consolas" w:cs="Consolas"/>
+                <w:color w:val="5A0909"/>
+                <w:sz w:val="17"/>
+                <w:szCs w:val="17"/>
+                <w:shd w:val="clear" w:color="auto" w:fill="F3EFEB"/>
+              </w:rPr>
+              <w:t xml:space="preserve">20261011000400_storage.sql</w:t>
+            </w:r>
+          </w:p>
+        </w:tc>
+        <w:tc>
+          <w:tcPr>
+            <w:tcW w:w="5012" w:type="dxa"/>
+          </w:tcPr>
+          <w:p>
+            <w:pPr>
+              <w:spacing w:before="0" w:after="40" w:line="252" w:lineRule="auto"/>
+            </w:pPr>
+            <w:r>
+              <w:rPr>
+                <w:sz w:val="19"/>
+                <w:szCs w:val="19"/>
+              </w:rPr>
+              <w:t xml:space="preserve">Photo buckets and their rules.</w:t>
+            </w:r>
+          </w:p>
+        </w:tc>
+      </w:tr>
+      <w:tr>
+        <w:trPr>
+          <w:cantSplit/>
+        </w:trPr>
+        <w:tc>
+          <w:tcPr>
+            <w:tcW w:w="4626" w:type="dxa"/>
+          </w:tcPr>
+          <w:p>
+            <w:pPr>
+              <w:spacing w:before="0" w:after="40" w:line="252" w:lineRule="auto"/>
+            </w:pPr>
+            <w:r>
+              <w:rPr>
+                <w:rFonts w:ascii="Consolas" w:hAnsi="Consolas" w:cs="Consolas"/>
+                <w:color w:val="5A0909"/>
+                <w:sz w:val="17"/>
+                <w:szCs w:val="17"/>
+                <w:shd w:val="clear" w:color="auto" w:fill="F3EFEB"/>
+              </w:rPr>
+              <w:t xml:space="preserve">20261011000500_default_settings.sql</w:t>
+            </w:r>
+          </w:p>
+        </w:tc>
+        <w:tc>
+          <w:tcPr>
+            <w:tcW w:w="5012" w:type="dxa"/>
+          </w:tcPr>
+          <w:p>
+            <w:pPr>
+              <w:spacing w:before="0" w:after="40" w:line="252" w:lineRule="auto"/>
+            </w:pPr>
+            <w:r>
+              <w:rPr>
+                <w:sz w:val="19"/>
+                <w:szCs w:val="19"/>
+              </w:rPr>
+              <w:t xml:space="preserve">Default settings (contacts stay empty until set in Admin).</w:t>
+            </w:r>
+          </w:p>
+        </w:tc>
+      </w:tr>
+      <w:tr>
+        <w:trPr>
+          <w:cantSplit/>
+        </w:trPr>
+        <w:tc>
+          <w:tcPr>
+            <w:tcW w:w="4626" w:type="dxa"/>
+          </w:tcPr>
+          <w:p>
+            <w:pPr>
+              <w:spacing w:before="0" w:after="40" w:line="252" w:lineRule="auto"/>
+            </w:pPr>
+            <w:r>
+              <w:rPr>
+                <w:rFonts w:ascii="Consolas" w:hAnsi="Consolas" w:cs="Consolas"/>
+                <w:color w:val="5A0909"/>
+                <w:sz w:val="17"/>
+                <w:szCs w:val="17"/>
+                <w:shd w:val="clear" w:color="auto" w:fill="F3EFEB"/>
+              </w:rPr>
+              <w:t xml:space="preserve">20261011000600_audit_actor_deletion.sql</w:t>
+            </w:r>
+          </w:p>
+        </w:tc>
+        <w:tc>
+          <w:tcPr>
+            <w:tcW w:w="5012" w:type="dxa"/>
+          </w:tcPr>
+          <w:p>
+            <w:pPr>
+              <w:spacing w:before="0" w:after="40" w:line="252" w:lineRule="auto"/>
+            </w:pPr>
+            <w:r>
+              <w:rPr>
+                <w:sz w:val="19"/>
+                <w:szCs w:val="19"/>
+              </w:rPr>
+              <w:t xml:space="preserve">Lets account deletion keep the audit history.</w:t>
+            </w:r>
+          </w:p>
+        </w:tc>
+      </w:tr>
+      <w:tr>
+        <w:trPr>
+          <w:cantSplit/>
+        </w:trPr>
+        <w:tc>
+          <w:tcPr>
+            <w:tcW w:w="4626" w:type="dxa"/>
+          </w:tcPr>
+          <w:p>
+            <w:pPr>
+              <w:spacing w:before="0" w:after="40" w:line="252" w:lineRule="auto"/>
+            </w:pPr>
+            <w:r>
+              <w:rPr>
+                <w:rFonts w:ascii="Consolas" w:hAnsi="Consolas" w:cs="Consolas"/>
+                <w:color w:val="5A0909"/>
+                <w:sz w:val="17"/>
+                <w:szCs w:val="17"/>
+                <w:shd w:val="clear" w:color="auto" w:fill="F3EFEB"/>
+              </w:rPr>
+              <w:t xml:space="preserve">20261011000700_member_bootstrap_backfill.sql</w:t>
+            </w:r>
+          </w:p>
+        </w:tc>
+        <w:tc>
+          <w:tcPr>
+            <w:tcW w:w="5012" w:type="dxa"/>
+          </w:tcPr>
+          <w:p>
+            <w:pPr>
+              <w:spacing w:before="0" w:after="40" w:line="252" w:lineRule="auto"/>
+            </w:pPr>
+            <w:r>
+              <w:rPr>
+                <w:sz w:val="19"/>
+                <w:szCs w:val="19"/>
+              </w:rPr>
+              <w:t xml:space="preserve">Creates the member profile from the sign-up details.</w:t>
+            </w:r>
+          </w:p>
+        </w:tc>
+      </w:tr>
+      <w:tr>
+        <w:trPr>
+          <w:cantSplit/>
+        </w:trPr>
+        <w:tc>
+          <w:tcPr>
+            <w:tcW w:w="4626" w:type="dxa"/>
+          </w:tcPr>
+          <w:p>
+            <w:pPr>
+              <w:spacing w:before="0" w:after="40" w:line="252" w:lineRule="auto"/>
+            </w:pPr>
+            <w:r>
+              <w:rPr>
+                <w:rFonts w:ascii="Consolas" w:hAnsi="Consolas" w:cs="Consolas"/>
+                <w:color w:val="5A0909"/>
+                <w:sz w:val="17"/>
+                <w:szCs w:val="17"/>
+                <w:shd w:val="clear" w:color="auto" w:fill="F3EFEB"/>
+              </w:rPr>
+              <w:t xml:space="preserve">20261011000800_email_verification_and_admin_edits.sql</w:t>
+            </w:r>
+          </w:p>
+        </w:tc>
+        <w:tc>
+          <w:tcPr>
+            <w:tcW w:w="5012" w:type="dxa"/>
+          </w:tcPr>
+          <w:p>
+            <w:pPr>
+              <w:spacing w:before="0" w:after="40" w:line="252" w:lineRule="auto"/>
+            </w:pPr>
+            <w:r>
+              <w:rPr>
+                <w:sz w:val="19"/>
+                <w:szCs w:val="19"/>
+              </w:rPr>
+              <w:t xml:space="preserve">Donors verified on email confirmation; donor bio; admins can correct a donor’s area.</w:t>
+            </w:r>
+          </w:p>
+        </w:tc>
+      </w:tr>
+      <w:tr>
+        <w:trPr>
+          <w:cantSplit/>
+        </w:trPr>
+        <w:tc>
+          <w:tcPr>
+            <w:tcW w:w="4626" w:type="dxa"/>
+          </w:tcPr>
+          <w:p>
+            <w:pPr>
+              <w:spacing w:before="0" w:after="40" w:line="252" w:lineRule="auto"/>
+            </w:pPr>
+            <w:r>
+              <w:rPr>
+                <w:rFonts w:ascii="Consolas" w:hAnsi="Consolas" w:cs="Consolas"/>
+                <w:color w:val="5A0909"/>
+                <w:sz w:val="17"/>
+                <w:szCs w:val="17"/>
+                <w:shd w:val="clear" w:color="auto" w:fill="F3EFEB"/>
+              </w:rPr>
+              <w:t xml:space="preserve">20261011000900_name_privacy_photos_data_checks.sql</w:t>
+            </w:r>
+          </w:p>
+        </w:tc>
+        <w:tc>
+          <w:tcPr>
+            <w:tcW w:w="5012" w:type="dxa"/>
+          </w:tcPr>
+          <w:p>
+            <w:pPr>
+              <w:spacing w:before="0" w:after="40" w:line="252" w:lineRule="auto"/>
+            </w:pPr>
+            <w:r>
+              <w:rPr>
+                <w:sz w:val="19"/>
+                <w:szCs w:val="19"/>
+              </w:rPr>
+              <w:t xml:space="preserve">Display names or “Donor #XXXX” for volunteers, admin-only photos, data checks.</w:t>
+            </w:r>
+          </w:p>
+        </w:tc>
+      </w:tr>
+      <w:tr>
+        <w:trPr>
+          <w:cantSplit/>
+        </w:trPr>
+        <w:tc>
+          <w:tcPr>
+            <w:tcW w:w="4626" w:type="dxa"/>
+          </w:tcPr>
+          <w:p>
+            <w:pPr>
+              <w:spacing w:before="0" w:after="40" w:line="252" w:lineRule="auto"/>
+            </w:pPr>
+            <w:r>
+              <w:rPr>
+                <w:rFonts w:ascii="Consolas" w:hAnsi="Consolas" w:cs="Consolas"/>
+                <w:color w:val="5A0909"/>
+                <w:sz w:val="17"/>
+                <w:szCs w:val="17"/>
+                <w:shd w:val="clear" w:color="auto" w:fill="F3EFEB"/>
+              </w:rPr>
+              <w:t xml:space="preserve">20261015000100_bombay_blood_group.sql</w:t>
+            </w:r>
+          </w:p>
+        </w:tc>
+        <w:tc>
+          <w:tcPr>
+            <w:tcW w:w="5012" w:type="dxa"/>
+          </w:tcPr>
+          <w:p>
+            <w:pPr>
+              <w:spacing w:before="0" w:after="40" w:line="252" w:lineRule="auto"/>
+            </w:pPr>
+            <w:r>
+              <w:rPr>
+                <w:sz w:val="19"/>
+                <w:szCs w:val="19"/>
+              </w:rPr>
+              <w:t xml:space="preserve">Adds the Bombay blood group “Oh” (exact match only).</w:t>
+            </w:r>
+          </w:p>
+        </w:tc>
+      </w:tr>
+      <w:tr>
+        <w:trPr>
+          <w:cantSplit/>
+        </w:trPr>
+        <w:tc>
+          <w:tcPr>
+            <w:tcW w:w="4626" w:type="dxa"/>
+          </w:tcPr>
+          <w:p>
+            <w:pPr>
+              <w:spacing w:before="0" w:after="40" w:line="252" w:lineRule="auto"/>
+            </w:pPr>
+            <w:r>
+              <w:rPr>
+                <w:rFonts w:ascii="Consolas" w:hAnsi="Consolas" w:cs="Consolas"/>
+                <w:color w:val="5A0909"/>
+                <w:sz w:val="17"/>
+                <w:szCs w:val="17"/>
+                <w:shd w:val="clear" w:color="auto" w:fill="F3EFEB"/>
+              </w:rPr>
+              <w:t xml:space="preserve">20261016000100_record_editing.sql</w:t>
+            </w:r>
+          </w:p>
+        </w:tc>
+        <w:tc>
+          <w:tcPr>
+            <w:tcW w:w="5012" w:type="dxa"/>
+          </w:tcPr>
+          <w:p>
+            <w:pPr>
+              <w:spacing w:before="0" w:after="40" w:line="252" w:lineRule="auto"/>
+            </w:pPr>
+            <w:r>
+              <w:rPr>
+                <w:sz w:val="19"/>
+                <w:szCs w:val="19"/>
+              </w:rPr>
+              <w:t xml:space="preserve">Editing and removing donation records (donor, volunteer and admin rules), admin deletion of requests and stories, auditing of edits.</w:t>
+            </w:r>
+          </w:p>
+        </w:tc>
+      </w:tr>
+      <w:tr>
+        <w:trPr>
+          <w:cantSplit/>
+        </w:trPr>
+        <w:tc>
+          <w:tcPr>
+            <w:tcW w:w="4626" w:type="dxa"/>
+          </w:tcPr>
+          <w:p>
+            <w:pPr>
+              <w:spacing w:before="0" w:after="40" w:line="252" w:lineRule="auto"/>
+            </w:pPr>
+            <w:r>
+              <w:rPr>
+                <w:rFonts w:ascii="Consolas" w:hAnsi="Consolas" w:cs="Consolas"/>
+                <w:color w:val="5A0909"/>
+                <w:sz w:val="17"/>
+                <w:szCs w:val="17"/>
+                <w:shd w:val="clear" w:color="auto" w:fill="F3EFEB"/>
+              </w:rPr>
+              <w:t xml:space="preserve">20261018000100_patient_donor_contact.sql</w:t>
+            </w:r>
+          </w:p>
+        </w:tc>
+        <w:tc>
+          <w:tcPr>
+            <w:tcW w:w="5012" w:type="dxa"/>
+          </w:tcPr>
+          <w:p>
+            <w:pPr>
+              <w:spacing w:before="0" w:after="40" w:line="252" w:lineRule="auto"/>
+            </w:pPr>
+            <w:r>
+              <w:rPr>
+                <w:sz w:val="19"/>
+                <w:szCs w:val="19"/>
+              </w:rPr>
+              <w:t xml:space="preserve">Requests need an account and the patient’s details; Hide my number; who can give now (from donation dates); the family’s donor list and opening one contact at a time; donors joining requests; the new limits.</w:t>
+            </w:r>
+          </w:p>
+        </w:tc>
+      </w:tr>
+      <w:tr>
+        <w:trPr>
+          <w:cantSplit/>
+        </w:trPr>
+        <w:tc>
+          <w:tcPr>
+            <w:tcW w:w="4626" w:type="dxa"/>
+          </w:tcPr>
+          <w:p>
+            <w:pPr>
+              <w:spacing w:before="0" w:after="40" w:line="252" w:lineRule="auto"/>
+            </w:pPr>
+            <w:r>
+              <w:rPr>
+                <w:rFonts w:ascii="Consolas" w:hAnsi="Consolas" w:cs="Consolas"/>
+                <w:color w:val="5A0909"/>
+                <w:sz w:val="17"/>
+                <w:szCs w:val="17"/>
+                <w:shd w:val="clear" w:color="auto" w:fill="F3EFEB"/>
+              </w:rPr>
+              <w:t xml:space="preserve">20261018000200_donation_follow_up.sql</w:t>
+            </w:r>
+          </w:p>
+        </w:tc>
+        <w:tc>
+          <w:tcPr>
+            <w:tcW w:w="5012" w:type="dxa"/>
+          </w:tcPr>
+          <w:p>
+            <w:pPr>
+              <w:spacing w:before="0" w:after="40" w:line="252" w:lineRule="auto"/>
+            </w:pPr>
+            <w:r>
+              <w:rPr>
+                <w:sz w:val="19"/>
+                <w:szCs w:val="19"/>
+              </w:rPr>
+              <w:t xml:space="preserve">Follow up after donation: donors report “I donated”, a trigger starts the Rakt Mitras’ follow-up, the donor’s contact opens for it, donation dates checked in India time.</w:t>
+            </w:r>
+          </w:p>
+        </w:tc>
+      </w:tr>
+    </w:tbl>
+    <w:p>
+      <w:pPr>
+        <w:spacing w:after="80"/>
+      </w:pPr>
+    </w:p>
+    <w:tbl>
+      <w:tblPr>
+        <w:tblW w:w="9638" w:type="dxa"/>
+        <w:tblBorders>
+          <w:top w:val="nil"/>
+          <w:left w:val="single" w:sz="24" w:space="0" w:color="1D7442"/>
+          <w:bottom w:val="nil"/>
+          <w:right w:val="nil"/>
+          <w:insideH w:val="nil"/>
+          <w:insideV w:val="nil"/>
+        </w:tblBorders>
+        <w:tblLayout w:type="fixed"/>
+        <w:tblCellMar>
+          <w:top w:w="110" w:type="dxa"/>
+          <w:left w:w="180" w:type="dxa"/>
+          <w:bottom w:w="70" w:type="dxa"/>
+          <w:right w:w="160" w:type="dxa"/>
+        </w:tblCellMar>
+      </w:tblPr>
+      <w:tblGrid>
+        <w:gridCol w:w="9638"/>
+      </w:tblGrid>
+      <w:tr>
+        <w:trPr>
+          <w:cantSplit/>
+        </w:trPr>
+        <w:tc>
+          <w:tcPr>
+            <w:tcW w:w="9638" w:type="dxa"/>
+            <w:shd w:val="clear" w:color="auto" w:fill="EEF5F0"/>
+          </w:tcPr>
+          <w:p>
+            <w:pPr>
+              <w:spacing w:before="0" w:after="60"/>
+            </w:pPr>
+            <w:r>
+              <w:rPr>
+                <w:b/>
+                <w:color w:val="1D7442"/>
+              </w:rPr>
               <w:t xml:space="preserve">Production status</w:t>
             </w:r>
           </w:p>
@@ -22123,7 +22409,7 @@
                 <w:szCs w:val="19"/>
                 <w:shd w:val="clear" w:color="auto" w:fill="F3EFEB"/>
               </w:rPr>
-              <w:t xml:space="preserve">20261016000100_record_editing.sql</w:t>
+              <w:t xml:space="preserve">20261018000100_patient_donor_contact.sql</w:t>
             </w:r>
             <w:r>
               <w:t xml:space="preserve"> (checked 18 October 2026). </w:t>
@@ -22136,10 +22422,10 @@
                 <w:szCs w:val="19"/>
                 <w:shd w:val="clear" w:color="auto" w:fill="F3EFEB"/>
               </w:rPr>
-              <w:t xml:space="preserve">20261018000100_patient_donor_contact.sql</w:t>
-            </w:r>
-            <w:r>
-              <w:t xml:space="preserve"> goes on with the patient–donor release, before its code is pushed. Check any time with </w:t>
+              <w:t xml:space="preserve">20261018000200_donation_follow_up.sql</w:t>
+            </w:r>
+            <w:r>
+              <w:t xml:space="preserve"> goes on with the Rakt Mitra release, before its code is pushed. Check any time with </w:t>
             </w:r>
             <w:r>
               <w:rPr>
@@ -23310,6 +23596,124 @@
                 <w:szCs w:val="17"/>
                 <w:shd w:val="clear" w:color="auto" w:fill="F3EFEB"/>
               </w:rPr>
+              <w:t xml:space="preserve">donation_report_days</w:t>
+            </w:r>
+          </w:p>
+        </w:tc>
+        <w:tc>
+          <w:tcPr>
+            <w:tcW w:w="1157" w:type="dxa"/>
+          </w:tcPr>
+          <w:p>
+            <w:pPr>
+              <w:spacing w:before="0" w:after="40" w:line="252" w:lineRule="auto"/>
+            </w:pPr>
+            <w:r>
+              <w:rPr>
+                <w:sz w:val="19"/>
+                <w:szCs w:val="19"/>
+              </w:rPr>
+              <w:t xml:space="preserve">14</w:t>
+            </w:r>
+          </w:p>
+        </w:tc>
+        <w:tc>
+          <w:tcPr>
+            <w:tcW w:w="4241" w:type="dxa"/>
+          </w:tcPr>
+          <w:p>
+            <w:pPr>
+              <w:spacing w:before="0" w:after="40" w:line="252" w:lineRule="auto"/>
+            </w:pPr>
+            <w:r>
+              <w:rPr>
+                <w:sz w:val="19"/>
+                <w:szCs w:val="19"/>
+              </w:rPr>
+              <w:t xml:space="preserve">Days after a request closes in which a donor can still say they donated.</w:t>
+            </w:r>
+          </w:p>
+        </w:tc>
+      </w:tr>
+      <w:tr>
+        <w:trPr>
+          <w:cantSplit/>
+        </w:trPr>
+        <w:tc>
+          <w:tcPr>
+            <w:tcW w:w="4241" w:type="dxa"/>
+          </w:tcPr>
+          <w:p>
+            <w:pPr>
+              <w:spacing w:before="0" w:after="40" w:line="252" w:lineRule="auto"/>
+            </w:pPr>
+            <w:r>
+              <w:rPr>
+                <w:rFonts w:ascii="Consolas" w:hAnsi="Consolas" w:cs="Consolas"/>
+                <w:color w:val="5A0909"/>
+                <w:sz w:val="17"/>
+                <w:szCs w:val="17"/>
+                <w:shd w:val="clear" w:color="auto" w:fill="F3EFEB"/>
+              </w:rPr>
+              <w:t xml:space="preserve">donation_follow_up_days</w:t>
+            </w:r>
+          </w:p>
+        </w:tc>
+        <w:tc>
+          <w:tcPr>
+            <w:tcW w:w="1157" w:type="dxa"/>
+          </w:tcPr>
+          <w:p>
+            <w:pPr>
+              <w:spacing w:before="0" w:after="40" w:line="252" w:lineRule="auto"/>
+            </w:pPr>
+            <w:r>
+              <w:rPr>
+                <w:sz w:val="19"/>
+                <w:szCs w:val="19"/>
+              </w:rPr>
+              <w:t xml:space="preserve">14</w:t>
+            </w:r>
+          </w:p>
+        </w:tc>
+        <w:tc>
+          <w:tcPr>
+            <w:tcW w:w="4241" w:type="dxa"/>
+          </w:tcPr>
+          <w:p>
+            <w:pPr>
+              <w:spacing w:before="0" w:after="40" w:line="252" w:lineRule="auto"/>
+            </w:pPr>
+            <w:r>
+              <w:rPr>
+                <w:sz w:val="19"/>
+                <w:szCs w:val="19"/>
+              </w:rPr>
+              <w:t xml:space="preserve">Days a Rakt Mitra can open a donor’s contact to follow up after their donation.</w:t>
+            </w:r>
+          </w:p>
+        </w:tc>
+      </w:tr>
+      <w:tr>
+        <w:trPr>
+          <w:cantSplit/>
+        </w:trPr>
+        <w:tc>
+          <w:tcPr>
+            <w:tcW w:w="4241" w:type="dxa"/>
+          </w:tcPr>
+          <w:p>
+            <w:pPr>
+              <w:spacing w:before="0" w:after="40" w:line="252" w:lineRule="auto"/>
+            </w:pPr>
+            <w:r>
+              <w:rPr>
+                <w:rFonts w:ascii="Consolas" w:hAnsi="Consolas" w:cs="Consolas"/>
+                <w:color w:val="5A0909"/>
+                <w:sz w:val="17"/>
+                <w:szCs w:val="17"/>
+                <w:shd w:val="clear" w:color="auto" w:fill="F3EFEB"/>
+              </w:rPr>
               <w:t xml:space="preserve">contact_reveal_hourly_limit</w:t>
             </w:r>
           </w:p>
@@ -24758,6 +25162,28 @@
       </w:pPr>
       <w:r>
         <w:t xml:space="preserve">Not translated on purpose: the name “Rakt Response”, blood groups, people’s and hospitals’ names, and anything people typed.</w:t>
+      </w:r>
+    </w:p>
+    <w:p>
+      <w:pPr>
+        <w:pStyle w:val="ListParagraph"/>
+        <w:numPr>
+          <w:ilvl w:val="0"/>
+          <w:numId w:val="1"/>
+        </w:numPr>
+        <w:spacing w:after="60"/>
+      </w:pPr>
+      <w:r>
+        <w:t xml:space="preserve">Say </w:t>
+      </w:r>
+      <w:r>
+        <w:rPr>
+          <w:b/>
+        </w:rPr>
+        <w:t xml:space="preserve">Rakt Mitra</w:t>
+      </w:r>
+      <w:r>
+        <w:t xml:space="preserve"> (Hindi रक्त मित्र), never “volunteer”, स्वयंसेवक or वॉलंटियर. A test checks the catalogs.</w:t>
       </w:r>
     </w:p>
     <w:p>
@@ -31221,6 +31647,45 @@
                 <w:sz w:val="19"/>
                 <w:szCs w:val="19"/>
               </w:rPr>
+              <w:t xml:space="preserve">Rakt Mitra</w:t>
+            </w:r>
+          </w:p>
+        </w:tc>
+        <w:tc>
+          <w:tcPr>
+            <w:tcW w:w="6939" w:type="dxa"/>
+          </w:tcPr>
+          <w:p>
+            <w:pPr>
+              <w:spacing w:before="0" w:after="40" w:line="252" w:lineRule="auto"/>
+            </w:pPr>
+            <w:r>
+              <w:rPr>
+                <w:sz w:val="19"/>
+                <w:szCs w:val="19"/>
+              </w:rPr>
+              <w:t xml:space="preserve">The site’s title for a Rakt Response volunteer (“blood friend”). The code says “volunteer”.</w:t>
+            </w:r>
+          </w:p>
+        </w:tc>
+      </w:tr>
+      <w:tr>
+        <w:trPr>
+          <w:cantSplit/>
+        </w:trPr>
+        <w:tc>
+          <w:tcPr>
+            <w:tcW w:w="2699" w:type="dxa"/>
+          </w:tcPr>
+          <w:p>
+            <w:pPr>
+              <w:spacing w:before="0" w:after="40" w:line="252" w:lineRule="auto"/>
+            </w:pPr>
+            <w:r>
+              <w:rPr>
+                <w:sz w:val="19"/>
+                <w:szCs w:val="19"/>
+              </w:rPr>
               <w:t xml:space="preserve">Component</w:t>
             </w:r>
           </w:p>
@@ -37957,7 +38422,7 @@
                 <w:sz w:val="19"/>
                 <w:szCs w:val="19"/>
               </w:rPr>
-              <w:t xml:space="preserve">: Home after sign-in: open requests that match you, when you can give again, profile completeness, donation summary, quick links.</w:t>
+              <w:t xml:space="preserve">: Home after sign-in: “Did you donate?” for joined requests whose time has passed, open requests that match you, when you can give again, profile completeness, donation summary, quick links.</w:t>
             </w:r>
           </w:p>
         </w:tc>
@@ -38505,7 +38970,24 @@
                 <w:sz w:val="19"/>
                 <w:szCs w:val="19"/>
               </w:rPr>
-              <w:t xml:space="preserve">). A donor who joined: the patient’s and hospital’s details and the family’s number. Other donors: “I can donate”, or why not yet.</w:t>
+              <w:t xml:space="preserve">). A donor who joined: the patient’s and hospital’s details and the family’s number. Other donors: “I can donate”, or why not yet. After the donation: “Did you donate?” and the thank-you with aftercare (</w:t>
+            </w:r>
+            <w:r>
+              <w:rPr>
+                <w:rFonts w:ascii="Consolas" w:hAnsi="Consolas" w:cs="Consolas"/>
+                <w:color w:val="5A0909"/>
+                <w:sz w:val="17"/>
+                <w:szCs w:val="17"/>
+                <w:shd w:val="clear" w:color="auto" w:fill="F3EFEB"/>
+              </w:rPr>
+              <w:t xml:space="preserve">donation-report.tsx</w:t>
+            </w:r>
+            <w:r>
+              <w:rPr>
+                <w:sz w:val="19"/>
+                <w:szCs w:val="19"/>
+              </w:rPr>
+              <w:t xml:space="preserve">), also for a while after the request closes.</w:t>
             </w:r>
           </w:p>
         </w:tc>
@@ -38564,7 +39046,7 @@
                 <w:sz w:val="19"/>
                 <w:szCs w:val="19"/>
               </w:rPr>
-              <w:t xml:space="preserve">: Open requests a donor can join (My blood group / All), volunteers’ contact requests, and requests you submitted.</w:t>
+              <w:t xml:space="preserve">: Open requests a donor can join (My blood group / All), Rakt Mitras’ contact requests, and requests you submitted.</w:t>
             </w:r>
           </w:p>
         </w:tc>
@@ -38741,7 +39223,7 @@
                 <w:sz w:val="19"/>
                 <w:szCs w:val="19"/>
               </w:rPr>
-              <w:t xml:space="preserve">: Requests you are coordinating, with follow-ups.</w:t>
+              <w:t xml:space="preserve">: Follow up after donation (donors who gave blood: open their contact, thank them, mark it done) and the requests you are coordinating, with follow-ups.</w:t>
             </w:r>
           </w:p>
         </w:tc>
@@ -38977,7 +39459,7 @@
                 <w:sz w:val="19"/>
                 <w:szCs w:val="19"/>
               </w:rPr>
-              <w:t xml:space="preserve">: Overview of what needs attention. Opening it also runs housekeeping (request expiry, follow-up reminders).</w:t>
+              <w:t xml:space="preserve">: Overview of what needs attention, including donors to follow up. Opening it also runs housekeeping (request expiry, follow-up reminders).</w:t>
             </w:r>
           </w:p>
         </w:tc>
@@ -43005,6 +43487,48 @@
                 <w:szCs w:val="17"/>
                 <w:shd w:val="clear" w:color="auto" w:fill="F3EFEB"/>
               </w:rPr>
+              <w:t xml:space="preserve">src/components/requests/donation-report.tsx</w:t>
+            </w:r>
+          </w:p>
+        </w:tc>
+        <w:tc>
+          <w:tcPr>
+            <w:tcW w:w="4626" w:type="dxa"/>
+          </w:tcPr>
+          <w:p>
+            <w:pPr>
+              <w:spacing w:before="0" w:after="40" w:line="252" w:lineRule="auto"/>
+            </w:pPr>
+            <w:r>
+              <w:rPr>
+                <w:sz w:val="19"/>
+                <w:szCs w:val="19"/>
+              </w:rPr>
+              <w:t xml:space="preserve">“Did you donate?” for a joined request, or the thank-you with aftercare.</w:t>
+            </w:r>
+          </w:p>
+        </w:tc>
+      </w:tr>
+      <w:tr>
+        <w:trPr>
+          <w:cantSplit/>
+        </w:trPr>
+        <w:tc>
+          <w:tcPr>
+            <w:tcW w:w="5012" w:type="dxa"/>
+          </w:tcPr>
+          <w:p>
+            <w:pPr>
+              <w:spacing w:before="0" w:after="40" w:line="252" w:lineRule="auto"/>
+            </w:pPr>
+            <w:r>
+              <w:rPr>
+                <w:rFonts w:ascii="Consolas" w:hAnsi="Consolas" w:cs="Consolas"/>
+                <w:color w:val="5A0909"/>
+                <w:sz w:val="17"/>
+                <w:szCs w:val="17"/>
+                <w:shd w:val="clear" w:color="auto" w:fill="F3EFEB"/>
+              </w:rPr>
               <w:t xml:space="preserve">src/components/requests/donor-contact-card.tsx</w:t>
             </w:r>
           </w:p>
@@ -45240,6 +45764,48 @@
                 <w:szCs w:val="17"/>
                 <w:shd w:val="clear" w:color="auto" w:fill="F3EFEB"/>
               </w:rPr>
+              <w:t xml:space="preserve">src/i18n/terms.ts</w:t>
+            </w:r>
+          </w:p>
+        </w:tc>
+        <w:tc>
+          <w:tcPr>
+            <w:tcW w:w="4626" w:type="dxa"/>
+          </w:tcPr>
+          <w:p>
+            <w:pPr>
+              <w:spacing w:before="0" w:after="40" w:line="252" w:lineRule="auto"/>
+            </w:pPr>
+            <w:r>
+              <w:rPr>
+                <w:sz w:val="19"/>
+                <w:szCs w:val="19"/>
+              </w:rPr>
+              <w:t xml:space="preserve">Shows “Rakt Mitra” where database messages still say “volunteer”.</w:t>
+            </w:r>
+          </w:p>
+        </w:tc>
+      </w:tr>
+      <w:tr>
+        <w:trPr>
+          <w:cantSplit/>
+        </w:trPr>
+        <w:tc>
+          <w:tcPr>
+            <w:tcW w:w="5012" w:type="dxa"/>
+          </w:tcPr>
+          <w:p>
+            <w:pPr>
+              <w:spacing w:before="0" w:after="40" w:line="252" w:lineRule="auto"/>
+            </w:pPr>
+            <w:r>
+              <w:rPr>
+                <w:rFonts w:ascii="Consolas" w:hAnsi="Consolas" w:cs="Consolas"/>
+                <w:color w:val="5A0909"/>
+                <w:sz w:val="17"/>
+                <w:szCs w:val="17"/>
+                <w:shd w:val="clear" w:color="auto" w:fill="F3EFEB"/>
+              </w:rPr>
               <w:t xml:space="preserve">src/i18n/translate.ts</w:t>
             </w:r>
           </w:p>
@@ -45257,7 +45823,7 @@
                 <w:sz w:val="19"/>
                 <w:szCs w:val="19"/>
               </w:rPr>
-              <w:t xml:space="preserve">The lookup and {placeholder} filling.</w:t>
+              <w:t xml:space="preserve">The lookup and {placeholder} filling (after the Rakt Mitra wording).</w:t>
             </w:r>
           </w:p>
         </w:tc>
@@ -47493,6 +48059,48 @@
                 <w:szCs w:val="17"/>
                 <w:shd w:val="clear" w:color="auto" w:fill="F3EFEB"/>
               </w:rPr>
+              <w:t xml:space="preserve">supabase/migrations/20261018000200_donation_follow_up.sql</w:t>
+            </w:r>
+          </w:p>
+        </w:tc>
+        <w:tc>
+          <w:tcPr>
+            <w:tcW w:w="4626" w:type="dxa"/>
+          </w:tcPr>
+          <w:p>
+            <w:pPr>
+              <w:spacing w:before="0" w:after="40" w:line="252" w:lineRule="auto"/>
+            </w:pPr>
+            <w:r>
+              <w:rPr>
+                <w:sz w:val="19"/>
+                <w:szCs w:val="19"/>
+              </w:rPr>
+              <w:t xml:space="preserve">Migration: Follow up after donation: donor reports, Rakt Mitra follow-ups, contact for them.</w:t>
+            </w:r>
+          </w:p>
+        </w:tc>
+      </w:tr>
+      <w:tr>
+        <w:trPr>
+          <w:cantSplit/>
+        </w:trPr>
+        <w:tc>
+          <w:tcPr>
+            <w:tcW w:w="5012" w:type="dxa"/>
+          </w:tcPr>
+          <w:p>
+            <w:pPr>
+              <w:spacing w:before="0" w:after="40" w:line="252" w:lineRule="auto"/>
+            </w:pPr>
+            <w:r>
+              <w:rPr>
+                <w:rFonts w:ascii="Consolas" w:hAnsi="Consolas" w:cs="Consolas"/>
+                <w:color w:val="5A0909"/>
+                <w:sz w:val="17"/>
+                <w:szCs w:val="17"/>
+                <w:shd w:val="clear" w:color="auto" w:fill="F3EFEB"/>
+              </w:rPr>
               <w:t xml:space="preserve">supabase/seed.sql</w:t>
             </w:r>
           </w:p>
@@ -47805,6 +48413,48 @@
                 <w:szCs w:val="19"/>
               </w:rPr>
               <w:t xml:space="preserve">Screen options match database rules; which functions anonymous visitors may call.</w:t>
+            </w:r>
+          </w:p>
+        </w:tc>
+      </w:tr>
+      <w:tr>
+        <w:trPr>
+          <w:cantSplit/>
+        </w:trPr>
+        <w:tc>
+          <w:tcPr>
+            <w:tcW w:w="5012" w:type="dxa"/>
+          </w:tcPr>
+          <w:p>
+            <w:pPr>
+              <w:spacing w:before="0" w:after="40" w:line="252" w:lineRule="auto"/>
+            </w:pPr>
+            <w:r>
+              <w:rPr>
+                <w:rFonts w:ascii="Consolas" w:hAnsi="Consolas" w:cs="Consolas"/>
+                <w:color w:val="5A0909"/>
+                <w:sz w:val="17"/>
+                <w:szCs w:val="17"/>
+                <w:shd w:val="clear" w:color="auto" w:fill="F3EFEB"/>
+              </w:rPr>
+              <w:t xml:space="preserve">tests/db/donation-follow-up.test.ts</w:t>
+            </w:r>
+          </w:p>
+        </w:tc>
+        <w:tc>
+          <w:tcPr>
+            <w:tcW w:w="4626" w:type="dxa"/>
+          </w:tcPr>
+          <w:p>
+            <w:pPr>
+              <w:spacing w:before="0" w:after="40" w:line="252" w:lineRule="auto"/>
+            </w:pPr>
+            <w:r>
+              <w:rPr>
+                <w:sz w:val="19"/>
+                <w:szCs w:val="19"/>
+              </w:rPr>
+              <w:t xml:space="preserve">Database tests: donors reporting a donation, the follow-up, contact for it, closing it.</w:t>
             </w:r>
           </w:p>
         </w:tc>

</xml_diff>

<commit_message>
SDP and WBC as equally important ways to give; neutral after-donation wording
</commit_message>
<xml_diff>
--- a/docs/Rakt-Response-Code-Guide.docx
+++ b/docs/Rakt-Response-Code-Guide.docx
@@ -9129,7 +9129,7 @@
                 <w:sz w:val="19"/>
                 <w:szCs w:val="19"/>
               </w:rPr>
-              <w:t xml:space="preserve">Whole blood vs SDP vs other apheresis.</w:t>
+              <w:t xml:space="preserve">Whole blood, SDP, WBC (granulocytes) and other apheresis, each as important as the others.</w:t>
             </w:r>
           </w:p>
         </w:tc>
@@ -14115,7 +14115,7 @@
                 <w:sz w:val="19"/>
                 <w:szCs w:val="19"/>
               </w:rPr>
-              <w:t xml:space="preserve">(01) The donation: one visit, about an hour</w:t>
+              <w:t xml:space="preserve">(01) The donation: one visit, about an hour, then “Three ways to give” (whole blood, SDP, WBC)</w:t>
             </w:r>
           </w:p>
         </w:tc>
@@ -14136,6 +14136,23 @@
                 <w:shd w:val="clear" w:color="auto" w:fill="F3EFEB"/>
               </w:rPr>
               <w:t xml:space="preserve">VISIT</w:t>
+            </w:r>
+            <w:r>
+              <w:rPr>
+                <w:sz w:val="19"/>
+                <w:szCs w:val="19"/>
+              </w:rPr>
+              <w:t xml:space="preserve"> and </w:t>
+            </w:r>
+            <w:r>
+              <w:rPr>
+                <w:rFonts w:ascii="Consolas" w:hAnsi="Consolas" w:cs="Consolas"/>
+                <w:color w:val="5A0909"/>
+                <w:sz w:val="17"/>
+                <w:szCs w:val="17"/>
+                <w:shd w:val="clear" w:color="auto" w:fill="F3EFEB"/>
+              </w:rPr>
+              <w:t xml:space="preserve">WAYS</w:t>
             </w:r>
             <w:r>
               <w:rPr>
@@ -22345,6 +22362,48 @@
           </w:p>
         </w:tc>
       </w:tr>
+      <w:tr>
+        <w:trPr>
+          <w:cantSplit/>
+        </w:trPr>
+        <w:tc>
+          <w:tcPr>
+            <w:tcW w:w="4626" w:type="dxa"/>
+          </w:tcPr>
+          <w:p>
+            <w:pPr>
+              <w:spacing w:before="0" w:after="40" w:line="252" w:lineRule="auto"/>
+            </w:pPr>
+            <w:r>
+              <w:rPr>
+                <w:rFonts w:ascii="Consolas" w:hAnsi="Consolas" w:cs="Consolas"/>
+                <w:color w:val="5A0909"/>
+                <w:sz w:val="17"/>
+                <w:szCs w:val="17"/>
+                <w:shd w:val="clear" w:color="auto" w:fill="F3EFEB"/>
+              </w:rPr>
+              <w:t xml:space="preserve">20261018000300_donation_wording.sql</w:t>
+            </w:r>
+          </w:p>
+        </w:tc>
+        <w:tc>
+          <w:tcPr>
+            <w:tcW w:w="5012" w:type="dxa"/>
+          </w:tcPr>
+          <w:p>
+            <w:pPr>
+              <w:spacing w:before="0" w:after="40" w:line="252" w:lineRule="auto"/>
+            </w:pPr>
+            <w:r>
+              <w:rPr>
+                <w:sz w:val="19"/>
+                <w:szCs w:val="19"/>
+              </w:rPr>
+              <w:t xml:space="preserve">After-donation messages say “donated”, so they fit SDP and WBC donors too.</w:t>
+            </w:r>
+          </w:p>
+        </w:tc>
+      </w:tr>
     </w:tbl>
     <w:p>
       <w:pPr>
@@ -22409,7 +22468,7 @@
                 <w:szCs w:val="19"/>
                 <w:shd w:val="clear" w:color="auto" w:fill="F3EFEB"/>
               </w:rPr>
-              <w:t xml:space="preserve">20261018000100_patient_donor_contact.sql</w:t>
+              <w:t xml:space="preserve">20261018000200_donation_follow_up.sql</w:t>
             </w:r>
             <w:r>
               <w:t xml:space="preserve"> (checked 18 October 2026). </w:t>
@@ -22422,10 +22481,10 @@
                 <w:szCs w:val="19"/>
                 <w:shd w:val="clear" w:color="auto" w:fill="F3EFEB"/>
               </w:rPr>
-              <w:t xml:space="preserve">20261018000200_donation_follow_up.sql</w:t>
-            </w:r>
-            <w:r>
-              <w:t xml:space="preserve"> goes on with the Rakt Mitra release, before its code is pushed. Check any time with </w:t>
+              <w:t xml:space="preserve">20261018000300_donation_wording.sql</w:t>
+            </w:r>
+            <w:r>
+              <w:t xml:space="preserve"> goes on with the SDP and WBC release, before its code is pushed. Check any time with </w:t>
             </w:r>
             <w:r>
               <w:rPr>
@@ -40108,7 +40167,7 @@
                 <w:sz w:val="19"/>
                 <w:szCs w:val="19"/>
               </w:rPr>
-              <w:t xml:space="preserve">: Whole blood vs SDP vs other apheresis.</w:t>
+              <w:t xml:space="preserve">: Whole blood, SDP, WBC (granulocytes) and other apheresis, each as important as the others.</w:t>
             </w:r>
           </w:p>
         </w:tc>
@@ -48077,6 +48136,48 @@
                 <w:szCs w:val="19"/>
               </w:rPr>
               <w:t xml:space="preserve">Migration: Follow up after donation: donor reports, Rakt Mitra follow-ups, contact for them.</w:t>
+            </w:r>
+          </w:p>
+        </w:tc>
+      </w:tr>
+      <w:tr>
+        <w:trPr>
+          <w:cantSplit/>
+        </w:trPr>
+        <w:tc>
+          <w:tcPr>
+            <w:tcW w:w="5012" w:type="dxa"/>
+          </w:tcPr>
+          <w:p>
+            <w:pPr>
+              <w:spacing w:before="0" w:after="40" w:line="252" w:lineRule="auto"/>
+            </w:pPr>
+            <w:r>
+              <w:rPr>
+                <w:rFonts w:ascii="Consolas" w:hAnsi="Consolas" w:cs="Consolas"/>
+                <w:color w:val="5A0909"/>
+                <w:sz w:val="17"/>
+                <w:szCs w:val="17"/>
+                <w:shd w:val="clear" w:color="auto" w:fill="F3EFEB"/>
+              </w:rPr>
+              <w:t xml:space="preserve">supabase/migrations/20261018000300_donation_wording.sql</w:t>
+            </w:r>
+          </w:p>
+        </w:tc>
+        <w:tc>
+          <w:tcPr>
+            <w:tcW w:w="4626" w:type="dxa"/>
+          </w:tcPr>
+          <w:p>
+            <w:pPr>
+              <w:spacing w:before="0" w:after="40" w:line="252" w:lineRule="auto"/>
+            </w:pPr>
+            <w:r>
+              <w:rPr>
+                <w:sz w:val="19"/>
+                <w:szCs w:val="19"/>
+              </w:rPr>
+              <w:t xml:space="preserve">Migration: After-donation messages say “donated” (they also go to SDP and WBC donors).</w:t>
             </w:r>
           </w:p>
         </w:tc>

</xml_diff>